<commit_message>
Every operation of the kits said in their headers; zip and unzip built again; the references and exports
The 159 declarations that had no description of their own in the kits'
headers have one (read from their code: comments only, the binaries are the
same). The nine references (docs/10..18) and the exports follow.
user/BinUtils/Makefile named ARC_PROGS after the rule that uses it: zip and
unzip were not rebuilt since 2026-10-03 and still read the kernel's table
themselves -- they are built with the rest again, through AppKit.

Co-Authored-By: Claude Opus 5.5 <noreply@anthropic.com>
</commit_message>
<xml_diff>
--- a/docs/exports/12-SYSTEMKIT.docx
+++ b/docs/exports/12-SYSTEMKIT.docx
@@ -2200,6 +2200,9 @@
             <w:pPr>
               <w:pStyle w:val="Compact"/>
             </w:pPr>
+            <w:r>
+              <w:t xml:space="preserve">A bubble with a title and a text, sent to notifyd (started if it does not run, waited for up to 2 s)</w:t>
+            </w:r>
           </w:p>
         </w:tc>
         <w:tc>
@@ -2238,6 +2241,9 @@
             <w:pPr>
               <w:pStyle w:val="Compact"/>
             </w:pPr>
+            <w:r>
+              <w:t xml:space="preserve">a bubble with a title and a text, no action (notify_action) -&gt; 1 sent, 0 not</w:t>
+            </w:r>
           </w:p>
         </w:tc>
         <w:tc>
@@ -2358,6 +2364,9 @@
             <w:pPr>
               <w:pStyle w:val="Compact"/>
             </w:pPr>
+            <w:r>
+              <w:t xml:space="preserve">copy the n bytes of s as text (a "text" item to clipd, and the kernel's clipboard)</w:t>
+            </w:r>
           </w:p>
         </w:tc>
         <w:tc>
@@ -2396,6 +2405,9 @@
             <w:pPr>
               <w:pStyle w:val="Compact"/>
             </w:pPr>
+            <w:r>
+              <w:t xml:space="preserve">copy the NUL-terminated string s as text (clip_set_text_n)</w:t>
+            </w:r>
           </w:p>
         </w:tc>
         <w:tc>
@@ -2721,6 +2733,9 @@
             <w:pPr>
               <w:pStyle w:val="Compact"/>
             </w:pPr>
+            <w:r>
+              <w:t xml:space="preserve">v stored at p as 4 bytes, the low one first (little endian)</w:t>
+            </w:r>
           </w:p>
         </w:tc>
         <w:tc>
@@ -2759,6 +2774,9 @@
             <w:pPr>
               <w:pStyle w:val="Compact"/>
             </w:pPr>
+            <w:r>
+              <w:t xml:space="preserve">the 4 bytes at p read as a little-endian number</w:t>
+            </w:r>
           </w:p>
         </w:tc>
         <w:tc>
@@ -2797,6 +2815,9 @@
             <w:pPr>
               <w:pStyle w:val="Compact"/>
             </w:pPr>
+            <w:r>
+              <w:t xml:space="preserve">the length of the string s (0 for a null pointer)</w:t>
+            </w:r>
           </w:p>
         </w:tc>
         <w:tc>
@@ -2835,6 +2856,9 @@
             <w:pPr>
               <w:pStyle w:val="Compact"/>
             </w:pPr>
+            <w:r>
+              <w:t xml:space="preserve">1 if the strings a and b are the same (the case counts), else 0</w:t>
+            </w:r>
           </w:p>
         </w:tc>
         <w:tc>
@@ -2996,6 +3020,9 @@
             <w:pPr>
               <w:pStyle w:val="Compact"/>
             </w:pPr>
+            <w:r>
+              <w:t xml:space="preserve">representation i of a container (0..count-1)</w:t>
+            </w:r>
           </w:p>
         </w:tc>
         <w:tc>
@@ -3034,6 +3061,9 @@
             <w:pPr>
               <w:pStyle w:val="Compact"/>
             </w:pPr>
+            <w:r>
+              <w:t xml:space="preserve">make the trash's folders (TRASH_DIR, TRASH_FILES, TRASH_INFO) if they are not there</w:t>
+            </w:r>
           </w:p>
         </w:tc>
         <w:tc>
@@ -3419,6 +3449,9 @@
             <w:pPr>
               <w:pStyle w:val="Compact"/>
             </w:pPr>
+            <w:r>
+              <w:t xml:space="preserve">Extension of path (after the last '.' of its basename), or "" if none.</w:t>
+            </w:r>
           </w:p>
         </w:tc>
         <w:tc>
@@ -3457,6 +3490,9 @@
             <w:pPr>
               <w:pStyle w:val="Compact"/>
             </w:pPr>
+            <w:r>
+              <w:t xml:space="preserve">Extension of path (after the last '.' of its basename), or "" if none.</w:t>
+            </w:r>
           </w:p>
         </w:tc>
         <w:tc>
@@ -3495,6 +3531,9 @@
             <w:pPr>
               <w:pStyle w:val="Compact"/>
             </w:pPr>
+            <w:r>
+              <w:t xml:space="preserve">Extension of path (after the last '.' of its basename), or "" if none.</w:t>
+            </w:r>
           </w:p>
         </w:tc>
         <w:tc>
@@ -3574,6 +3613,9 @@
             <w:pPr>
               <w:pStyle w:val="Compact"/>
             </w:pPr>
+            <w:r>
+              <w:t xml:space="preserve">An output's word in sound.ini (KAPI_SND_OUT_*).</w:t>
+            </w:r>
           </w:p>
         </w:tc>
         <w:tc>
@@ -3776,6 +3818,9 @@
             <w:pPr>
               <w:pStyle w:val="Compact"/>
             </w:pPr>
+            <w:r>
+              <w:t xml:space="preserve">the wallpaper without a file: voronoi, 28 points, the blues 0x4878B0 and 0x1C2C48, the pattern waves.png</w:t>
+            </w:r>
           </w:p>
         </w:tc>
         <w:tc>
@@ -3814,6 +3859,9 @@
             <w:pPr>
               <w:pStyle w:val="Compact"/>
             </w:pPr>
+            <w:r>
+              <w:t xml:space="preserve">true if a and b are the same string, the case of A..Z ignored</w:t>
+            </w:r>
           </w:p>
         </w:tc>
         <w:tc>
@@ -3852,6 +3900,9 @@
             <w:pPr>
               <w:pStyle w:val="Compact"/>
             </w:pPr>
+            <w:r>
+              <w:t xml:space="preserve">a colour in hexadecimal ("0xRRGGBB", "#RRGGBB", "RRGGBB") -&gt; 0x00RRGGBB; def if v has no hex digit</w:t>
+            </w:r>
           </w:p>
         </w:tc>
         <w:tc>
@@ -3931,6 +3982,9 @@
             <w:pPr>
               <w:pStyle w:val="Compact"/>
             </w:pPr>
+            <w:r>
+              <w:t xml:space="preserve">"key = value" lines of a file</w:t>
+            </w:r>
           </w:p>
         </w:tc>
         <w:tc>
@@ -3969,6 +4023,9 @@
             <w:pPr>
               <w:pStyle w:val="Compact"/>
             </w:pPr>
+            <w:r>
+              <w:t xml:space="preserve">"key = value" lines of a file</w:t>
+            </w:r>
           </w:p>
         </w:tc>
         <w:tc>
@@ -4007,6 +4064,9 @@
             <w:pPr>
               <w:pStyle w:val="Compact"/>
             </w:pPr>
+            <w:r>
+              <w:t xml:space="preserve">"key = value" lines of a file</w:t>
+            </w:r>
           </w:p>
         </w:tc>
         <w:tc>
@@ -4045,6 +4105,9 @@
             <w:pPr>
               <w:pStyle w:val="Compact"/>
             </w:pPr>
+            <w:r>
+              <w:t xml:space="preserve">"key = value" lines of a file</w:t>
+            </w:r>
           </w:p>
         </w:tc>
         <w:tc>
@@ -4083,6 +4146,9 @@
             <w:pPr>
               <w:pStyle w:val="Compact"/>
             </w:pPr>
+            <w:r>
+              <w:t xml:space="preserve">"key = value" lines of a file</w:t>
+            </w:r>
           </w:p>
         </w:tc>
         <w:tc>
@@ -4121,6 +4187,9 @@
             <w:pPr>
               <w:pStyle w:val="Compact"/>
             </w:pPr>
+            <w:r>
+              <w:t xml:space="preserve">the integer square root of n (rounded down)</w:t>
+            </w:r>
           </w:p>
         </w:tc>
         <w:tc>
@@ -4159,6 +4228,9 @@
             <w:pPr>
               <w:pStyle w:val="Compact"/>
             </w:pPr>
+            <w:r>
+              <w:t xml:space="preserve">The colour between a and b (0x00RRGGBB), each channel apart -&gt; a for t 0, b for t 255.</w:t>
+            </w:r>
           </w:p>
         </w:tc>
         <w:tc>
@@ -4238,6 +4310,9 @@
             <w:pPr>
               <w:pStyle w:val="Compact"/>
             </w:pPr>
+            <w:r>
+              <w:t xml:space="preserve">the luminance 0..255 of a colour: (77 R + 150 G + 29 B) / 256</w:t>
+            </w:r>
           </w:p>
         </w:tc>
         <w:tc>
@@ -4440,6 +4515,9 @@
             <w:pPr>
               <w:pStyle w:val="Compact"/>
             </w:pPr>
+            <w:r>
+              <w:t xml:space="preserve">s (0: "") copied into d, cut at cap - 1 characters, NUL-terminated</w:t>
+            </w:r>
           </w:p>
         </w:tc>
         <w:tc>
@@ -4478,6 +4556,9 @@
             <w:pPr>
               <w:pStyle w:val="Compact"/>
             </w:pPr>
+            <w:r>
+              <w:t xml:space="preserve">the dock without a file: 5 drawers (Productivity .. Demos), the terminal and fileviewer launchers, desks "1" .. "4"</w:t>
+            </w:r>
           </w:p>
         </w:tc>
         <w:tc>
@@ -4598,6 +4679,9 @@
             <w:pPr>
               <w:pStyle w:val="Compact"/>
             </w:pPr>
+            <w:r>
+              <w:t xml:space="preserve">-&gt; false</w:t>
+            </w:r>
           </w:p>
         </w:tc>
         <w:tc>
@@ -4636,6 +4720,9 @@
             <w:pPr>
               <w:pStyle w:val="Compact"/>
             </w:pPr>
+            <w:r>
+              <w:t xml:space="preserve">-&gt; false</w:t>
+            </w:r>
           </w:p>
         </w:tc>
         <w:tc>
@@ -4715,6 +4802,9 @@
             <w:pPr>
               <w:pStyle w:val="Compact"/>
             </w:pPr>
+            <w:r>
+              <w:t xml:space="preserve">The dock takes its settings (and the theme) again</w:t>
+            </w:r>
           </w:p>
         </w:tc>
         <w:tc>
@@ -4992,6 +5082,175 @@
         </w:rPr>
         <w:t xml:space="preserve">// payload bytes (IPC limit 512)</w:t>
       </w:r>
+    </w:p>
+    <w:p>
+      <w:pPr>
+        <w:pStyle w:val="FirstParagraph"/>
+      </w:pPr>
+      <w:r>
+        <w:t xml:space="preserve">A bubble with a title and a text, sent to notifyd (started if it does not run, waited for up to 2 s); action (0 or "" for none) is the "app args" a click on it runs -&gt; 1 sent, 0 not (no notifyd, its mailbox full).</w:t>
+      </w:r>
+    </w:p>
+    <w:p>
+      <w:pPr>
+        <w:pStyle w:val="SourceCode"/>
+      </w:pPr>
+      <w:r>
+        <w:rPr>
+          <w:rStyle w:val="DataTypeTok"/>
+        </w:rPr>
+        <w:t xml:space="preserve">int</w:t>
+      </w:r>
+      <w:r>
+        <w:rPr>
+          <w:rStyle w:val="NormalTok"/>
+        </w:rPr>
+        <w:t xml:space="preserve"> notify_action </w:t>
+      </w:r>
+      <w:r>
+        <w:rPr>
+          <w:rStyle w:val="OperatorTok"/>
+        </w:rPr>
+        <w:t xml:space="preserve">(</w:t>
+      </w:r>
+      <w:r>
+        <w:rPr>
+          <w:rStyle w:val="AttributeTok"/>
+        </w:rPr>
+        <w:t xml:space="preserve">const</w:t>
+      </w:r>
+      <w:r>
+        <w:rPr>
+          <w:rStyle w:val="NormalTok"/>
+        </w:rPr>
+        <w:t xml:space="preserve"> </w:t>
+      </w:r>
+      <w:r>
+        <w:rPr>
+          <w:rStyle w:val="DataTypeTok"/>
+        </w:rPr>
+        <w:t xml:space="preserve">char</w:t>
+      </w:r>
+      <w:r>
+        <w:rPr>
+          <w:rStyle w:val="NormalTok"/>
+        </w:rPr>
+        <w:t xml:space="preserve"> </w:t>
+      </w:r>
+      <w:r>
+        <w:rPr>
+          <w:rStyle w:val="OperatorTok"/>
+        </w:rPr>
+        <w:t xml:space="preserve">*</w:t>
+      </w:r>
+      <w:r>
+        <w:rPr>
+          <w:rStyle w:val="NormalTok"/>
+        </w:rPr>
+        <w:t xml:space="preserve">title</w:t>
+      </w:r>
+      <w:r>
+        <w:rPr>
+          <w:rStyle w:val="OperatorTok"/>
+        </w:rPr>
+        <w:t xml:space="preserve">,</w:t>
+      </w:r>
+      <w:r>
+        <w:rPr>
+          <w:rStyle w:val="NormalTok"/>
+        </w:rPr>
+        <w:t xml:space="preserve"> </w:t>
+      </w:r>
+      <w:r>
+        <w:rPr>
+          <w:rStyle w:val="AttributeTok"/>
+        </w:rPr>
+        <w:t xml:space="preserve">const</w:t>
+      </w:r>
+      <w:r>
+        <w:rPr>
+          <w:rStyle w:val="NormalTok"/>
+        </w:rPr>
+        <w:t xml:space="preserve"> </w:t>
+      </w:r>
+      <w:r>
+        <w:rPr>
+          <w:rStyle w:val="DataTypeTok"/>
+        </w:rPr>
+        <w:t xml:space="preserve">char</w:t>
+      </w:r>
+      <w:r>
+        <w:rPr>
+          <w:rStyle w:val="NormalTok"/>
+        </w:rPr>
+        <w:t xml:space="preserve"> </w:t>
+      </w:r>
+      <w:r>
+        <w:rPr>
+          <w:rStyle w:val="OperatorTok"/>
+        </w:rPr>
+        <w:t xml:space="preserve">*</w:t>
+      </w:r>
+      <w:r>
+        <w:rPr>
+          <w:rStyle w:val="NormalTok"/>
+        </w:rPr>
+        <w:t xml:space="preserve">text</w:t>
+      </w:r>
+      <w:r>
+        <w:rPr>
+          <w:rStyle w:val="OperatorTok"/>
+        </w:rPr>
+        <w:t xml:space="preserve">,</w:t>
+      </w:r>
+      <w:r>
+        <w:rPr>
+          <w:rStyle w:val="NormalTok"/>
+        </w:rPr>
+        <w:t xml:space="preserve"> </w:t>
+      </w:r>
+      <w:r>
+        <w:rPr>
+          <w:rStyle w:val="AttributeTok"/>
+        </w:rPr>
+        <w:t xml:space="preserve">const</w:t>
+      </w:r>
+      <w:r>
+        <w:rPr>
+          <w:rStyle w:val="NormalTok"/>
+        </w:rPr>
+        <w:t xml:space="preserve"> </w:t>
+      </w:r>
+      <w:r>
+        <w:rPr>
+          <w:rStyle w:val="DataTypeTok"/>
+        </w:rPr>
+        <w:t xml:space="preserve">char</w:t>
+      </w:r>
+      <w:r>
+        <w:rPr>
+          <w:rStyle w:val="NormalTok"/>
+        </w:rPr>
+        <w:t xml:space="preserve"> </w:t>
+      </w:r>
+      <w:r>
+        <w:rPr>
+          <w:rStyle w:val="OperatorTok"/>
+        </w:rPr>
+        <w:t xml:space="preserve">*</w:t>
+      </w:r>
+      <w:r>
+        <w:rPr>
+          <w:rStyle w:val="NormalTok"/>
+        </w:rPr>
+        <w:t xml:space="preserve">action</w:t>
+      </w:r>
+      <w:r>
+        <w:rPr>
+          <w:rStyle w:val="OperatorTok"/>
+        </w:rPr>
+        <w:t xml:space="preserve">);</w:t>
+      </w:r>
       <w:r>
         <w:br/>
       </w:r>
@@ -5005,7 +5264,7 @@
         <w:rPr>
           <w:rStyle w:val="NormalTok"/>
         </w:rPr>
-        <w:t xml:space="preserve"> notify_action </w:t>
+        <w:t xml:space="preserve"> notify </w:t>
       </w:r>
       <w:r>
         <w:rPr>
@@ -5101,166 +5360,19 @@
         <w:rPr>
           <w:rStyle w:val="OperatorTok"/>
         </w:rPr>
-        <w:t xml:space="preserve">,</w:t>
-      </w:r>
-      <w:r>
-        <w:rPr>
-          <w:rStyle w:val="NormalTok"/>
-        </w:rPr>
-        <w:t xml:space="preserve"> </w:t>
-      </w:r>
-      <w:r>
-        <w:rPr>
-          <w:rStyle w:val="AttributeTok"/>
-        </w:rPr>
-        <w:t xml:space="preserve">const</w:t>
-      </w:r>
-      <w:r>
-        <w:rPr>
-          <w:rStyle w:val="NormalTok"/>
-        </w:rPr>
-        <w:t xml:space="preserve"> </w:t>
-      </w:r>
-      <w:r>
-        <w:rPr>
-          <w:rStyle w:val="DataTypeTok"/>
-        </w:rPr>
-        <w:t xml:space="preserve">char</w:t>
-      </w:r>
-      <w:r>
-        <w:rPr>
-          <w:rStyle w:val="NormalTok"/>
-        </w:rPr>
-        <w:t xml:space="preserve"> </w:t>
-      </w:r>
-      <w:r>
-        <w:rPr>
-          <w:rStyle w:val="OperatorTok"/>
-        </w:rPr>
-        <w:t xml:space="preserve">*</w:t>
-      </w:r>
-      <w:r>
-        <w:rPr>
-          <w:rStyle w:val="NormalTok"/>
-        </w:rPr>
-        <w:t xml:space="preserve">action</w:t>
-      </w:r>
-      <w:r>
-        <w:rPr>
-          <w:rStyle w:val="OperatorTok"/>
-        </w:rPr>
         <w:t xml:space="preserve">);</w:t>
       </w:r>
       <w:r>
-        <w:br/>
-      </w:r>
-      <w:r>
-        <w:rPr>
-          <w:rStyle w:val="DataTypeTok"/>
-        </w:rPr>
-        <w:t xml:space="preserve">int</w:t>
-      </w:r>
-      <w:r>
-        <w:rPr>
-          <w:rStyle w:val="NormalTok"/>
-        </w:rPr>
-        <w:t xml:space="preserve"> notify </w:t>
-      </w:r>
-      <w:r>
-        <w:rPr>
-          <w:rStyle w:val="OperatorTok"/>
-        </w:rPr>
-        <w:t xml:space="preserve">(</w:t>
-      </w:r>
-      <w:r>
-        <w:rPr>
-          <w:rStyle w:val="AttributeTok"/>
-        </w:rPr>
-        <w:t xml:space="preserve">const</w:t>
-      </w:r>
-      <w:r>
-        <w:rPr>
-          <w:rStyle w:val="NormalTok"/>
-        </w:rPr>
-        <w:t xml:space="preserve"> </w:t>
-      </w:r>
-      <w:r>
-        <w:rPr>
-          <w:rStyle w:val="DataTypeTok"/>
-        </w:rPr>
-        <w:t xml:space="preserve">char</w:t>
-      </w:r>
-      <w:r>
-        <w:rPr>
-          <w:rStyle w:val="NormalTok"/>
-        </w:rPr>
-        <w:t xml:space="preserve"> </w:t>
-      </w:r>
-      <w:r>
-        <w:rPr>
-          <w:rStyle w:val="OperatorTok"/>
-        </w:rPr>
-        <w:t xml:space="preserve">*</w:t>
-      </w:r>
-      <w:r>
-        <w:rPr>
-          <w:rStyle w:val="NormalTok"/>
-        </w:rPr>
-        <w:t xml:space="preserve">title</w:t>
-      </w:r>
-      <w:r>
-        <w:rPr>
-          <w:rStyle w:val="OperatorTok"/>
-        </w:rPr>
-        <w:t xml:space="preserve">,</w:t>
-      </w:r>
-      <w:r>
-        <w:rPr>
-          <w:rStyle w:val="NormalTok"/>
-        </w:rPr>
-        <w:t xml:space="preserve"> </w:t>
-      </w:r>
-      <w:r>
-        <w:rPr>
-          <w:rStyle w:val="AttributeTok"/>
-        </w:rPr>
-        <w:t xml:space="preserve">const</w:t>
-      </w:r>
-      <w:r>
-        <w:rPr>
-          <w:rStyle w:val="NormalTok"/>
-        </w:rPr>
-        <w:t xml:space="preserve"> </w:t>
-      </w:r>
-      <w:r>
-        <w:rPr>
-          <w:rStyle w:val="DataTypeTok"/>
-        </w:rPr>
-        <w:t xml:space="preserve">char</w:t>
-      </w:r>
-      <w:r>
-        <w:rPr>
-          <w:rStyle w:val="NormalTok"/>
-        </w:rPr>
-        <w:t xml:space="preserve"> </w:t>
-      </w:r>
-      <w:r>
-        <w:rPr>
-          <w:rStyle w:val="OperatorTok"/>
-        </w:rPr>
-        <w:t xml:space="preserve">*</w:t>
-      </w:r>
-      <w:r>
-        <w:rPr>
-          <w:rStyle w:val="NormalTok"/>
-        </w:rPr>
-        <w:t xml:space="preserve">text</w:t>
-      </w:r>
-      <w:r>
-        <w:rPr>
-          <w:rStyle w:val="OperatorTok"/>
-        </w:rPr>
-        <w:t xml:space="preserve">);</w:t>
+        <w:rPr>
+          <w:rStyle w:val="NormalTok"/>
+        </w:rPr>
+        <w:t xml:space="preserve">   </w:t>
+      </w:r>
+      <w:r>
+        <w:rPr>
+          <w:rStyle w:val="CommentTok"/>
+        </w:rPr>
+        <w:t xml:space="preserve">// a bubble with a title and a text, no action (notify_action) -&gt; 1 sent, 0 not</w:t>
       </w:r>
     </w:p>
     <w:bookmarkEnd w:id="23"/>
@@ -5978,6 +6090,18 @@
         <w:t xml:space="preserve">);</w:t>
       </w:r>
       <w:r>
+        <w:rPr>
+          <w:rStyle w:val="NormalTok"/>
+        </w:rPr>
+        <w:t xml:space="preserve">    </w:t>
+      </w:r>
+      <w:r>
+        <w:rPr>
+          <w:rStyle w:val="CommentTok"/>
+        </w:rPr>
+        <w:t xml:space="preserve">// copy the n bytes of s as text (a "text" item to clipd, and the kernel's clipboard)</w:t>
+      </w:r>
+      <w:r>
         <w:br/>
       </w:r>
       <w:r>
@@ -6039,6 +6163,18 @@
           <w:rStyle w:val="OperatorTok"/>
         </w:rPr>
         <w:t xml:space="preserve">);</w:t>
+      </w:r>
+      <w:r>
+        <w:rPr>
+          <w:rStyle w:val="NormalTok"/>
+        </w:rPr>
+        <w:t xml:space="preserve"> </w:t>
+      </w:r>
+      <w:r>
+        <w:rPr>
+          <w:rStyle w:val="CommentTok"/>
+        </w:rPr>
+        <w:t xml:space="preserve">// copy the NUL-terminated string s as text (clip_set_text_n)</w:t>
       </w:r>
     </w:p>
     <w:p>
@@ -7768,6 +7904,14 @@
     </w:p>
     <w:p>
       <w:pPr>
+        <w:pStyle w:val="FirstParagraph"/>
+      </w:pPr>
+      <w:r>
+        <w:t xml:space="preserve">v stored at p as 4 bytes, the low one first (little endian)</w:t>
+      </w:r>
+    </w:p>
+    <w:p>
+      <w:pPr>
         <w:pStyle w:val="SourceCode"/>
       </w:pPr>
       <w:r>
@@ -7854,9 +7998,19 @@
         </w:rPr>
         <w:t xml:space="preserve">);</w:t>
       </w:r>
-      <w:r>
-        <w:br/>
-      </w:r>
+    </w:p>
+    <w:p>
+      <w:pPr>
+        <w:pStyle w:val="FirstParagraph"/>
+      </w:pPr>
+      <w:r>
+        <w:t xml:space="preserve">the 4 bytes at p read as a little-endian number</w:t>
+      </w:r>
+    </w:p>
+    <w:p>
+      <w:pPr>
+        <w:pStyle w:val="SourceCode"/>
+      </w:pPr>
       <w:r>
         <w:rPr>
           <w:rStyle w:val="DataTypeTok"/>
@@ -7929,9 +8083,19 @@
         </w:rPr>
         <w:t xml:space="preserve">);</w:t>
       </w:r>
-      <w:r>
-        <w:br/>
-      </w:r>
+    </w:p>
+    <w:p>
+      <w:pPr>
+        <w:pStyle w:val="FirstParagraph"/>
+      </w:pPr>
+      <w:r>
+        <w:t xml:space="preserve">the length of the string s (0 for a null pointer)</w:t>
+      </w:r>
+    </w:p>
+    <w:p>
+      <w:pPr>
+        <w:pStyle w:val="SourceCode"/>
+      </w:pPr>
       <w:r>
         <w:rPr>
           <w:rStyle w:val="DataTypeTok"/>
@@ -7992,9 +8156,19 @@
         </w:rPr>
         <w:t xml:space="preserve">);</w:t>
       </w:r>
-      <w:r>
-        <w:br/>
-      </w:r>
+    </w:p>
+    <w:p>
+      <w:pPr>
+        <w:pStyle w:val="FirstParagraph"/>
+      </w:pPr>
+      <w:r>
+        <w:t xml:space="preserve">1 if the strings a and b are the same (the case counts), else 0</w:t>
+      </w:r>
+    </w:p>
+    <w:p>
+      <w:pPr>
+        <w:pStyle w:val="SourceCode"/>
+      </w:pPr>
       <w:r>
         <w:rPr>
           <w:rStyle w:val="DataTypeTok"/>
@@ -9061,6 +9235,18 @@
         </w:rPr>
         <w:t xml:space="preserve">);</w:t>
       </w:r>
+      <w:r>
+        <w:rPr>
+          <w:rStyle w:val="NormalTok"/>
+        </w:rPr>
+        <w:t xml:space="preserve">   </w:t>
+      </w:r>
+      <w:r>
+        <w:rPr>
+          <w:rStyle w:val="CommentTok"/>
+        </w:rPr>
+        <w:t xml:space="preserve">// make the trash's folders (TRASH_DIR, TRASH_FILES, TRASH_INFO) if they are not there</w:t>
+      </w:r>
     </w:p>
     <w:p>
       <w:pPr>
@@ -11226,6 +11412,18 @@
         <w:t xml:space="preserve">);</w:t>
       </w:r>
       <w:r>
+        <w:rPr>
+          <w:rStyle w:val="NormalTok"/>
+        </w:rPr>
+        <w:t xml:space="preserve">    </w:t>
+      </w:r>
+      <w:r>
+        <w:rPr>
+          <w:rStyle w:val="CommentTok"/>
+        </w:rPr>
+        <w:t xml:space="preserve">// the wallpaper without a file: voronoi, 28 points, the blues 0x4878B0 and 0x1C2C48, the pattern waves.png</w:t>
+      </w:r>
+      <w:r>
         <w:br/>
       </w:r>
       <w:r>
@@ -11337,6 +11535,18 @@
         <w:t xml:space="preserve">);</w:t>
       </w:r>
       <w:r>
+        <w:rPr>
+          <w:rStyle w:val="NormalTok"/>
+        </w:rPr>
+        <w:t xml:space="preserve">  </w:t>
+      </w:r>
+      <w:r>
+        <w:rPr>
+          <w:rStyle w:val="CommentTok"/>
+        </w:rPr>
+        <w:t xml:space="preserve">// true if a and b are the same string, the case of A..Z ignored</w:t>
+      </w:r>
+      <w:r>
         <w:br/>
       </w:r>
       <w:r>
@@ -11422,6 +11632,18 @@
           <w:rStyle w:val="OperatorTok"/>
         </w:rPr>
         <w:t xml:space="preserve">);</w:t>
+      </w:r>
+      <w:r>
+        <w:rPr>
+          <w:rStyle w:val="NormalTok"/>
+        </w:rPr>
+        <w:t xml:space="preserve">   </w:t>
+      </w:r>
+      <w:r>
+        <w:rPr>
+          <w:rStyle w:val="CommentTok"/>
+        </w:rPr>
+        <w:t xml:space="preserve">// a colour in hexadecimal ("0xRRGGBB", "#RRGGBB", "RRGGBB") -&gt; 0x00RRGGBB; def if v has no hex digit</w:t>
       </w:r>
     </w:p>
     <w:p>
@@ -12270,11 +12492,30 @@
         <w:t xml:space="preserve">);</w:t>
       </w:r>
       <w:r>
-        <w:br/>
-      </w:r>
-      <w:r>
-        <w:br/>
-      </w:r>
+        <w:rPr>
+          <w:rStyle w:val="NormalTok"/>
+        </w:rPr>
+        <w:t xml:space="preserve"> </w:t>
+      </w:r>
+      <w:r>
+        <w:rPr>
+          <w:rStyle w:val="CommentTok"/>
+        </w:rPr>
+        <w:t xml:space="preserve">// the integer square root of n (rounded down)</w:t>
+      </w:r>
+    </w:p>
+    <w:p>
+      <w:pPr>
+        <w:pStyle w:val="FirstParagraph"/>
+      </w:pPr>
+      <w:r>
+        <w:t xml:space="preserve">The colour between a and b (0x00RRGGBB), each channel apart -&gt; a for t 0, b for t 255.</w:t>
+      </w:r>
+    </w:p>
+    <w:p>
+      <w:pPr>
+        <w:pStyle w:val="SourceCode"/>
+      </w:pPr>
       <w:r>
         <w:rPr>
           <w:rStyle w:val="AttributeTok"/>
@@ -13853,6 +14094,18 @@
           <w:rStyle w:val="OperatorTok"/>
         </w:rPr>
         <w:t xml:space="preserve">);</w:t>
+      </w:r>
+      <w:r>
+        <w:rPr>
+          <w:rStyle w:val="NormalTok"/>
+        </w:rPr>
+        <w:t xml:space="preserve">   </w:t>
+      </w:r>
+      <w:r>
+        <w:rPr>
+          <w:rStyle w:val="CommentTok"/>
+        </w:rPr>
+        <w:t xml:space="preserve">// the luminance 0..255 of a colour: (77 R + 150 G + 29 B) / 256</w:t>
       </w:r>
     </w:p>
     <w:p>
@@ -15195,6 +15448,18 @@
         <w:t xml:space="preserve">);</w:t>
       </w:r>
       <w:r>
+        <w:rPr>
+          <w:rStyle w:val="NormalTok"/>
+        </w:rPr>
+        <w:t xml:space="preserve"> </w:t>
+      </w:r>
+      <w:r>
+        <w:rPr>
+          <w:rStyle w:val="CommentTok"/>
+        </w:rPr>
+        <w:t xml:space="preserve">// s (0: "") copied into d, cut at cap - 1 characters, NUL-terminated</w:t>
+      </w:r>
+      <w:r>
         <w:br/>
       </w:r>
       <w:r>
@@ -15238,6 +15503,18 @@
           <w:rStyle w:val="OperatorTok"/>
         </w:rPr>
         <w:t xml:space="preserve">);</w:t>
+      </w:r>
+      <w:r>
+        <w:rPr>
+          <w:rStyle w:val="NormalTok"/>
+        </w:rPr>
+        <w:t xml:space="preserve">   </w:t>
+      </w:r>
+      <w:r>
+        <w:rPr>
+          <w:rStyle w:val="CommentTok"/>
+        </w:rPr>
+        <w:t xml:space="preserve">// the dock without a file: 5 drawers (Productivity .. Demos), the terminal and fileviewer launchers, desks "1" .. "4"</w:t>
       </w:r>
     </w:p>
     <w:p>

</xml_diff>

<commit_message>
The dock: a drawer for every category of the card's apps (up to 32); the Panel applet sets their order, main app, hidden ones (SystemKit 59: DockLayout)
Co-Authored-By: Claude Opus 5.5 <noreply@anthropic.com>
Claude-Session: https://claude.ai/code/session_0122tiZhkAcdufNo9S5aciMu
</commit_message>
<xml_diff>
--- a/docs/exports/12-SYSTEMKIT.docx
+++ b/docs/exports/12-SYSTEMKIT.docx
@@ -546,7 +546,7 @@
               <w:t xml:space="preserve"> </w:t>
             </w:r>
             <w:r>
-              <w:t xml:space="preserve">— 56 entries in its table (</w:t>
+              <w:t xml:space="preserve">— 59 entries in its table (</w:t>
             </w:r>
             <w:r>
               <w:rPr>
@@ -4761,7 +4761,7 @@
               <w:jc w:val="left"/>
             </w:pPr>
             <w:r>
-              <w:t xml:space="preserve">the dock without a file: 5 drawers (Productivity .. Demos), the terminal and fileviewer launchers, desks "1" .. "4"</w:t>
+              <w:t xml:space="preserve">the dock without a file: 6 drawers (Productivity .. Demos), the terminal and fileviewer launchers, desks "1" .. "4"</w:t>
             </w:r>
           </w:p>
         </w:tc>
@@ -5026,6 +5026,226 @@
             </w:pPr>
             <w:r>
               <w:t xml:space="preserve">The dock takes its settings (and the theme) again</w:t>
+            </w:r>
+          </w:p>
+        </w:tc>
+        <w:tc>
+          <w:tcPr/>
+          <w:p>
+            <w:pPr>
+              <w:pStyle w:val="Compact"/>
+              <w:jc w:val="left"/>
+            </w:pPr>
+            <w:r>
+              <w:rPr>
+                <w:rStyle w:val="VerbatimChar"/>
+              </w:rPr>
+              <w:t xml:space="preserve">dockconf.h</w:t>
+            </w:r>
+          </w:p>
+        </w:tc>
+      </w:tr>
+      <w:tr>
+        <w:tc>
+          <w:tcPr/>
+          <w:p>
+            <w:pPr>
+              <w:pStyle w:val="Compact"/>
+              <w:jc w:val="left"/>
+            </w:pPr>
+            <w:r>
+              <w:rPr>
+                <w:rStyle w:val="VerbatimChar"/>
+              </w:rPr>
+              <w:t xml:space="preserve">DockCat</w:t>
+            </w:r>
+          </w:p>
+        </w:tc>
+        <w:tc>
+          <w:tcPr/>
+          <w:p>
+            <w:pPr>
+              <w:pStyle w:val="Compact"/>
+              <w:jc w:val="left"/>
+            </w:pPr>
+            <w:r>
+              <w:t xml:space="preserve">(a type)</w:t>
+            </w:r>
+          </w:p>
+        </w:tc>
+        <w:tc>
+          <w:tcPr/>
+          <w:p>
+            <w:pPr>
+              <w:pStyle w:val="Compact"/>
+              <w:jc w:val="left"/>
+            </w:pPr>
+            <w:r>
+              <w:rPr>
+                <w:rStyle w:val="VerbatimChar"/>
+              </w:rPr>
+              <w:t xml:space="preserve">dockconf.h</w:t>
+            </w:r>
+          </w:p>
+        </w:tc>
+      </w:tr>
+      <w:tr>
+        <w:tc>
+          <w:tcPr/>
+          <w:p>
+            <w:pPr>
+              <w:pStyle w:val="Compact"/>
+              <w:jc w:val="left"/>
+            </w:pPr>
+            <w:r>
+              <w:rPr>
+                <w:rStyle w:val="VerbatimChar"/>
+              </w:rPr>
+              <w:t xml:space="preserve">DockLayout</w:t>
+            </w:r>
+          </w:p>
+        </w:tc>
+        <w:tc>
+          <w:tcPr/>
+          <w:p>
+            <w:pPr>
+              <w:pStyle w:val="Compact"/>
+              <w:jc w:val="left"/>
+            </w:pPr>
+            <w:r>
+              <w:t xml:space="preserve">(a type)</w:t>
+            </w:r>
+          </w:p>
+        </w:tc>
+        <w:tc>
+          <w:tcPr/>
+          <w:p>
+            <w:pPr>
+              <w:pStyle w:val="Compact"/>
+              <w:jc w:val="left"/>
+            </w:pPr>
+            <w:r>
+              <w:rPr>
+                <w:rStyle w:val="VerbatimChar"/>
+              </w:rPr>
+              <w:t xml:space="preserve">dockconf.h</w:t>
+            </w:r>
+          </w:p>
+        </w:tc>
+      </w:tr>
+      <w:tr>
+        <w:tc>
+          <w:tcPr/>
+          <w:p>
+            <w:pPr>
+              <w:pStyle w:val="Compact"/>
+              <w:jc w:val="left"/>
+            </w:pPr>
+            <w:r>
+              <w:rPr>
+                <w:rStyle w:val="VerbatimChar"/>
+              </w:rPr>
+              <w:t xml:space="preserve">dock_category_docked</w:t>
+            </w:r>
+          </w:p>
+        </w:tc>
+        <w:tc>
+          <w:tcPr/>
+          <w:p>
+            <w:pPr>
+              <w:pStyle w:val="Compact"/>
+              <w:jc w:val="left"/>
+            </w:pPr>
+            <w:r>
+              <w:t xml:space="preserve">The categories that may have a drawer</w:t>
+            </w:r>
+          </w:p>
+        </w:tc>
+        <w:tc>
+          <w:tcPr/>
+          <w:p>
+            <w:pPr>
+              <w:pStyle w:val="Compact"/>
+              <w:jc w:val="left"/>
+            </w:pPr>
+            <w:r>
+              <w:rPr>
+                <w:rStyle w:val="VerbatimChar"/>
+              </w:rPr>
+              <w:t xml:space="preserve">dockconf.h</w:t>
+            </w:r>
+          </w:p>
+        </w:tc>
+      </w:tr>
+      <w:tr>
+        <w:tc>
+          <w:tcPr/>
+          <w:p>
+            <w:pPr>
+              <w:pStyle w:val="Compact"/>
+              <w:jc w:val="left"/>
+            </w:pPr>
+            <w:r>
+              <w:rPr>
+                <w:rStyle w:val="VerbatimChar"/>
+              </w:rPr>
+              <w:t xml:space="preserve">dock_layout_load</w:t>
+            </w:r>
+          </w:p>
+        </w:tc>
+        <w:tc>
+          <w:tcPr/>
+          <w:p>
+            <w:pPr>
+              <w:pStyle w:val="Compact"/>
+              <w:jc w:val="left"/>
+            </w:pPr>
+            <w:r>
+              <w:t xml:space="preserve">dock.ini (or the defaults) merged with the card's apps</w:t>
+            </w:r>
+          </w:p>
+        </w:tc>
+        <w:tc>
+          <w:tcPr/>
+          <w:p>
+            <w:pPr>
+              <w:pStyle w:val="Compact"/>
+              <w:jc w:val="left"/>
+            </w:pPr>
+            <w:r>
+              <w:rPr>
+                <w:rStyle w:val="VerbatimChar"/>
+              </w:rPr>
+              <w:t xml:space="preserve">dockconf.h</w:t>
+            </w:r>
+          </w:p>
+        </w:tc>
+      </w:tr>
+      <w:tr>
+        <w:tc>
+          <w:tcPr/>
+          <w:p>
+            <w:pPr>
+              <w:pStyle w:val="Compact"/>
+              <w:jc w:val="left"/>
+            </w:pPr>
+            <w:r>
+              <w:rPr>
+                <w:rStyle w:val="VerbatimChar"/>
+              </w:rPr>
+              <w:t xml:space="preserve">dock_layout_save</w:t>
+            </w:r>
+          </w:p>
+        </w:tc>
+        <w:tc>
+          <w:tcPr/>
+          <w:p>
+            <w:pPr>
+              <w:pStyle w:val="Compact"/>
+              <w:jc w:val="left"/>
+            </w:pPr>
+            <w:r>
+              <w:t xml:space="preserve">dock.ini written</w:t>
             </w:r>
           </w:p>
         </w:tc>
@@ -15017,7 +15237,7 @@
     </w:p>
     <w:bookmarkEnd w:id="39"/>
     <w:bookmarkEnd w:id="40"/>
-    <w:bookmarkStart w:id="41" w:name="systemkitdockconfh"/>
+    <w:bookmarkStart w:id="42" w:name="systemkitdockconfh"/>
     <w:p>
       <w:pPr>
         <w:pStyle w:val="Heading2"/>
@@ -15110,6 +15330,23 @@
         </w:rPr>
         <w:t xml:space="preserve">                                        DOCK_MAXDESKS of them</w:t>
       </w:r>
+      <w:r>
+        <w:br/>
+      </w:r>
+      <w:r>
+        <w:rPr>
+          <w:rStyle w:val="VerbatimChar"/>
+        </w:rPr>
+        <w:t xml:space="preserve">    hidden   = Demos                    (2026-10-06) a category that has no drawer</w:t>
+      </w:r>
+    </w:p>
+    <w:p>
+      <w:pPr>
+        <w:pStyle w:val="FirstParagraph"/>
+      </w:pPr>
+      <w:r>
+        <w:t xml:space="preserve">Since 2026-10-06 the dock has a drawer for EVERY category of the card's apps (their app.txt), but Shell, Settings and Emulators (dock_category_docked), and those hidden: dock_layout_load reads the file's drawers as the categories' order and main apps, and adds the categories it does not name at the end. DockConf / dockconf_load / dockconf_save (8 drawers, what the file says) stay for the programs built before (the table is append-only); the dock and the Panel applet use DockLayout.</w:t>
+      </w:r>
     </w:p>
     <w:p>
       <w:pPr>
@@ -15746,7 +15983,7 @@
         <w:rPr>
           <w:rStyle w:val="CommentTok"/>
         </w:rPr>
-        <w:t xml:space="preserve">// the dock without a file: 5 drawers (Productivity .. Demos), the terminal and fileviewer launchers, desks "1" .. "4"</w:t>
+        <w:t xml:space="preserve">// the dock without a file: 6 drawers (Productivity .. Demos), the terminal and fileviewer launchers, desks "1" .. "4"</w:t>
       </w:r>
     </w:p>
     <w:p>
@@ -16271,17 +16508,567 @@
         <w:t xml:space="preserve">);</w:t>
       </w:r>
     </w:p>
-    <w:bookmarkEnd w:id="41"/>
-    <w:bookmarkStart w:id="42" w:name="systemkitpreloadinih"/>
+    <w:bookmarkStart w:id="41" w:name="X57d4995133c680abdabe9c1ce9d1d4aa51d942d"/>
     <w:p>
       <w:pPr>
-        <w:pStyle w:val="Heading2"/>
+        <w:pStyle w:val="Heading3"/>
       </w:pPr>
       <w:r>
-        <w:rPr>
-          <w:rStyle w:val="VerbatimChar"/>
-        </w:rPr>
-        <w:t xml:space="preserve">systemkit/preloadini.h</w:t>
+        <w:t xml:space="preserve">the dock's layout: every category, its order, its main app, hidden or not (2026-10-06)</w:t>
+      </w:r>
+    </w:p>
+    <w:p>
+      <w:pPr>
+        <w:pStyle w:val="SourceCode"/>
+      </w:pPr>
+      <w:r>
+        <w:rPr>
+          <w:rStyle w:val="PreprocessorTok"/>
+        </w:rPr>
+        <w:t xml:space="preserve">#define DOCK_MAXCATS        </w:t>
+      </w:r>
+      <w:r>
+        <w:rPr>
+          <w:rStyle w:val="DecValTok"/>
+        </w:rPr>
+        <w:t xml:space="preserve">32</w:t>
+      </w:r>
+      <w:r>
+        <w:br/>
+      </w:r>
+      <w:r>
+        <w:rPr>
+          <w:rStyle w:val="KeywordTok"/>
+        </w:rPr>
+        <w:t xml:space="preserve">struct</w:t>
+      </w:r>
+      <w:r>
+        <w:rPr>
+          <w:rStyle w:val="NormalTok"/>
+        </w:rPr>
+        <w:t xml:space="preserve"> DockCat</w:t>
+      </w:r>
+      <w:r>
+        <w:br/>
+      </w:r>
+      <w:r>
+        <w:rPr>
+          <w:rStyle w:val="OperatorTok"/>
+        </w:rPr>
+        <w:t xml:space="preserve">{</w:t>
+      </w:r>
+      <w:r>
+        <w:br/>
+      </w:r>
+      <w:r>
+        <w:rPr>
+          <w:rStyle w:val="NormalTok"/>
+        </w:rPr>
+        <w:t xml:space="preserve">    </w:t>
+      </w:r>
+      <w:r>
+        <w:rPr>
+          <w:rStyle w:val="DataTypeTok"/>
+        </w:rPr>
+        <w:t xml:space="preserve">char</w:t>
+      </w:r>
+      <w:r>
+        <w:rPr>
+          <w:rStyle w:val="NormalTok"/>
+        </w:rPr>
+        <w:t xml:space="preserve"> cat</w:t>
+      </w:r>
+      <w:r>
+        <w:rPr>
+          <w:rStyle w:val="OperatorTok"/>
+        </w:rPr>
+        <w:t xml:space="preserve">[</w:t>
+      </w:r>
+      <w:r>
+        <w:rPr>
+          <w:rStyle w:val="DecValTok"/>
+        </w:rPr>
+        <w:t xml:space="preserve">24</w:t>
+      </w:r>
+      <w:r>
+        <w:rPr>
+          <w:rStyle w:val="OperatorTok"/>
+        </w:rPr>
+        <w:t xml:space="preserve">];</w:t>
+      </w:r>
+      <w:r>
+        <w:rPr>
+          <w:rStyle w:val="NormalTok"/>
+        </w:rPr>
+        <w:t xml:space="preserve">               </w:t>
+      </w:r>
+      <w:r>
+        <w:rPr>
+          <w:rStyle w:val="CommentTok"/>
+        </w:rPr>
+        <w:t xml:space="preserve">// the category (the app.txt's)</w:t>
+      </w:r>
+      <w:r>
+        <w:br/>
+      </w:r>
+      <w:r>
+        <w:rPr>
+          <w:rStyle w:val="NormalTok"/>
+        </w:rPr>
+        <w:t xml:space="preserve">    </w:t>
+      </w:r>
+      <w:r>
+        <w:rPr>
+          <w:rStyle w:val="DataTypeTok"/>
+        </w:rPr>
+        <w:t xml:space="preserve">char</w:t>
+      </w:r>
+      <w:r>
+        <w:rPr>
+          <w:rStyle w:val="NormalTok"/>
+        </w:rPr>
+        <w:t xml:space="preserve"> app</w:t>
+      </w:r>
+      <w:r>
+        <w:rPr>
+          <w:rStyle w:val="OperatorTok"/>
+        </w:rPr>
+        <w:t xml:space="preserve">[</w:t>
+      </w:r>
+      <w:r>
+        <w:rPr>
+          <w:rStyle w:val="DecValTok"/>
+        </w:rPr>
+        <w:t xml:space="preserve">32</w:t>
+      </w:r>
+      <w:r>
+        <w:rPr>
+          <w:rStyle w:val="OperatorTok"/>
+        </w:rPr>
+        <w:t xml:space="preserve">];</w:t>
+      </w:r>
+      <w:r>
+        <w:rPr>
+          <w:rStyle w:val="NormalTok"/>
+        </w:rPr>
+        <w:t xml:space="preserve">               </w:t>
+      </w:r>
+      <w:r>
+        <w:rPr>
+          <w:rStyle w:val="CommentTok"/>
+        </w:rPr>
+        <w:t xml:space="preserve">// its main app (the drawer's icon; "": the first of its apps by name)</w:t>
+      </w:r>
+      <w:r>
+        <w:br/>
+      </w:r>
+      <w:r>
+        <w:rPr>
+          <w:rStyle w:val="NormalTok"/>
+        </w:rPr>
+        <w:t xml:space="preserve">    </w:t>
+      </w:r>
+      <w:r>
+        <w:rPr>
+          <w:rStyle w:val="DataTypeTok"/>
+        </w:rPr>
+        <w:t xml:space="preserve">int</w:t>
+      </w:r>
+      <w:r>
+        <w:rPr>
+          <w:rStyle w:val="NormalTok"/>
+        </w:rPr>
+        <w:t xml:space="preserve">  hidden</w:t>
+      </w:r>
+      <w:r>
+        <w:rPr>
+          <w:rStyle w:val="OperatorTok"/>
+        </w:rPr>
+        <w:t xml:space="preserve">;</w:t>
+      </w:r>
+      <w:r>
+        <w:rPr>
+          <w:rStyle w:val="NormalTok"/>
+        </w:rPr>
+        <w:t xml:space="preserve">                </w:t>
+      </w:r>
+      <w:r>
+        <w:rPr>
+          <w:rStyle w:val="CommentTok"/>
+        </w:rPr>
+        <w:t xml:space="preserve">// 1: no drawer for it</w:t>
+      </w:r>
+      <w:r>
+        <w:br/>
+      </w:r>
+      <w:r>
+        <w:rPr>
+          <w:rStyle w:val="NormalTok"/>
+        </w:rPr>
+        <w:t xml:space="preserve">    </w:t>
+      </w:r>
+      <w:r>
+        <w:rPr>
+          <w:rStyle w:val="DataTypeTok"/>
+        </w:rPr>
+        <w:t xml:space="preserve">int</w:t>
+      </w:r>
+      <w:r>
+        <w:rPr>
+          <w:rStyle w:val="NormalTok"/>
+        </w:rPr>
+        <w:t xml:space="preserve">  napps</w:t>
+      </w:r>
+      <w:r>
+        <w:rPr>
+          <w:rStyle w:val="OperatorTok"/>
+        </w:rPr>
+        <w:t xml:space="preserve">;</w:t>
+      </w:r>
+      <w:r>
+        <w:rPr>
+          <w:rStyle w:val="NormalTok"/>
+        </w:rPr>
+        <w:t xml:space="preserve">             </w:t>
+      </w:r>
+      <w:r>
+        <w:rPr>
+          <w:rStyle w:val="CommentTok"/>
+        </w:rPr>
+        <w:t xml:space="preserve">// how many apps of the card are in it (0: named by dock.ini only)</w:t>
+      </w:r>
+      <w:r>
+        <w:br/>
+      </w:r>
+      <w:r>
+        <w:rPr>
+          <w:rStyle w:val="NormalTok"/>
+        </w:rPr>
+        <w:t xml:space="preserve">    </w:t>
+      </w:r>
+      <w:r>
+        <w:rPr>
+          <w:rStyle w:val="DataTypeTok"/>
+        </w:rPr>
+        <w:t xml:space="preserve">int</w:t>
+      </w:r>
+      <w:r>
+        <w:rPr>
+          <w:rStyle w:val="NormalTok"/>
+        </w:rPr>
+        <w:t xml:space="preserve">  reserved</w:t>
+      </w:r>
+      <w:r>
+        <w:rPr>
+          <w:rStyle w:val="OperatorTok"/>
+        </w:rPr>
+        <w:t xml:space="preserve">[</w:t>
+      </w:r>
+      <w:r>
+        <w:rPr>
+          <w:rStyle w:val="DecValTok"/>
+        </w:rPr>
+        <w:t xml:space="preserve">2</w:t>
+      </w:r>
+      <w:r>
+        <w:rPr>
+          <w:rStyle w:val="OperatorTok"/>
+        </w:rPr>
+        <w:t xml:space="preserve">];</w:t>
+      </w:r>
+      <w:r>
+        <w:br/>
+      </w:r>
+      <w:r>
+        <w:rPr>
+          <w:rStyle w:val="OperatorTok"/>
+        </w:rPr>
+        <w:t xml:space="preserve">};</w:t>
+      </w:r>
+      <w:r>
+        <w:br/>
+      </w:r>
+      <w:r>
+        <w:rPr>
+          <w:rStyle w:val="KeywordTok"/>
+        </w:rPr>
+        <w:t xml:space="preserve">struct</w:t>
+      </w:r>
+      <w:r>
+        <w:rPr>
+          <w:rStyle w:val="NormalTok"/>
+        </w:rPr>
+        <w:t xml:space="preserve"> DockLayout</w:t>
+      </w:r>
+      <w:r>
+        <w:br/>
+      </w:r>
+      <w:r>
+        <w:rPr>
+          <w:rStyle w:val="OperatorTok"/>
+        </w:rPr>
+        <w:t xml:space="preserve">{</w:t>
+      </w:r>
+      <w:r>
+        <w:br/>
+      </w:r>
+      <w:r>
+        <w:rPr>
+          <w:rStyle w:val="NormalTok"/>
+        </w:rPr>
+        <w:t xml:space="preserve">    DockCat cat</w:t>
+      </w:r>
+      <w:r>
+        <w:rPr>
+          <w:rStyle w:val="OperatorTok"/>
+        </w:rPr>
+        <w:t xml:space="preserve">[</w:t>
+      </w:r>
+      <w:r>
+        <w:rPr>
+          <w:rStyle w:val="NormalTok"/>
+        </w:rPr>
+        <w:t xml:space="preserve">DOCK_MAXCATS</w:t>
+      </w:r>
+      <w:r>
+        <w:rPr>
+          <w:rStyle w:val="OperatorTok"/>
+        </w:rPr>
+        <w:t xml:space="preserve">];</w:t>
+      </w:r>
+      <w:r>
+        <w:rPr>
+          <w:rStyle w:val="NormalTok"/>
+        </w:rPr>
+        <w:t xml:space="preserve"> </w:t>
+      </w:r>
+      <w:r>
+        <w:rPr>
+          <w:rStyle w:val="DataTypeTok"/>
+        </w:rPr>
+        <w:t xml:space="preserve">int</w:t>
+      </w:r>
+      <w:r>
+        <w:rPr>
+          <w:rStyle w:val="NormalTok"/>
+        </w:rPr>
+        <w:t xml:space="preserve"> ncats</w:t>
+      </w:r>
+      <w:r>
+        <w:rPr>
+          <w:rStyle w:val="OperatorTok"/>
+        </w:rPr>
+        <w:t xml:space="preserve">;</w:t>
+      </w:r>
+      <w:r>
+        <w:rPr>
+          <w:rStyle w:val="NormalTok"/>
+        </w:rPr>
+        <w:t xml:space="preserve">   </w:t>
+      </w:r>
+      <w:r>
+        <w:rPr>
+          <w:rStyle w:val="CommentTok"/>
+        </w:rPr>
+        <w:t xml:space="preserve">// in the dock's order, left to right</w:t>
+      </w:r>
+      <w:r>
+        <w:br/>
+      </w:r>
+      <w:r>
+        <w:rPr>
+          <w:rStyle w:val="NormalTok"/>
+        </w:rPr>
+        <w:t xml:space="preserve">    </w:t>
+      </w:r>
+      <w:r>
+        <w:rPr>
+          <w:rStyle w:val="DataTypeTok"/>
+        </w:rPr>
+        <w:t xml:space="preserve">char</w:t>
+      </w:r>
+      <w:r>
+        <w:rPr>
+          <w:rStyle w:val="NormalTok"/>
+        </w:rPr>
+        <w:t xml:space="preserve"> launcher</w:t>
+      </w:r>
+      <w:r>
+        <w:rPr>
+          <w:rStyle w:val="OperatorTok"/>
+        </w:rPr>
+        <w:t xml:space="preserve">[</w:t>
+      </w:r>
+      <w:r>
+        <w:rPr>
+          <w:rStyle w:val="NormalTok"/>
+        </w:rPr>
+        <w:t xml:space="preserve">DOCK_MAXLAUNCHERS</w:t>
+      </w:r>
+      <w:r>
+        <w:rPr>
+          <w:rStyle w:val="OperatorTok"/>
+        </w:rPr>
+        <w:t xml:space="preserve">][</w:t>
+      </w:r>
+      <w:r>
+        <w:rPr>
+          <w:rStyle w:val="DecValTok"/>
+        </w:rPr>
+        <w:t xml:space="preserve">32</w:t>
+      </w:r>
+      <w:r>
+        <w:rPr>
+          <w:rStyle w:val="OperatorTok"/>
+        </w:rPr>
+        <w:t xml:space="preserve">];</w:t>
+      </w:r>
+      <w:r>
+        <w:rPr>
+          <w:rStyle w:val="NormalTok"/>
+        </w:rPr>
+        <w:t xml:space="preserve"> </w:t>
+      </w:r>
+      <w:r>
+        <w:rPr>
+          <w:rStyle w:val="DataTypeTok"/>
+        </w:rPr>
+        <w:t xml:space="preserve">int</w:t>
+      </w:r>
+      <w:r>
+        <w:rPr>
+          <w:rStyle w:val="NormalTok"/>
+        </w:rPr>
+        <w:t xml:space="preserve"> nlaunchers</w:t>
+      </w:r>
+      <w:r>
+        <w:rPr>
+          <w:rStyle w:val="OperatorTok"/>
+        </w:rPr>
+        <w:t xml:space="preserve">;</w:t>
+      </w:r>
+      <w:r>
+        <w:br/>
+      </w:r>
+      <w:r>
+        <w:rPr>
+          <w:rStyle w:val="NormalTok"/>
+        </w:rPr>
+        <w:t xml:space="preserve">    </w:t>
+      </w:r>
+      <w:r>
+        <w:rPr>
+          <w:rStyle w:val="DataTypeTok"/>
+        </w:rPr>
+        <w:t xml:space="preserve">char</w:t>
+      </w:r>
+      <w:r>
+        <w:rPr>
+          <w:rStyle w:val="NormalTok"/>
+        </w:rPr>
+        <w:t xml:space="preserve"> desk</w:t>
+      </w:r>
+      <w:r>
+        <w:rPr>
+          <w:rStyle w:val="OperatorTok"/>
+        </w:rPr>
+        <w:t xml:space="preserve">[</w:t>
+      </w:r>
+      <w:r>
+        <w:rPr>
+          <w:rStyle w:val="NormalTok"/>
+        </w:rPr>
+        <w:t xml:space="preserve">DOCK_MAXDESKS</w:t>
+      </w:r>
+      <w:r>
+        <w:rPr>
+          <w:rStyle w:val="OperatorTok"/>
+        </w:rPr>
+        <w:t xml:space="preserve">][</w:t>
+      </w:r>
+      <w:r>
+        <w:rPr>
+          <w:rStyle w:val="DecValTok"/>
+        </w:rPr>
+        <w:t xml:space="preserve">24</w:t>
+      </w:r>
+      <w:r>
+        <w:rPr>
+          <w:rStyle w:val="OperatorTok"/>
+        </w:rPr>
+        <w:t xml:space="preserve">];</w:t>
+      </w:r>
+      <w:r>
+        <w:rPr>
+          <w:rStyle w:val="NormalTok"/>
+        </w:rPr>
+        <w:t xml:space="preserve"> </w:t>
+      </w:r>
+      <w:r>
+        <w:rPr>
+          <w:rStyle w:val="DataTypeTok"/>
+        </w:rPr>
+        <w:t xml:space="preserve">int</w:t>
+      </w:r>
+      <w:r>
+        <w:rPr>
+          <w:rStyle w:val="NormalTok"/>
+        </w:rPr>
+        <w:t xml:space="preserve"> ndesks</w:t>
+      </w:r>
+      <w:r>
+        <w:rPr>
+          <w:rStyle w:val="OperatorTok"/>
+        </w:rPr>
+        <w:t xml:space="preserve">;</w:t>
+      </w:r>
+      <w:r>
+        <w:br/>
+      </w:r>
+      <w:r>
+        <w:rPr>
+          <w:rStyle w:val="NormalTok"/>
+        </w:rPr>
+        <w:t xml:space="preserve">    </w:t>
+      </w:r>
+      <w:r>
+        <w:rPr>
+          <w:rStyle w:val="DataTypeTok"/>
+        </w:rPr>
+        <w:t xml:space="preserve">int</w:t>
+      </w:r>
+      <w:r>
+        <w:rPr>
+          <w:rStyle w:val="NormalTok"/>
+        </w:rPr>
+        <w:t xml:space="preserve"> reserved</w:t>
+      </w:r>
+      <w:r>
+        <w:rPr>
+          <w:rStyle w:val="OperatorTok"/>
+        </w:rPr>
+        <w:t xml:space="preserve">[</w:t>
+      </w:r>
+      <w:r>
+        <w:rPr>
+          <w:rStyle w:val="DecValTok"/>
+        </w:rPr>
+        <w:t xml:space="preserve">8</w:t>
+      </w:r>
+      <w:r>
+        <w:rPr>
+          <w:rStyle w:val="OperatorTok"/>
+        </w:rPr>
+        <w:t xml:space="preserve">];</w:t>
+      </w:r>
+      <w:r>
+        <w:br/>
+      </w:r>
+      <w:r>
+        <w:rPr>
+          <w:rStyle w:val="OperatorTok"/>
+        </w:rPr>
+        <w:t xml:space="preserve">};</w:t>
       </w:r>
     </w:p>
     <w:p>
@@ -16289,6 +17076,209 @@
         <w:pStyle w:val="FirstParagraph"/>
       </w:pPr>
       <w:r>
+        <w:t xml:space="preserve">The categories that may have a drawer: all but Shell, Settings and Emulators (the desktop's parts, the Control Panel's applets, the Game Library's emulators).</w:t>
+      </w:r>
+    </w:p>
+    <w:p>
+      <w:pPr>
+        <w:pStyle w:val="SourceCode"/>
+      </w:pPr>
+      <w:r>
+        <w:rPr>
+          <w:rStyle w:val="DataTypeTok"/>
+        </w:rPr>
+        <w:t xml:space="preserve">bool</w:t>
+      </w:r>
+      <w:r>
+        <w:rPr>
+          <w:rStyle w:val="NormalTok"/>
+        </w:rPr>
+        <w:t xml:space="preserve"> dock_category_docked </w:t>
+      </w:r>
+      <w:r>
+        <w:rPr>
+          <w:rStyle w:val="OperatorTok"/>
+        </w:rPr>
+        <w:t xml:space="preserve">(</w:t>
+      </w:r>
+      <w:r>
+        <w:rPr>
+          <w:rStyle w:val="AttributeTok"/>
+        </w:rPr>
+        <w:t xml:space="preserve">const</w:t>
+      </w:r>
+      <w:r>
+        <w:rPr>
+          <w:rStyle w:val="NormalTok"/>
+        </w:rPr>
+        <w:t xml:space="preserve"> </w:t>
+      </w:r>
+      <w:r>
+        <w:rPr>
+          <w:rStyle w:val="DataTypeTok"/>
+        </w:rPr>
+        <w:t xml:space="preserve">char</w:t>
+      </w:r>
+      <w:r>
+        <w:rPr>
+          <w:rStyle w:val="NormalTok"/>
+        </w:rPr>
+        <w:t xml:space="preserve"> </w:t>
+      </w:r>
+      <w:r>
+        <w:rPr>
+          <w:rStyle w:val="OperatorTok"/>
+        </w:rPr>
+        <w:t xml:space="preserve">*</w:t>
+      </w:r>
+      <w:r>
+        <w:rPr>
+          <w:rStyle w:val="NormalTok"/>
+        </w:rPr>
+        <w:t xml:space="preserve">cat</w:t>
+      </w:r>
+      <w:r>
+        <w:rPr>
+          <w:rStyle w:val="OperatorTok"/>
+        </w:rPr>
+        <w:t xml:space="preserve">);</w:t>
+      </w:r>
+    </w:p>
+    <w:p>
+      <w:pPr>
+        <w:pStyle w:val="FirstParagraph"/>
+      </w:pPr>
+      <w:r>
+        <w:t xml:space="preserve">dock.ini (or the defaults) merged with the card's apps: every category they have, those the file does not name added at the end (an app without a category: "Other"); a main app that is not there any more: "". -&gt; false: no file (the default order: Productivity, Internet, Graphics, Programming, Games, Multimedia, Demos, System, then the others by name).</w:t>
+      </w:r>
+    </w:p>
+    <w:p>
+      <w:pPr>
+        <w:pStyle w:val="SourceCode"/>
+      </w:pPr>
+      <w:r>
+        <w:rPr>
+          <w:rStyle w:val="DataTypeTok"/>
+        </w:rPr>
+        <w:t xml:space="preserve">bool</w:t>
+      </w:r>
+      <w:r>
+        <w:rPr>
+          <w:rStyle w:val="NormalTok"/>
+        </w:rPr>
+        <w:t xml:space="preserve"> dock_layout_load </w:t>
+      </w:r>
+      <w:r>
+        <w:rPr>
+          <w:rStyle w:val="OperatorTok"/>
+        </w:rPr>
+        <w:t xml:space="preserve">(</w:t>
+      </w:r>
+      <w:r>
+        <w:rPr>
+          <w:rStyle w:val="NormalTok"/>
+        </w:rPr>
+        <w:t xml:space="preserve">DockLayout </w:t>
+      </w:r>
+      <w:r>
+        <w:rPr>
+          <w:rStyle w:val="OperatorTok"/>
+        </w:rPr>
+        <w:t xml:space="preserve">&amp;</w:t>
+      </w:r>
+      <w:r>
+        <w:rPr>
+          <w:rStyle w:val="NormalTok"/>
+        </w:rPr>
+        <w:t xml:space="preserve">l</w:t>
+      </w:r>
+      <w:r>
+        <w:rPr>
+          <w:rStyle w:val="OperatorTok"/>
+        </w:rPr>
+        <w:t xml:space="preserve">);</w:t>
+      </w:r>
+    </w:p>
+    <w:p>
+      <w:pPr>
+        <w:pStyle w:val="FirstParagraph"/>
+      </w:pPr>
+      <w:r>
+        <w:t xml:space="preserve">dock.ini written: every category in order (the hidden ones too, and "hidden = " lines for them), the launchers, the workspaces.</w:t>
+      </w:r>
+    </w:p>
+    <w:p>
+      <w:pPr>
+        <w:pStyle w:val="SourceCode"/>
+      </w:pPr>
+      <w:r>
+        <w:rPr>
+          <w:rStyle w:val="DataTypeTok"/>
+        </w:rPr>
+        <w:t xml:space="preserve">bool</w:t>
+      </w:r>
+      <w:r>
+        <w:rPr>
+          <w:rStyle w:val="NormalTok"/>
+        </w:rPr>
+        <w:t xml:space="preserve"> dock_layout_save </w:t>
+      </w:r>
+      <w:r>
+        <w:rPr>
+          <w:rStyle w:val="OperatorTok"/>
+        </w:rPr>
+        <w:t xml:space="preserve">(</w:t>
+      </w:r>
+      <w:r>
+        <w:rPr>
+          <w:rStyle w:val="AttributeTok"/>
+        </w:rPr>
+        <w:t xml:space="preserve">const</w:t>
+      </w:r>
+      <w:r>
+        <w:rPr>
+          <w:rStyle w:val="NormalTok"/>
+        </w:rPr>
+        <w:t xml:space="preserve"> DockLayout </w:t>
+      </w:r>
+      <w:r>
+        <w:rPr>
+          <w:rStyle w:val="OperatorTok"/>
+        </w:rPr>
+        <w:t xml:space="preserve">&amp;</w:t>
+      </w:r>
+      <w:r>
+        <w:rPr>
+          <w:rStyle w:val="NormalTok"/>
+        </w:rPr>
+        <w:t xml:space="preserve">l</w:t>
+      </w:r>
+      <w:r>
+        <w:rPr>
+          <w:rStyle w:val="OperatorTok"/>
+        </w:rPr>
+        <w:t xml:space="preserve">);</w:t>
+      </w:r>
+    </w:p>
+    <w:bookmarkEnd w:id="41"/>
+    <w:bookmarkEnd w:id="42"/>
+    <w:bookmarkStart w:id="43" w:name="systemkitpreloadinih"/>
+    <w:p>
+      <w:pPr>
+        <w:pStyle w:val="Heading2"/>
+      </w:pPr>
+      <w:r>
+        <w:rPr>
+          <w:rStyle w:val="VerbatimChar"/>
+        </w:rPr>
+        <w:t xml:space="preserve">systemkit/preloadini.h</w:t>
+      </w:r>
+    </w:p>
+    <w:p>
+      <w:pPr>
+        <w:pStyle w:val="FirstParagraph"/>
+      </w:pPr>
+      <w:r>
         <w:t xml:space="preserve">preloadini.h -- SD:/etc/preload.ini: the programs loaded ahead at boot and kept in memory (</w:t>
       </w:r>
       <w:r>
@@ -16607,8 +17597,8 @@
         <w:t xml:space="preserve">);</w:t>
       </w:r>
     </w:p>
-    <w:bookmarkEnd w:id="42"/>
-    <w:bookmarkStart w:id="43" w:name="systemkitapplet_protoh"/>
+    <w:bookmarkEnd w:id="43"/>
+    <w:bookmarkStart w:id="44" w:name="systemkitapplet_protoh"/>
     <w:p>
       <w:pPr>
         <w:pStyle w:val="Heading2"/>
@@ -17198,7 +18188,7 @@
         <w:t xml:space="preserve">};</w:t>
       </w:r>
     </w:p>
-    <w:bookmarkEnd w:id="43"/>
+    <w:bookmarkEnd w:id="44"/>
     <w:sectPr>
       <w:footerReference r:id="rId9" w:type="default"/>
       <w:footnotePr>

</xml_diff>

<commit_message>
Docs' exports from the merged sources (SystemKit's reference included)
Co-Authored-By: Claude Opus 5.5 <noreply@anthropic.com>
Claude-Session: https://claude.ai/code/session_019swJDCUhMbX62nsKhgL9Te
</commit_message>
<xml_diff>
--- a/docs/exports/12-SYSTEMKIT.docx
+++ b/docs/exports/12-SYSTEMKIT.docx
@@ -546,7 +546,7 @@
               <w:t xml:space="preserve"> </w:t>
             </w:r>
             <w:r>
-              <w:t xml:space="preserve">— 56 entries in its table (</w:t>
+              <w:t xml:space="preserve">— 59 entries in its table (</w:t>
             </w:r>
             <w:r>
               <w:rPr>
@@ -4761,7 +4761,7 @@
               <w:jc w:val="left"/>
             </w:pPr>
             <w:r>
-              <w:t xml:space="preserve">the dock without a file: 5 drawers (Productivity .. Demos), the terminal and fileviewer launchers, desks "1" .. "4"</w:t>
+              <w:t xml:space="preserve">the dock without a file: 6 drawers (Productivity .. Demos), the terminal and fileviewer launchers, desks "1" .. "4"</w:t>
             </w:r>
           </w:p>
         </w:tc>
@@ -5026,6 +5026,226 @@
             </w:pPr>
             <w:r>
               <w:t xml:space="preserve">The dock takes its settings (and the theme) again</w:t>
+            </w:r>
+          </w:p>
+        </w:tc>
+        <w:tc>
+          <w:tcPr/>
+          <w:p>
+            <w:pPr>
+              <w:pStyle w:val="Compact"/>
+              <w:jc w:val="left"/>
+            </w:pPr>
+            <w:r>
+              <w:rPr>
+                <w:rStyle w:val="VerbatimChar"/>
+              </w:rPr>
+              <w:t xml:space="preserve">dockconf.h</w:t>
+            </w:r>
+          </w:p>
+        </w:tc>
+      </w:tr>
+      <w:tr>
+        <w:tc>
+          <w:tcPr/>
+          <w:p>
+            <w:pPr>
+              <w:pStyle w:val="Compact"/>
+              <w:jc w:val="left"/>
+            </w:pPr>
+            <w:r>
+              <w:rPr>
+                <w:rStyle w:val="VerbatimChar"/>
+              </w:rPr>
+              <w:t xml:space="preserve">DockCat</w:t>
+            </w:r>
+          </w:p>
+        </w:tc>
+        <w:tc>
+          <w:tcPr/>
+          <w:p>
+            <w:pPr>
+              <w:pStyle w:val="Compact"/>
+              <w:jc w:val="left"/>
+            </w:pPr>
+            <w:r>
+              <w:t xml:space="preserve">(a type)</w:t>
+            </w:r>
+          </w:p>
+        </w:tc>
+        <w:tc>
+          <w:tcPr/>
+          <w:p>
+            <w:pPr>
+              <w:pStyle w:val="Compact"/>
+              <w:jc w:val="left"/>
+            </w:pPr>
+            <w:r>
+              <w:rPr>
+                <w:rStyle w:val="VerbatimChar"/>
+              </w:rPr>
+              <w:t xml:space="preserve">dockconf.h</w:t>
+            </w:r>
+          </w:p>
+        </w:tc>
+      </w:tr>
+      <w:tr>
+        <w:tc>
+          <w:tcPr/>
+          <w:p>
+            <w:pPr>
+              <w:pStyle w:val="Compact"/>
+              <w:jc w:val="left"/>
+            </w:pPr>
+            <w:r>
+              <w:rPr>
+                <w:rStyle w:val="VerbatimChar"/>
+              </w:rPr>
+              <w:t xml:space="preserve">DockLayout</w:t>
+            </w:r>
+          </w:p>
+        </w:tc>
+        <w:tc>
+          <w:tcPr/>
+          <w:p>
+            <w:pPr>
+              <w:pStyle w:val="Compact"/>
+              <w:jc w:val="left"/>
+            </w:pPr>
+            <w:r>
+              <w:t xml:space="preserve">(a type)</w:t>
+            </w:r>
+          </w:p>
+        </w:tc>
+        <w:tc>
+          <w:tcPr/>
+          <w:p>
+            <w:pPr>
+              <w:pStyle w:val="Compact"/>
+              <w:jc w:val="left"/>
+            </w:pPr>
+            <w:r>
+              <w:rPr>
+                <w:rStyle w:val="VerbatimChar"/>
+              </w:rPr>
+              <w:t xml:space="preserve">dockconf.h</w:t>
+            </w:r>
+          </w:p>
+        </w:tc>
+      </w:tr>
+      <w:tr>
+        <w:tc>
+          <w:tcPr/>
+          <w:p>
+            <w:pPr>
+              <w:pStyle w:val="Compact"/>
+              <w:jc w:val="left"/>
+            </w:pPr>
+            <w:r>
+              <w:rPr>
+                <w:rStyle w:val="VerbatimChar"/>
+              </w:rPr>
+              <w:t xml:space="preserve">dock_category_docked</w:t>
+            </w:r>
+          </w:p>
+        </w:tc>
+        <w:tc>
+          <w:tcPr/>
+          <w:p>
+            <w:pPr>
+              <w:pStyle w:val="Compact"/>
+              <w:jc w:val="left"/>
+            </w:pPr>
+            <w:r>
+              <w:t xml:space="preserve">The categories that may have a drawer</w:t>
+            </w:r>
+          </w:p>
+        </w:tc>
+        <w:tc>
+          <w:tcPr/>
+          <w:p>
+            <w:pPr>
+              <w:pStyle w:val="Compact"/>
+              <w:jc w:val="left"/>
+            </w:pPr>
+            <w:r>
+              <w:rPr>
+                <w:rStyle w:val="VerbatimChar"/>
+              </w:rPr>
+              <w:t xml:space="preserve">dockconf.h</w:t>
+            </w:r>
+          </w:p>
+        </w:tc>
+      </w:tr>
+      <w:tr>
+        <w:tc>
+          <w:tcPr/>
+          <w:p>
+            <w:pPr>
+              <w:pStyle w:val="Compact"/>
+              <w:jc w:val="left"/>
+            </w:pPr>
+            <w:r>
+              <w:rPr>
+                <w:rStyle w:val="VerbatimChar"/>
+              </w:rPr>
+              <w:t xml:space="preserve">dock_layout_load</w:t>
+            </w:r>
+          </w:p>
+        </w:tc>
+        <w:tc>
+          <w:tcPr/>
+          <w:p>
+            <w:pPr>
+              <w:pStyle w:val="Compact"/>
+              <w:jc w:val="left"/>
+            </w:pPr>
+            <w:r>
+              <w:t xml:space="preserve">dock.ini (or the defaults) merged with the card's apps</w:t>
+            </w:r>
+          </w:p>
+        </w:tc>
+        <w:tc>
+          <w:tcPr/>
+          <w:p>
+            <w:pPr>
+              <w:pStyle w:val="Compact"/>
+              <w:jc w:val="left"/>
+            </w:pPr>
+            <w:r>
+              <w:rPr>
+                <w:rStyle w:val="VerbatimChar"/>
+              </w:rPr>
+              <w:t xml:space="preserve">dockconf.h</w:t>
+            </w:r>
+          </w:p>
+        </w:tc>
+      </w:tr>
+      <w:tr>
+        <w:tc>
+          <w:tcPr/>
+          <w:p>
+            <w:pPr>
+              <w:pStyle w:val="Compact"/>
+              <w:jc w:val="left"/>
+            </w:pPr>
+            <w:r>
+              <w:rPr>
+                <w:rStyle w:val="VerbatimChar"/>
+              </w:rPr>
+              <w:t xml:space="preserve">dock_layout_save</w:t>
+            </w:r>
+          </w:p>
+        </w:tc>
+        <w:tc>
+          <w:tcPr/>
+          <w:p>
+            <w:pPr>
+              <w:pStyle w:val="Compact"/>
+              <w:jc w:val="left"/>
+            </w:pPr>
+            <w:r>
+              <w:t xml:space="preserve">dock.ini written</w:t>
             </w:r>
           </w:p>
         </w:tc>
@@ -15017,7 +15237,7 @@
     </w:p>
     <w:bookmarkEnd w:id="39"/>
     <w:bookmarkEnd w:id="40"/>
-    <w:bookmarkStart w:id="41" w:name="systemkitdockconfh"/>
+    <w:bookmarkStart w:id="42" w:name="systemkitdockconfh"/>
     <w:p>
       <w:pPr>
         <w:pStyle w:val="Heading2"/>
@@ -15110,6 +15330,23 @@
         </w:rPr>
         <w:t xml:space="preserve">                                        DOCK_MAXDESKS of them</w:t>
       </w:r>
+      <w:r>
+        <w:br/>
+      </w:r>
+      <w:r>
+        <w:rPr>
+          <w:rStyle w:val="VerbatimChar"/>
+        </w:rPr>
+        <w:t xml:space="preserve">    hidden   = Demos                    (2026-10-06) a category that has no drawer</w:t>
+      </w:r>
+    </w:p>
+    <w:p>
+      <w:pPr>
+        <w:pStyle w:val="FirstParagraph"/>
+      </w:pPr>
+      <w:r>
+        <w:t xml:space="preserve">Since 2026-10-06 the dock has a drawer for EVERY category of the card's apps (their app.txt), but Shell, Settings and Emulators (dock_category_docked), and those hidden: dock_layout_load reads the file's drawers as the categories' order and main apps, and adds the categories it does not name at the end. DockConf / dockconf_load / dockconf_save (8 drawers, what the file says) stay for the programs built before (the table is append-only); the dock and the Panel applet use DockLayout.</w:t>
+      </w:r>
     </w:p>
     <w:p>
       <w:pPr>
@@ -15746,7 +15983,7 @@
         <w:rPr>
           <w:rStyle w:val="CommentTok"/>
         </w:rPr>
-        <w:t xml:space="preserve">// the dock without a file: 5 drawers (Productivity .. Demos), the terminal and fileviewer launchers, desks "1" .. "4"</w:t>
+        <w:t xml:space="preserve">// the dock without a file: 6 drawers (Productivity .. Demos), the terminal and fileviewer launchers, desks "1" .. "4"</w:t>
       </w:r>
     </w:p>
     <w:p>
@@ -16271,17 +16508,567 @@
         <w:t xml:space="preserve">);</w:t>
       </w:r>
     </w:p>
-    <w:bookmarkEnd w:id="41"/>
-    <w:bookmarkStart w:id="42" w:name="systemkitpreloadinih"/>
+    <w:bookmarkStart w:id="41" w:name="X57d4995133c680abdabe9c1ce9d1d4aa51d942d"/>
     <w:p>
       <w:pPr>
-        <w:pStyle w:val="Heading2"/>
+        <w:pStyle w:val="Heading3"/>
       </w:pPr>
       <w:r>
-        <w:rPr>
-          <w:rStyle w:val="VerbatimChar"/>
-        </w:rPr>
-        <w:t xml:space="preserve">systemkit/preloadini.h</w:t>
+        <w:t xml:space="preserve">the dock's layout: every category, its order, its main app, hidden or not (2026-10-06)</w:t>
+      </w:r>
+    </w:p>
+    <w:p>
+      <w:pPr>
+        <w:pStyle w:val="SourceCode"/>
+      </w:pPr>
+      <w:r>
+        <w:rPr>
+          <w:rStyle w:val="PreprocessorTok"/>
+        </w:rPr>
+        <w:t xml:space="preserve">#define DOCK_MAXCATS        </w:t>
+      </w:r>
+      <w:r>
+        <w:rPr>
+          <w:rStyle w:val="DecValTok"/>
+        </w:rPr>
+        <w:t xml:space="preserve">32</w:t>
+      </w:r>
+      <w:r>
+        <w:br/>
+      </w:r>
+      <w:r>
+        <w:rPr>
+          <w:rStyle w:val="KeywordTok"/>
+        </w:rPr>
+        <w:t xml:space="preserve">struct</w:t>
+      </w:r>
+      <w:r>
+        <w:rPr>
+          <w:rStyle w:val="NormalTok"/>
+        </w:rPr>
+        <w:t xml:space="preserve"> DockCat</w:t>
+      </w:r>
+      <w:r>
+        <w:br/>
+      </w:r>
+      <w:r>
+        <w:rPr>
+          <w:rStyle w:val="OperatorTok"/>
+        </w:rPr>
+        <w:t xml:space="preserve">{</w:t>
+      </w:r>
+      <w:r>
+        <w:br/>
+      </w:r>
+      <w:r>
+        <w:rPr>
+          <w:rStyle w:val="NormalTok"/>
+        </w:rPr>
+        <w:t xml:space="preserve">    </w:t>
+      </w:r>
+      <w:r>
+        <w:rPr>
+          <w:rStyle w:val="DataTypeTok"/>
+        </w:rPr>
+        <w:t xml:space="preserve">char</w:t>
+      </w:r>
+      <w:r>
+        <w:rPr>
+          <w:rStyle w:val="NormalTok"/>
+        </w:rPr>
+        <w:t xml:space="preserve"> cat</w:t>
+      </w:r>
+      <w:r>
+        <w:rPr>
+          <w:rStyle w:val="OperatorTok"/>
+        </w:rPr>
+        <w:t xml:space="preserve">[</w:t>
+      </w:r>
+      <w:r>
+        <w:rPr>
+          <w:rStyle w:val="DecValTok"/>
+        </w:rPr>
+        <w:t xml:space="preserve">24</w:t>
+      </w:r>
+      <w:r>
+        <w:rPr>
+          <w:rStyle w:val="OperatorTok"/>
+        </w:rPr>
+        <w:t xml:space="preserve">];</w:t>
+      </w:r>
+      <w:r>
+        <w:rPr>
+          <w:rStyle w:val="NormalTok"/>
+        </w:rPr>
+        <w:t xml:space="preserve">               </w:t>
+      </w:r>
+      <w:r>
+        <w:rPr>
+          <w:rStyle w:val="CommentTok"/>
+        </w:rPr>
+        <w:t xml:space="preserve">// the category (the app.txt's)</w:t>
+      </w:r>
+      <w:r>
+        <w:br/>
+      </w:r>
+      <w:r>
+        <w:rPr>
+          <w:rStyle w:val="NormalTok"/>
+        </w:rPr>
+        <w:t xml:space="preserve">    </w:t>
+      </w:r>
+      <w:r>
+        <w:rPr>
+          <w:rStyle w:val="DataTypeTok"/>
+        </w:rPr>
+        <w:t xml:space="preserve">char</w:t>
+      </w:r>
+      <w:r>
+        <w:rPr>
+          <w:rStyle w:val="NormalTok"/>
+        </w:rPr>
+        <w:t xml:space="preserve"> app</w:t>
+      </w:r>
+      <w:r>
+        <w:rPr>
+          <w:rStyle w:val="OperatorTok"/>
+        </w:rPr>
+        <w:t xml:space="preserve">[</w:t>
+      </w:r>
+      <w:r>
+        <w:rPr>
+          <w:rStyle w:val="DecValTok"/>
+        </w:rPr>
+        <w:t xml:space="preserve">32</w:t>
+      </w:r>
+      <w:r>
+        <w:rPr>
+          <w:rStyle w:val="OperatorTok"/>
+        </w:rPr>
+        <w:t xml:space="preserve">];</w:t>
+      </w:r>
+      <w:r>
+        <w:rPr>
+          <w:rStyle w:val="NormalTok"/>
+        </w:rPr>
+        <w:t xml:space="preserve">               </w:t>
+      </w:r>
+      <w:r>
+        <w:rPr>
+          <w:rStyle w:val="CommentTok"/>
+        </w:rPr>
+        <w:t xml:space="preserve">// its main app (the drawer's icon; "": the first of its apps by name)</w:t>
+      </w:r>
+      <w:r>
+        <w:br/>
+      </w:r>
+      <w:r>
+        <w:rPr>
+          <w:rStyle w:val="NormalTok"/>
+        </w:rPr>
+        <w:t xml:space="preserve">    </w:t>
+      </w:r>
+      <w:r>
+        <w:rPr>
+          <w:rStyle w:val="DataTypeTok"/>
+        </w:rPr>
+        <w:t xml:space="preserve">int</w:t>
+      </w:r>
+      <w:r>
+        <w:rPr>
+          <w:rStyle w:val="NormalTok"/>
+        </w:rPr>
+        <w:t xml:space="preserve">  hidden</w:t>
+      </w:r>
+      <w:r>
+        <w:rPr>
+          <w:rStyle w:val="OperatorTok"/>
+        </w:rPr>
+        <w:t xml:space="preserve">;</w:t>
+      </w:r>
+      <w:r>
+        <w:rPr>
+          <w:rStyle w:val="NormalTok"/>
+        </w:rPr>
+        <w:t xml:space="preserve">                </w:t>
+      </w:r>
+      <w:r>
+        <w:rPr>
+          <w:rStyle w:val="CommentTok"/>
+        </w:rPr>
+        <w:t xml:space="preserve">// 1: no drawer for it</w:t>
+      </w:r>
+      <w:r>
+        <w:br/>
+      </w:r>
+      <w:r>
+        <w:rPr>
+          <w:rStyle w:val="NormalTok"/>
+        </w:rPr>
+        <w:t xml:space="preserve">    </w:t>
+      </w:r>
+      <w:r>
+        <w:rPr>
+          <w:rStyle w:val="DataTypeTok"/>
+        </w:rPr>
+        <w:t xml:space="preserve">int</w:t>
+      </w:r>
+      <w:r>
+        <w:rPr>
+          <w:rStyle w:val="NormalTok"/>
+        </w:rPr>
+        <w:t xml:space="preserve">  napps</w:t>
+      </w:r>
+      <w:r>
+        <w:rPr>
+          <w:rStyle w:val="OperatorTok"/>
+        </w:rPr>
+        <w:t xml:space="preserve">;</w:t>
+      </w:r>
+      <w:r>
+        <w:rPr>
+          <w:rStyle w:val="NormalTok"/>
+        </w:rPr>
+        <w:t xml:space="preserve">             </w:t>
+      </w:r>
+      <w:r>
+        <w:rPr>
+          <w:rStyle w:val="CommentTok"/>
+        </w:rPr>
+        <w:t xml:space="preserve">// how many apps of the card are in it (0: named by dock.ini only)</w:t>
+      </w:r>
+      <w:r>
+        <w:br/>
+      </w:r>
+      <w:r>
+        <w:rPr>
+          <w:rStyle w:val="NormalTok"/>
+        </w:rPr>
+        <w:t xml:space="preserve">    </w:t>
+      </w:r>
+      <w:r>
+        <w:rPr>
+          <w:rStyle w:val="DataTypeTok"/>
+        </w:rPr>
+        <w:t xml:space="preserve">int</w:t>
+      </w:r>
+      <w:r>
+        <w:rPr>
+          <w:rStyle w:val="NormalTok"/>
+        </w:rPr>
+        <w:t xml:space="preserve">  reserved</w:t>
+      </w:r>
+      <w:r>
+        <w:rPr>
+          <w:rStyle w:val="OperatorTok"/>
+        </w:rPr>
+        <w:t xml:space="preserve">[</w:t>
+      </w:r>
+      <w:r>
+        <w:rPr>
+          <w:rStyle w:val="DecValTok"/>
+        </w:rPr>
+        <w:t xml:space="preserve">2</w:t>
+      </w:r>
+      <w:r>
+        <w:rPr>
+          <w:rStyle w:val="OperatorTok"/>
+        </w:rPr>
+        <w:t xml:space="preserve">];</w:t>
+      </w:r>
+      <w:r>
+        <w:br/>
+      </w:r>
+      <w:r>
+        <w:rPr>
+          <w:rStyle w:val="OperatorTok"/>
+        </w:rPr>
+        <w:t xml:space="preserve">};</w:t>
+      </w:r>
+      <w:r>
+        <w:br/>
+      </w:r>
+      <w:r>
+        <w:rPr>
+          <w:rStyle w:val="KeywordTok"/>
+        </w:rPr>
+        <w:t xml:space="preserve">struct</w:t>
+      </w:r>
+      <w:r>
+        <w:rPr>
+          <w:rStyle w:val="NormalTok"/>
+        </w:rPr>
+        <w:t xml:space="preserve"> DockLayout</w:t>
+      </w:r>
+      <w:r>
+        <w:br/>
+      </w:r>
+      <w:r>
+        <w:rPr>
+          <w:rStyle w:val="OperatorTok"/>
+        </w:rPr>
+        <w:t xml:space="preserve">{</w:t>
+      </w:r>
+      <w:r>
+        <w:br/>
+      </w:r>
+      <w:r>
+        <w:rPr>
+          <w:rStyle w:val="NormalTok"/>
+        </w:rPr>
+        <w:t xml:space="preserve">    DockCat cat</w:t>
+      </w:r>
+      <w:r>
+        <w:rPr>
+          <w:rStyle w:val="OperatorTok"/>
+        </w:rPr>
+        <w:t xml:space="preserve">[</w:t>
+      </w:r>
+      <w:r>
+        <w:rPr>
+          <w:rStyle w:val="NormalTok"/>
+        </w:rPr>
+        <w:t xml:space="preserve">DOCK_MAXCATS</w:t>
+      </w:r>
+      <w:r>
+        <w:rPr>
+          <w:rStyle w:val="OperatorTok"/>
+        </w:rPr>
+        <w:t xml:space="preserve">];</w:t>
+      </w:r>
+      <w:r>
+        <w:rPr>
+          <w:rStyle w:val="NormalTok"/>
+        </w:rPr>
+        <w:t xml:space="preserve"> </w:t>
+      </w:r>
+      <w:r>
+        <w:rPr>
+          <w:rStyle w:val="DataTypeTok"/>
+        </w:rPr>
+        <w:t xml:space="preserve">int</w:t>
+      </w:r>
+      <w:r>
+        <w:rPr>
+          <w:rStyle w:val="NormalTok"/>
+        </w:rPr>
+        <w:t xml:space="preserve"> ncats</w:t>
+      </w:r>
+      <w:r>
+        <w:rPr>
+          <w:rStyle w:val="OperatorTok"/>
+        </w:rPr>
+        <w:t xml:space="preserve">;</w:t>
+      </w:r>
+      <w:r>
+        <w:rPr>
+          <w:rStyle w:val="NormalTok"/>
+        </w:rPr>
+        <w:t xml:space="preserve">   </w:t>
+      </w:r>
+      <w:r>
+        <w:rPr>
+          <w:rStyle w:val="CommentTok"/>
+        </w:rPr>
+        <w:t xml:space="preserve">// in the dock's order, left to right</w:t>
+      </w:r>
+      <w:r>
+        <w:br/>
+      </w:r>
+      <w:r>
+        <w:rPr>
+          <w:rStyle w:val="NormalTok"/>
+        </w:rPr>
+        <w:t xml:space="preserve">    </w:t>
+      </w:r>
+      <w:r>
+        <w:rPr>
+          <w:rStyle w:val="DataTypeTok"/>
+        </w:rPr>
+        <w:t xml:space="preserve">char</w:t>
+      </w:r>
+      <w:r>
+        <w:rPr>
+          <w:rStyle w:val="NormalTok"/>
+        </w:rPr>
+        <w:t xml:space="preserve"> launcher</w:t>
+      </w:r>
+      <w:r>
+        <w:rPr>
+          <w:rStyle w:val="OperatorTok"/>
+        </w:rPr>
+        <w:t xml:space="preserve">[</w:t>
+      </w:r>
+      <w:r>
+        <w:rPr>
+          <w:rStyle w:val="NormalTok"/>
+        </w:rPr>
+        <w:t xml:space="preserve">DOCK_MAXLAUNCHERS</w:t>
+      </w:r>
+      <w:r>
+        <w:rPr>
+          <w:rStyle w:val="OperatorTok"/>
+        </w:rPr>
+        <w:t xml:space="preserve">][</w:t>
+      </w:r>
+      <w:r>
+        <w:rPr>
+          <w:rStyle w:val="DecValTok"/>
+        </w:rPr>
+        <w:t xml:space="preserve">32</w:t>
+      </w:r>
+      <w:r>
+        <w:rPr>
+          <w:rStyle w:val="OperatorTok"/>
+        </w:rPr>
+        <w:t xml:space="preserve">];</w:t>
+      </w:r>
+      <w:r>
+        <w:rPr>
+          <w:rStyle w:val="NormalTok"/>
+        </w:rPr>
+        <w:t xml:space="preserve"> </w:t>
+      </w:r>
+      <w:r>
+        <w:rPr>
+          <w:rStyle w:val="DataTypeTok"/>
+        </w:rPr>
+        <w:t xml:space="preserve">int</w:t>
+      </w:r>
+      <w:r>
+        <w:rPr>
+          <w:rStyle w:val="NormalTok"/>
+        </w:rPr>
+        <w:t xml:space="preserve"> nlaunchers</w:t>
+      </w:r>
+      <w:r>
+        <w:rPr>
+          <w:rStyle w:val="OperatorTok"/>
+        </w:rPr>
+        <w:t xml:space="preserve">;</w:t>
+      </w:r>
+      <w:r>
+        <w:br/>
+      </w:r>
+      <w:r>
+        <w:rPr>
+          <w:rStyle w:val="NormalTok"/>
+        </w:rPr>
+        <w:t xml:space="preserve">    </w:t>
+      </w:r>
+      <w:r>
+        <w:rPr>
+          <w:rStyle w:val="DataTypeTok"/>
+        </w:rPr>
+        <w:t xml:space="preserve">char</w:t>
+      </w:r>
+      <w:r>
+        <w:rPr>
+          <w:rStyle w:val="NormalTok"/>
+        </w:rPr>
+        <w:t xml:space="preserve"> desk</w:t>
+      </w:r>
+      <w:r>
+        <w:rPr>
+          <w:rStyle w:val="OperatorTok"/>
+        </w:rPr>
+        <w:t xml:space="preserve">[</w:t>
+      </w:r>
+      <w:r>
+        <w:rPr>
+          <w:rStyle w:val="NormalTok"/>
+        </w:rPr>
+        <w:t xml:space="preserve">DOCK_MAXDESKS</w:t>
+      </w:r>
+      <w:r>
+        <w:rPr>
+          <w:rStyle w:val="OperatorTok"/>
+        </w:rPr>
+        <w:t xml:space="preserve">][</w:t>
+      </w:r>
+      <w:r>
+        <w:rPr>
+          <w:rStyle w:val="DecValTok"/>
+        </w:rPr>
+        <w:t xml:space="preserve">24</w:t>
+      </w:r>
+      <w:r>
+        <w:rPr>
+          <w:rStyle w:val="OperatorTok"/>
+        </w:rPr>
+        <w:t xml:space="preserve">];</w:t>
+      </w:r>
+      <w:r>
+        <w:rPr>
+          <w:rStyle w:val="NormalTok"/>
+        </w:rPr>
+        <w:t xml:space="preserve"> </w:t>
+      </w:r>
+      <w:r>
+        <w:rPr>
+          <w:rStyle w:val="DataTypeTok"/>
+        </w:rPr>
+        <w:t xml:space="preserve">int</w:t>
+      </w:r>
+      <w:r>
+        <w:rPr>
+          <w:rStyle w:val="NormalTok"/>
+        </w:rPr>
+        <w:t xml:space="preserve"> ndesks</w:t>
+      </w:r>
+      <w:r>
+        <w:rPr>
+          <w:rStyle w:val="OperatorTok"/>
+        </w:rPr>
+        <w:t xml:space="preserve">;</w:t>
+      </w:r>
+      <w:r>
+        <w:br/>
+      </w:r>
+      <w:r>
+        <w:rPr>
+          <w:rStyle w:val="NormalTok"/>
+        </w:rPr>
+        <w:t xml:space="preserve">    </w:t>
+      </w:r>
+      <w:r>
+        <w:rPr>
+          <w:rStyle w:val="DataTypeTok"/>
+        </w:rPr>
+        <w:t xml:space="preserve">int</w:t>
+      </w:r>
+      <w:r>
+        <w:rPr>
+          <w:rStyle w:val="NormalTok"/>
+        </w:rPr>
+        <w:t xml:space="preserve"> reserved</w:t>
+      </w:r>
+      <w:r>
+        <w:rPr>
+          <w:rStyle w:val="OperatorTok"/>
+        </w:rPr>
+        <w:t xml:space="preserve">[</w:t>
+      </w:r>
+      <w:r>
+        <w:rPr>
+          <w:rStyle w:val="DecValTok"/>
+        </w:rPr>
+        <w:t xml:space="preserve">8</w:t>
+      </w:r>
+      <w:r>
+        <w:rPr>
+          <w:rStyle w:val="OperatorTok"/>
+        </w:rPr>
+        <w:t xml:space="preserve">];</w:t>
+      </w:r>
+      <w:r>
+        <w:br/>
+      </w:r>
+      <w:r>
+        <w:rPr>
+          <w:rStyle w:val="OperatorTok"/>
+        </w:rPr>
+        <w:t xml:space="preserve">};</w:t>
       </w:r>
     </w:p>
     <w:p>
@@ -16289,6 +17076,209 @@
         <w:pStyle w:val="FirstParagraph"/>
       </w:pPr>
       <w:r>
+        <w:t xml:space="preserve">The categories that may have a drawer: all but Shell, Settings and Emulators (the desktop's parts, the Control Panel's applets, the Game Library's emulators).</w:t>
+      </w:r>
+    </w:p>
+    <w:p>
+      <w:pPr>
+        <w:pStyle w:val="SourceCode"/>
+      </w:pPr>
+      <w:r>
+        <w:rPr>
+          <w:rStyle w:val="DataTypeTok"/>
+        </w:rPr>
+        <w:t xml:space="preserve">bool</w:t>
+      </w:r>
+      <w:r>
+        <w:rPr>
+          <w:rStyle w:val="NormalTok"/>
+        </w:rPr>
+        <w:t xml:space="preserve"> dock_category_docked </w:t>
+      </w:r>
+      <w:r>
+        <w:rPr>
+          <w:rStyle w:val="OperatorTok"/>
+        </w:rPr>
+        <w:t xml:space="preserve">(</w:t>
+      </w:r>
+      <w:r>
+        <w:rPr>
+          <w:rStyle w:val="AttributeTok"/>
+        </w:rPr>
+        <w:t xml:space="preserve">const</w:t>
+      </w:r>
+      <w:r>
+        <w:rPr>
+          <w:rStyle w:val="NormalTok"/>
+        </w:rPr>
+        <w:t xml:space="preserve"> </w:t>
+      </w:r>
+      <w:r>
+        <w:rPr>
+          <w:rStyle w:val="DataTypeTok"/>
+        </w:rPr>
+        <w:t xml:space="preserve">char</w:t>
+      </w:r>
+      <w:r>
+        <w:rPr>
+          <w:rStyle w:val="NormalTok"/>
+        </w:rPr>
+        <w:t xml:space="preserve"> </w:t>
+      </w:r>
+      <w:r>
+        <w:rPr>
+          <w:rStyle w:val="OperatorTok"/>
+        </w:rPr>
+        <w:t xml:space="preserve">*</w:t>
+      </w:r>
+      <w:r>
+        <w:rPr>
+          <w:rStyle w:val="NormalTok"/>
+        </w:rPr>
+        <w:t xml:space="preserve">cat</w:t>
+      </w:r>
+      <w:r>
+        <w:rPr>
+          <w:rStyle w:val="OperatorTok"/>
+        </w:rPr>
+        <w:t xml:space="preserve">);</w:t>
+      </w:r>
+    </w:p>
+    <w:p>
+      <w:pPr>
+        <w:pStyle w:val="FirstParagraph"/>
+      </w:pPr>
+      <w:r>
+        <w:t xml:space="preserve">dock.ini (or the defaults) merged with the card's apps: every category they have, those the file does not name added at the end (an app without a category: "Other"); a main app that is not there any more: "". -&gt; false: no file (the default order: Productivity, Internet, Graphics, Programming, Games, Multimedia, Demos, System, then the others by name).</w:t>
+      </w:r>
+    </w:p>
+    <w:p>
+      <w:pPr>
+        <w:pStyle w:val="SourceCode"/>
+      </w:pPr>
+      <w:r>
+        <w:rPr>
+          <w:rStyle w:val="DataTypeTok"/>
+        </w:rPr>
+        <w:t xml:space="preserve">bool</w:t>
+      </w:r>
+      <w:r>
+        <w:rPr>
+          <w:rStyle w:val="NormalTok"/>
+        </w:rPr>
+        <w:t xml:space="preserve"> dock_layout_load </w:t>
+      </w:r>
+      <w:r>
+        <w:rPr>
+          <w:rStyle w:val="OperatorTok"/>
+        </w:rPr>
+        <w:t xml:space="preserve">(</w:t>
+      </w:r>
+      <w:r>
+        <w:rPr>
+          <w:rStyle w:val="NormalTok"/>
+        </w:rPr>
+        <w:t xml:space="preserve">DockLayout </w:t>
+      </w:r>
+      <w:r>
+        <w:rPr>
+          <w:rStyle w:val="OperatorTok"/>
+        </w:rPr>
+        <w:t xml:space="preserve">&amp;</w:t>
+      </w:r>
+      <w:r>
+        <w:rPr>
+          <w:rStyle w:val="NormalTok"/>
+        </w:rPr>
+        <w:t xml:space="preserve">l</w:t>
+      </w:r>
+      <w:r>
+        <w:rPr>
+          <w:rStyle w:val="OperatorTok"/>
+        </w:rPr>
+        <w:t xml:space="preserve">);</w:t>
+      </w:r>
+    </w:p>
+    <w:p>
+      <w:pPr>
+        <w:pStyle w:val="FirstParagraph"/>
+      </w:pPr>
+      <w:r>
+        <w:t xml:space="preserve">dock.ini written: every category in order (the hidden ones too, and "hidden = " lines for them), the launchers, the workspaces.</w:t>
+      </w:r>
+    </w:p>
+    <w:p>
+      <w:pPr>
+        <w:pStyle w:val="SourceCode"/>
+      </w:pPr>
+      <w:r>
+        <w:rPr>
+          <w:rStyle w:val="DataTypeTok"/>
+        </w:rPr>
+        <w:t xml:space="preserve">bool</w:t>
+      </w:r>
+      <w:r>
+        <w:rPr>
+          <w:rStyle w:val="NormalTok"/>
+        </w:rPr>
+        <w:t xml:space="preserve"> dock_layout_save </w:t>
+      </w:r>
+      <w:r>
+        <w:rPr>
+          <w:rStyle w:val="OperatorTok"/>
+        </w:rPr>
+        <w:t xml:space="preserve">(</w:t>
+      </w:r>
+      <w:r>
+        <w:rPr>
+          <w:rStyle w:val="AttributeTok"/>
+        </w:rPr>
+        <w:t xml:space="preserve">const</w:t>
+      </w:r>
+      <w:r>
+        <w:rPr>
+          <w:rStyle w:val="NormalTok"/>
+        </w:rPr>
+        <w:t xml:space="preserve"> DockLayout </w:t>
+      </w:r>
+      <w:r>
+        <w:rPr>
+          <w:rStyle w:val="OperatorTok"/>
+        </w:rPr>
+        <w:t xml:space="preserve">&amp;</w:t>
+      </w:r>
+      <w:r>
+        <w:rPr>
+          <w:rStyle w:val="NormalTok"/>
+        </w:rPr>
+        <w:t xml:space="preserve">l</w:t>
+      </w:r>
+      <w:r>
+        <w:rPr>
+          <w:rStyle w:val="OperatorTok"/>
+        </w:rPr>
+        <w:t xml:space="preserve">);</w:t>
+      </w:r>
+    </w:p>
+    <w:bookmarkEnd w:id="41"/>
+    <w:bookmarkEnd w:id="42"/>
+    <w:bookmarkStart w:id="43" w:name="systemkitpreloadinih"/>
+    <w:p>
+      <w:pPr>
+        <w:pStyle w:val="Heading2"/>
+      </w:pPr>
+      <w:r>
+        <w:rPr>
+          <w:rStyle w:val="VerbatimChar"/>
+        </w:rPr>
+        <w:t xml:space="preserve">systemkit/preloadini.h</w:t>
+      </w:r>
+    </w:p>
+    <w:p>
+      <w:pPr>
+        <w:pStyle w:val="FirstParagraph"/>
+      </w:pPr>
+      <w:r>
         <w:t xml:space="preserve">preloadini.h -- SD:/etc/preload.ini: the programs loaded ahead at boot and kept in memory (</w:t>
       </w:r>
       <w:r>
@@ -16607,8 +17597,8 @@
         <w:t xml:space="preserve">);</w:t>
       </w:r>
     </w:p>
-    <w:bookmarkEnd w:id="42"/>
-    <w:bookmarkStart w:id="43" w:name="systemkitapplet_protoh"/>
+    <w:bookmarkEnd w:id="43"/>
+    <w:bookmarkStart w:id="44" w:name="systemkitapplet_protoh"/>
     <w:p>
       <w:pPr>
         <w:pStyle w:val="Heading2"/>
@@ -17198,7 +18188,7 @@
         <w:t xml:space="preserve">};</w:t>
       </w:r>
     </w:p>
-    <w:bookmarkEnd w:id="43"/>
+    <w:bookmarkEnd w:id="44"/>
     <w:sectPr>
       <w:footerReference r:id="rId9" w:type="default"/>
       <w:footnotePr>

</xml_diff>

<commit_message>
ndsemu: the window fitted to the screen (the zoom's limit), its screenshot (the desktop simulator: the 3D test program); the package declared; HANDOFF, LICENSING, docs 04, the exports
Co-Authored-By: Claude Opus 5.5 <noreply@anthropic.com>
Claude-Session: https://claude.ai/code/session_01Gf97pHLE75FHiJkq2hdWyy
</commit_message>
<xml_diff>
--- a/docs/exports/12-SYSTEMKIT.docx
+++ b/docs/exports/12-SYSTEMKIT.docx
@@ -24,133 +24,133 @@
       </w:pPr>
       <w:r>
         <w:rPr>
+          <w:i/>
           <w:iCs/>
+        </w:rPr>
+        <w:t xml:space="preserve">The reference of</w:t>
+      </w:r>
+      <w:r>
+        <w:rPr>
           <w:i/>
-        </w:rPr>
-        <w:t xml:space="preserve">The reference of</w:t>
-      </w:r>
-      <w:r>
-        <w:rPr>
           <w:iCs/>
+        </w:rPr>
+        <w:t xml:space="preserve"> </w:t>
+      </w:r>
+      <w:r>
+        <w:rPr>
+          <w:b/>
+          <w:bCs/>
           <w:i/>
-        </w:rPr>
-        <w:t xml:space="preserve"> </w:t>
-      </w:r>
-      <w:r>
-        <w:rPr>
-          <w:bCs/>
-          <w:b/>
           <w:iCs/>
+        </w:rPr>
+        <w:t xml:space="preserve">SystemKit</w:t>
+      </w:r>
+      <w:r>
+        <w:rPr>
           <w:i/>
-        </w:rPr>
-        <w:t xml:space="preserve">SystemKit</w:t>
-      </w:r>
-      <w:r>
-        <w:rPr>
           <w:iCs/>
+        </w:rPr>
+        <w:t xml:space="preserve"> </w:t>
+      </w:r>
+      <w:r>
+        <w:rPr>
           <w:i/>
-        </w:rPr>
-        <w:t xml:space="preserve"> </w:t>
-      </w:r>
-      <w:r>
-        <w:rPr>
           <w:iCs/>
+        </w:rPr>
+        <w:t xml:space="preserve">(</w:t>
+      </w:r>
+      <w:r>
+        <w:rPr>
+          <w:rStyle w:val="VerbatimChar"/>
           <w:i/>
-        </w:rPr>
-        <w:t xml:space="preserve">(</w:t>
+          <w:iCs/>
+        </w:rPr>
+        <w:t xml:space="preserve">SD:/lib/systemkit.so</w:t>
+      </w:r>
+      <w:r>
+        <w:rPr>
+          <w:i/>
+          <w:iCs/>
+        </w:rPr>
+        <w:t xml:space="preserve">,</w:t>
+      </w:r>
+      <w:r>
+        <w:rPr>
+          <w:i/>
+          <w:iCs/>
+        </w:rPr>
+        <w:t xml:space="preserve"> </w:t>
       </w:r>
       <w:r>
         <w:rPr>
           <w:rStyle w:val="VerbatimChar"/>
+          <w:i/>
           <w:iCs/>
+        </w:rPr>
+        <w:t xml:space="preserve">user/Kits/systemkit</w:t>
+      </w:r>
+      <w:r>
+        <w:rPr>
           <w:i/>
-        </w:rPr>
-        <w:t xml:space="preserve">SD:/lib/systemkit.so</w:t>
-      </w:r>
-      <w:r>
-        <w:rPr>
           <w:iCs/>
+        </w:rPr>
+        <w:t xml:space="preserve">): what it is for, how a program uses it, and every operation it exposes. The operations' part is made from the kit's headers by</w:t>
+      </w:r>
+      <w:r>
+        <w:rPr>
           <w:i/>
-        </w:rPr>
-        <w:t xml:space="preserve">,</w:t>
-      </w:r>
-      <w:r>
-        <w:rPr>
           <w:iCs/>
+        </w:rPr>
+        <w:t xml:space="preserve"> </w:t>
+      </w:r>
+      <w:r>
+        <w:rPr>
+          <w:rStyle w:val="VerbatimChar"/>
           <w:i/>
-        </w:rPr>
-        <w:t xml:space="preserve"> </w:t>
-      </w:r>
-      <w:r>
-        <w:rPr>
-          <w:rStyle w:val="VerbatimChar"/>
           <w:iCs/>
+        </w:rPr>
+        <w:t xml:space="preserve">tools/docgen/kitdocs.py</w:t>
+      </w:r>
+      <w:r>
+        <w:rPr>
           <w:i/>
-        </w:rPr>
-        <w:t xml:space="preserve">user/Kits/systemkit</w:t>
-      </w:r>
-      <w:r>
-        <w:rPr>
           <w:iCs/>
+        </w:rPr>
+        <w:t xml:space="preserve"> </w:t>
+      </w:r>
+      <w:r>
+        <w:rPr>
           <w:i/>
-        </w:rPr>
-        <w:t xml:space="preserve">): what it is for, how a program uses it, and every operation it exposes. The operations' part is made from the kit's headers by</w:t>
-      </w:r>
-      <w:r>
-        <w:rPr>
           <w:iCs/>
+        </w:rPr>
+        <w:t xml:space="preserve">— the headers are the source. Overview of all the kits:</w:t>
+      </w:r>
+      <w:r>
+        <w:rPr>
           <w:i/>
-        </w:rPr>
-        <w:t xml:space="preserve"> </w:t>
-      </w:r>
-      <w:r>
-        <w:rPr>
-          <w:rStyle w:val="VerbatimChar"/>
           <w:iCs/>
-          <w:i/>
-        </w:rPr>
-        <w:t xml:space="preserve">tools/docgen/kitdocs.py</w:t>
-      </w:r>
-      <w:r>
-        <w:rPr>
-          <w:iCs/>
-          <w:i/>
-        </w:rPr>
-        <w:t xml:space="preserve"> </w:t>
-      </w:r>
-      <w:r>
-        <w:rPr>
-          <w:iCs/>
-          <w:i/>
-        </w:rPr>
-        <w:t xml:space="preserve">— the headers are the source. Overview of all the kits:</w:t>
-      </w:r>
-      <w:r>
-        <w:rPr>
-          <w:iCs/>
-          <w:i/>
-        </w:rPr>
-        <w:t xml:space="preserve"> </w:t>
-      </w:r>
-      <w:hyperlink r:id="rId20">
+        </w:rPr>
+        <w:t xml:space="preserve"> </w:t>
+      </w:r>
+      <w:hyperlink r:id="rId18">
         <w:r>
           <w:rPr>
             <w:rStyle w:val="Hyperlink"/>
+            <w:i/>
             <w:iCs/>
-            <w:i/>
           </w:rPr>
           <w:t xml:space="preserve">The Kits</w:t>
         </w:r>
       </w:hyperlink>
       <w:r>
         <w:rPr>
+          <w:i/>
           <w:iCs/>
-          <w:i/>
         </w:rPr>
         <w:t xml:space="preserve">.</w:t>
       </w:r>
     </w:p>
-    <w:bookmarkStart w:id="21" w:name="contents"/>
+    <w:bookmarkStart w:id="19" w:name="contents"/>
     <w:p>
       <w:pPr>
         <w:pStyle w:val="Heading2"/>
@@ -161,11 +161,11 @@
     </w:p>
     <w:p>
       <w:pPr>
+        <w:pStyle w:val="Compact"/>
         <w:numPr>
           <w:ilvl w:val="0"/>
           <w:numId w:val="1001"/>
         </w:numPr>
-        <w:pStyle w:val="Compact"/>
       </w:pPr>
       <w:hyperlink w:anchor="what-it-is">
         <w:r>
@@ -178,11 +178,11 @@
     </w:p>
     <w:p>
       <w:pPr>
+        <w:pStyle w:val="Compact"/>
         <w:numPr>
           <w:ilvl w:val="0"/>
           <w:numId w:val="1001"/>
         </w:numPr>
-        <w:pStyle w:val="Compact"/>
       </w:pPr>
       <w:hyperlink w:anchor="using-it">
         <w:r>
@@ -195,11 +195,11 @@
     </w:p>
     <w:p>
       <w:pPr>
+        <w:pStyle w:val="Compact"/>
         <w:numPr>
           <w:ilvl w:val="0"/>
           <w:numId w:val="1001"/>
         </w:numPr>
-        <w:pStyle w:val="Compact"/>
       </w:pPr>
       <w:hyperlink w:anchor="index">
         <w:r>
@@ -212,11 +212,11 @@
     </w:p>
     <w:p>
       <w:pPr>
+        <w:pStyle w:val="Compact"/>
         <w:numPr>
           <w:ilvl w:val="0"/>
           <w:numId w:val="1001"/>
         </w:numPr>
-        <w:pStyle w:val="Compact"/>
       </w:pPr>
       <w:hyperlink w:anchor="systemkitnotifyh">
         <w:r>
@@ -229,11 +229,11 @@
     </w:p>
     <w:p>
       <w:pPr>
+        <w:pStyle w:val="Compact"/>
         <w:numPr>
           <w:ilvl w:val="0"/>
           <w:numId w:val="1001"/>
         </w:numPr>
-        <w:pStyle w:val="Compact"/>
       </w:pPr>
       <w:hyperlink w:anchor="systemkitclipboardh">
         <w:r>
@@ -246,11 +246,11 @@
     </w:p>
     <w:p>
       <w:pPr>
+        <w:pStyle w:val="Compact"/>
         <w:numPr>
           <w:ilvl w:val="0"/>
           <w:numId w:val="1001"/>
         </w:numPr>
-        <w:pStyle w:val="Compact"/>
       </w:pPr>
       <w:hyperlink w:anchor="systemkitclipprotoh">
         <w:r>
@@ -263,11 +263,11 @@
     </w:p>
     <w:p>
       <w:pPr>
+        <w:pStyle w:val="Compact"/>
         <w:numPr>
           <w:ilvl w:val="0"/>
           <w:numId w:val="1001"/>
         </w:numPr>
-        <w:pStyle w:val="Compact"/>
       </w:pPr>
       <w:hyperlink w:anchor="systemkittrashh">
         <w:r>
@@ -280,11 +280,11 @@
     </w:p>
     <w:p>
       <w:pPr>
+        <w:pStyle w:val="Compact"/>
         <w:numPr>
           <w:ilvl w:val="0"/>
           <w:numId w:val="1001"/>
         </w:numPr>
-        <w:pStyle w:val="Compact"/>
       </w:pPr>
       <w:hyperlink w:anchor="systemkitfileassoch">
         <w:r>
@@ -297,11 +297,11 @@
     </w:p>
     <w:p>
       <w:pPr>
+        <w:pStyle w:val="Compact"/>
         <w:numPr>
           <w:ilvl w:val="0"/>
           <w:numId w:val="1001"/>
         </w:numPr>
-        <w:pStyle w:val="Compact"/>
       </w:pPr>
       <w:hyperlink w:anchor="systemkitvolumeh">
         <w:r>
@@ -314,11 +314,11 @@
     </w:p>
     <w:p>
       <w:pPr>
+        <w:pStyle w:val="Compact"/>
         <w:numPr>
           <w:ilvl w:val="0"/>
           <w:numId w:val="1001"/>
         </w:numPr>
-        <w:pStyle w:val="Compact"/>
       </w:pPr>
       <w:hyperlink w:anchor="systemkitwallpaperh">
         <w:r>
@@ -331,11 +331,11 @@
     </w:p>
     <w:p>
       <w:pPr>
+        <w:pStyle w:val="Compact"/>
         <w:numPr>
           <w:ilvl w:val="0"/>
           <w:numId w:val="1001"/>
         </w:numPr>
-        <w:pStyle w:val="Compact"/>
       </w:pPr>
       <w:hyperlink w:anchor="systemkitdockconfh">
         <w:r>
@@ -348,11 +348,11 @@
     </w:p>
     <w:p>
       <w:pPr>
+        <w:pStyle w:val="Compact"/>
         <w:numPr>
           <w:ilvl w:val="0"/>
           <w:numId w:val="1001"/>
         </w:numPr>
-        <w:pStyle w:val="Compact"/>
       </w:pPr>
       <w:hyperlink w:anchor="systemkitpreloadinih">
         <w:r>
@@ -365,11 +365,11 @@
     </w:p>
     <w:p>
       <w:pPr>
+        <w:pStyle w:val="Compact"/>
         <w:numPr>
           <w:ilvl w:val="0"/>
           <w:numId w:val="1001"/>
         </w:numPr>
-        <w:pStyle w:val="Compact"/>
       </w:pPr>
       <w:hyperlink w:anchor="systemkitautostarth">
         <w:r>
@@ -382,11 +382,11 @@
     </w:p>
     <w:p>
       <w:pPr>
+        <w:pStyle w:val="Compact"/>
         <w:numPr>
           <w:ilvl w:val="0"/>
           <w:numId w:val="1001"/>
         </w:numPr>
-        <w:pStyle w:val="Compact"/>
       </w:pPr>
       <w:hyperlink w:anchor="systemkitlocaleh">
         <w:r>
@@ -399,11 +399,11 @@
     </w:p>
     <w:p>
       <w:pPr>
+        <w:pStyle w:val="Compact"/>
         <w:numPr>
           <w:ilvl w:val="0"/>
           <w:numId w:val="1001"/>
         </w:numPr>
-        <w:pStyle w:val="Compact"/>
       </w:pPr>
       <w:hyperlink w:anchor="systemkitsessionh">
         <w:r>
@@ -416,11 +416,11 @@
     </w:p>
     <w:p>
       <w:pPr>
+        <w:pStyle w:val="Compact"/>
         <w:numPr>
           <w:ilvl w:val="0"/>
           <w:numId w:val="1001"/>
         </w:numPr>
-        <w:pStyle w:val="Compact"/>
       </w:pPr>
       <w:hyperlink w:anchor="systemkitappletprotoh">
         <w:r>
@@ -438,8 +438,8 @@
         </w:pict>
       </w:r>
     </w:p>
-    <w:bookmarkEnd w:id="21"/>
-    <w:bookmarkStart w:id="22" w:name="what-it-is"/>
+    <w:bookmarkEnd w:id="19"/>
+    <w:bookmarkStart w:id="20" w:name="what-it-is"/>
     <w:p>
       <w:pPr>
         <w:pStyle w:val="Heading2"/>
@@ -461,7 +461,6 @@
         <w:tblStyle w:val="Table"/>
         <w:tblW w:type="auto" w:w="0"/>
         <w:tblLook w:firstRow="1" w:lastRow="0" w:firstColumn="0" w:lastColumn="0" w:noHBand="0" w:noVBand="0" w:val="0020"/>
-        <w:jc w:val="start"/>
       </w:tblPr>
       <w:tblGrid>
         <w:gridCol w:w="3960"/>
@@ -469,7 +468,7 @@
       </w:tblGrid>
       <w:tr>
         <w:trPr>
-          <w:tblHeader w:val="true"/>
+          <w:tblHeader w:val="on"/>
         </w:trPr>
         <w:tc>
           <w:tcPr/>
@@ -494,7 +493,6 @@
           <w:p>
             <w:pPr>
               <w:pStyle w:val="Compact"/>
-              <w:jc w:val="left"/>
             </w:pPr>
             <w:r>
               <w:t xml:space="preserve">Include</w:t>
@@ -506,7 +504,6 @@
           <w:p>
             <w:pPr>
               <w:pStyle w:val="Compact"/>
-              <w:jc w:val="left"/>
             </w:pPr>
             <w:r>
               <w:rPr>
@@ -523,7 +520,6 @@
           <w:p>
             <w:pPr>
               <w:pStyle w:val="Compact"/>
-              <w:jc w:val="left"/>
             </w:pPr>
             <w:r>
               <w:t xml:space="preserve">Link</w:t>
@@ -535,7 +531,6 @@
           <w:p>
             <w:pPr>
               <w:pStyle w:val="Compact"/>
-              <w:jc w:val="left"/>
             </w:pPr>
             <w:r>
               <w:rPr>
@@ -573,7 +568,6 @@
           <w:p>
             <w:pPr>
               <w:pStyle w:val="Compact"/>
-              <w:jc w:val="left"/>
             </w:pPr>
             <w:r>
               <w:t xml:space="preserve">Library</w:t>
@@ -585,7 +579,6 @@
           <w:p>
             <w:pPr>
               <w:pStyle w:val="Compact"/>
-              <w:jc w:val="left"/>
             </w:pPr>
             <w:r>
               <w:rPr>
@@ -617,7 +610,6 @@
           <w:p>
             <w:pPr>
               <w:pStyle w:val="Compact"/>
-              <w:jc w:val="left"/>
             </w:pPr>
             <w:r>
               <w:t xml:space="preserve">Sources</w:t>
@@ -629,7 +621,6 @@
           <w:p>
             <w:pPr>
               <w:pStyle w:val="Compact"/>
-              <w:jc w:val="left"/>
             </w:pPr>
             <w:r>
               <w:rPr>
@@ -641,8 +632,8 @@
         </w:tc>
       </w:tr>
     </w:tbl>
-    <w:bookmarkEnd w:id="22"/>
-    <w:bookmarkStart w:id="23" w:name="using-it"/>
+    <w:bookmarkEnd w:id="20"/>
+    <w:bookmarkStart w:id="21" w:name="using-it"/>
     <w:p>
       <w:pPr>
         <w:pStyle w:val="Heading2"/>
@@ -657,8 +648,8 @@
       </w:pPr>
       <w:r>
         <w:rPr>
+          <w:b/>
           <w:bCs/>
-          <w:b/>
         </w:rPr>
         <w:t xml:space="preserve">A notification</w:t>
       </w:r>
@@ -818,8 +809,8 @@
       </w:pPr>
       <w:r>
         <w:rPr>
+          <w:b/>
           <w:bCs/>
-          <w:b/>
         </w:rPr>
         <w:t xml:space="preserve">The clipboard</w:t>
       </w:r>
@@ -1255,8 +1246,8 @@
       </w:pPr>
       <w:r>
         <w:rPr>
+          <w:b/>
           <w:bCs/>
-          <w:b/>
         </w:rPr>
         <w:t xml:space="preserve">The trash</w:t>
       </w:r>
@@ -1425,8 +1416,8 @@
       </w:pPr>
       <w:r>
         <w:rPr>
+          <w:b/>
           <w:bCs/>
-          <w:b/>
         </w:rPr>
         <w:t xml:space="preserve">Opening a file with the right application</w:t>
       </w:r>
@@ -1652,8 +1643,8 @@
       </w:pPr>
       <w:r>
         <w:rPr>
+          <w:b/>
           <w:bCs/>
-          <w:b/>
         </w:rPr>
         <w:t xml:space="preserve">The volume, the wallpaper, the dock</w:t>
       </w:r>
@@ -1870,8 +1861,8 @@
       </w:pPr>
       <w:r>
         <w:rPr>
+          <w:b/>
           <w:bCs/>
-          <w:b/>
         </w:rPr>
         <w:t xml:space="preserve">Starting a program at every boot</w:t>
       </w:r>
@@ -2046,8 +2037,8 @@
       </w:pPr>
       <w:r>
         <w:rPr>
+          <w:b/>
           <w:bCs/>
-          <w:b/>
         </w:rPr>
         <w:t xml:space="preserve">The system's language</w:t>
       </w:r>
@@ -2399,8 +2390,8 @@
       </w:pPr>
       <w:r>
         <w:rPr>
+          <w:b/>
           <w:bCs/>
-          <w:b/>
         </w:rPr>
         <w:t xml:space="preserve">The time zones at an instant</w:t>
       </w:r>
@@ -2997,8 +2988,8 @@
       </w:pPr>
       <w:r>
         <w:rPr>
+          <w:b/>
           <w:bCs/>
-          <w:b/>
         </w:rPr>
         <w:t xml:space="preserve">The interface's mode and its session</w:t>
       </w:r>
@@ -3778,8 +3769,8 @@
       </w:pPr>
       <w:r>
         <w:rPr>
+          <w:b/>
           <w:bCs/>
-          <w:b/>
         </w:rPr>
         <w:t xml:space="preserve">The pocket shell</w:t>
       </w:r>
@@ -3906,8 +3897,8 @@
       </w:pPr>
       <w:r>
         <w:rPr>
+          <w:b/>
           <w:bCs/>
-          <w:b/>
         </w:rPr>
         <w:t xml:space="preserve">The documents opened last</w:t>
       </w:r>
@@ -4106,8 +4097,8 @@
       </w:pPr>
       <w:r>
         <w:rPr>
+          <w:b/>
           <w:bCs/>
-          <w:b/>
         </w:rPr>
         <w:t xml:space="preserve">The screen's resolution</w:t>
       </w:r>
@@ -4741,8 +4732,8 @@
       </w:pPr>
       <w:r>
         <w:rPr>
+          <w:b/>
           <w:bCs/>
-          <w:b/>
         </w:rPr>
         <w:t xml:space="preserve">The keyboard and the mouse</w:t>
       </w:r>
@@ -5081,7 +5072,6 @@
         <w:tblStyle w:val="Table"/>
         <w:tblW w:type="auto" w:w="0"/>
         <w:tblLook w:firstRow="1" w:lastRow="0" w:firstColumn="0" w:lastColumn="0" w:noHBand="0" w:noVBand="0" w:val="0020"/>
-        <w:jc w:val="start"/>
       </w:tblPr>
       <w:tblGrid>
         <w:gridCol w:w="3960"/>
@@ -5089,14 +5079,13 @@
       </w:tblGrid>
       <w:tr>
         <w:trPr>
-          <w:tblHeader w:val="true"/>
+          <w:tblHeader w:val="on"/>
         </w:trPr>
         <w:tc>
           <w:tcPr/>
           <w:p>
             <w:pPr>
               <w:pStyle w:val="Compact"/>
-              <w:jc w:val="left"/>
             </w:pPr>
             <w:r>
               <w:t xml:space="preserve">Its part (a header of its own, beside</w:t>
@@ -5120,7 +5109,6 @@
           <w:p>
             <w:pPr>
               <w:pStyle w:val="Compact"/>
-              <w:jc w:val="left"/>
             </w:pPr>
             <w:r>
               <w:t xml:space="preserve">Subject</w:t>
@@ -5134,7 +5122,6 @@
           <w:p>
             <w:pPr>
               <w:pStyle w:val="Compact"/>
-              <w:jc w:val="left"/>
             </w:pPr>
             <w:r>
               <w:rPr>
@@ -5149,7 +5136,6 @@
           <w:p>
             <w:pPr>
               <w:pStyle w:val="Compact"/>
-              <w:jc w:val="left"/>
             </w:pPr>
             <w:r>
               <w:t xml:space="preserve">Notifications</w:t>
@@ -5163,7 +5149,6 @@
           <w:p>
             <w:pPr>
               <w:pStyle w:val="Compact"/>
-              <w:jc w:val="left"/>
             </w:pPr>
             <w:r>
               <w:rPr>
@@ -5193,7 +5178,6 @@
           <w:p>
             <w:pPr>
               <w:pStyle w:val="Compact"/>
-              <w:jc w:val="left"/>
             </w:pPr>
             <w:r>
               <w:t xml:space="preserve">The clipboard</w:t>
@@ -5207,7 +5191,6 @@
           <w:p>
             <w:pPr>
               <w:pStyle w:val="Compact"/>
-              <w:jc w:val="left"/>
             </w:pPr>
             <w:r>
               <w:rPr>
@@ -5222,7 +5205,6 @@
           <w:p>
             <w:pPr>
               <w:pStyle w:val="Compact"/>
-              <w:jc w:val="left"/>
             </w:pPr>
             <w:r>
               <w:t xml:space="preserve">The trash</w:t>
@@ -5236,7 +5218,6 @@
           <w:p>
             <w:pPr>
               <w:pStyle w:val="Compact"/>
-              <w:jc w:val="left"/>
             </w:pPr>
             <w:r>
               <w:rPr>
@@ -5251,7 +5232,6 @@
           <w:p>
             <w:pPr>
               <w:pStyle w:val="Compact"/>
-              <w:jc w:val="left"/>
             </w:pPr>
             <w:r>
               <w:t xml:space="preserve">Which application opens which file</w:t>
@@ -5265,7 +5245,6 @@
           <w:p>
             <w:pPr>
               <w:pStyle w:val="Compact"/>
-              <w:jc w:val="left"/>
             </w:pPr>
             <w:r>
               <w:rPr>
@@ -5280,7 +5259,6 @@
           <w:p>
             <w:pPr>
               <w:pStyle w:val="Compact"/>
-              <w:jc w:val="left"/>
             </w:pPr>
             <w:r>
               <w:t xml:space="preserve">The master volume, the output, each program's volume</w:t>
@@ -5294,7 +5272,6 @@
           <w:p>
             <w:pPr>
               <w:pStyle w:val="Compact"/>
-              <w:jc w:val="left"/>
             </w:pPr>
             <w:r>
               <w:rPr>
@@ -5309,7 +5286,6 @@
           <w:p>
             <w:pPr>
               <w:pStyle w:val="Compact"/>
-              <w:jc w:val="left"/>
             </w:pPr>
             <w:r>
               <w:t xml:space="preserve">The wallpaper's settings and its painter</w:t>
@@ -5323,7 +5299,6 @@
           <w:p>
             <w:pPr>
               <w:pStyle w:val="Compact"/>
-              <w:jc w:val="left"/>
             </w:pPr>
             <w:r>
               <w:rPr>
@@ -5338,7 +5313,6 @@
           <w:p>
             <w:pPr>
               <w:pStyle w:val="Compact"/>
-              <w:jc w:val="left"/>
             </w:pPr>
             <w:r>
               <w:t xml:space="preserve">The dock's settings</w:t>
@@ -5352,7 +5326,6 @@
           <w:p>
             <w:pPr>
               <w:pStyle w:val="Compact"/>
-              <w:jc w:val="left"/>
             </w:pPr>
             <w:r>
               <w:rPr>
@@ -5367,7 +5340,6 @@
           <w:p>
             <w:pPr>
               <w:pStyle w:val="Compact"/>
-              <w:jc w:val="left"/>
             </w:pPr>
             <w:r>
               <w:t xml:space="preserve">The programs loaded ahead at boot</w:t>
@@ -5381,7 +5353,6 @@
           <w:p>
             <w:pPr>
               <w:pStyle w:val="Compact"/>
-              <w:jc w:val="left"/>
             </w:pPr>
             <w:r>
               <w:rPr>
@@ -5396,7 +5367,6 @@
           <w:p>
             <w:pPr>
               <w:pStyle w:val="Compact"/>
-              <w:jc w:val="left"/>
             </w:pPr>
             <w:r>
               <w:t xml:space="preserve">The programs started at boot (</w:t>
@@ -5422,7 +5392,6 @@
           <w:p>
             <w:pPr>
               <w:pStyle w:val="Compact"/>
-              <w:jc w:val="left"/>
             </w:pPr>
             <w:r>
               <w:rPr>
@@ -5437,7 +5406,6 @@
           <w:p>
             <w:pPr>
               <w:pStyle w:val="Compact"/>
-              <w:jc w:val="left"/>
             </w:pPr>
             <w:r>
               <w:t xml:space="preserve">A settings applet shown inside the Control Panel</w:t>
@@ -5451,7 +5419,6 @@
           <w:p>
             <w:pPr>
               <w:pStyle w:val="Compact"/>
-              <w:jc w:val="left"/>
             </w:pPr>
             <w:r>
               <w:rPr>
@@ -5466,7 +5433,6 @@
           <w:p>
             <w:pPr>
               <w:pStyle w:val="Compact"/>
-              <w:jc w:val="left"/>
             </w:pPr>
             <w:r>
               <w:t xml:space="preserve">The system's language and time zone (</w:t>
@@ -5489,7 +5455,6 @@
           <w:p>
             <w:pPr>
               <w:pStyle w:val="Compact"/>
-              <w:jc w:val="left"/>
             </w:pPr>
             <w:r>
               <w:rPr>
@@ -5504,7 +5469,6 @@
           <w:p>
             <w:pPr>
               <w:pStyle w:val="Compact"/>
-              <w:jc w:val="left"/>
             </w:pPr>
             <w:r>
               <w:t xml:space="preserve">The interface's mode (desktop, pocket, console) and its session:</w:t>
@@ -5530,7 +5494,6 @@
           <w:p>
             <w:pPr>
               <w:pStyle w:val="Compact"/>
-              <w:jc w:val="left"/>
             </w:pPr>
             <w:r>
               <w:rPr>
@@ -5545,7 +5508,6 @@
           <w:p>
             <w:pPr>
               <w:pStyle w:val="Compact"/>
-              <w:jc w:val="left"/>
             </w:pPr>
             <w:r>
               <w:t xml:space="preserve">The pocket shell's screens asked (</w:t>
@@ -5580,7 +5542,6 @@
           <w:p>
             <w:pPr>
               <w:pStyle w:val="Compact"/>
-              <w:jc w:val="left"/>
             </w:pPr>
             <w:r>
               <w:rPr>
@@ -5595,7 +5556,6 @@
           <w:p>
             <w:pPr>
               <w:pStyle w:val="Compact"/>
-              <w:jc w:val="left"/>
             </w:pPr>
             <w:r>
               <w:t xml:space="preserve">The documents opened last (</w:t>
@@ -5657,7 +5617,6 @@
           <w:p>
             <w:pPr>
               <w:pStyle w:val="Compact"/>
-              <w:jc w:val="left"/>
             </w:pPr>
             <w:r>
               <w:rPr>
@@ -5672,7 +5631,6 @@
           <w:p>
             <w:pPr>
               <w:pStyle w:val="Compact"/>
-              <w:jc w:val="left"/>
             </w:pPr>
             <w:r>
               <w:t xml:space="preserve">The screen's resolution: the sizes, the one kept (</w:t>
@@ -5704,7 +5662,6 @@
           <w:p>
             <w:pPr>
               <w:pStyle w:val="Compact"/>
-              <w:jc w:val="left"/>
             </w:pPr>
             <w:r>
               <w:rPr>
@@ -5719,7 +5676,6 @@
           <w:p>
             <w:pPr>
               <w:pStyle w:val="Compact"/>
-              <w:jc w:val="left"/>
             </w:pPr>
             <w:r>
               <w:t xml:space="preserve">The keyboard's layouts (</w:t>
@@ -5749,8 +5705,8 @@
         </w:tc>
       </w:tr>
     </w:tbl>
-    <w:bookmarkEnd w:id="23"/>
-    <w:bookmarkStart w:id="24" w:name="index"/>
+    <w:bookmarkEnd w:id="21"/>
+    <w:bookmarkStart w:id="22" w:name="index"/>
     <w:p>
       <w:pPr>
         <w:pStyle w:val="Heading2"/>
@@ -5772,7 +5728,6 @@
         <w:tblStyle w:val="Table"/>
         <w:tblW w:type="auto" w:w="0"/>
         <w:tblLook w:firstRow="1" w:lastRow="0" w:firstColumn="0" w:lastColumn="0" w:noHBand="0" w:noVBand="0" w:val="0020"/>
-        <w:jc w:val="start"/>
       </w:tblPr>
       <w:tblGrid>
         <w:gridCol w:w="2640"/>
@@ -5781,14 +5736,13 @@
       </w:tblGrid>
       <w:tr>
         <w:trPr>
-          <w:tblHeader w:val="true"/>
+          <w:tblHeader w:val="on"/>
         </w:trPr>
         <w:tc>
           <w:tcPr/>
           <w:p>
             <w:pPr>
               <w:pStyle w:val="Compact"/>
-              <w:jc w:val="left"/>
             </w:pPr>
             <w:r>
               <w:t xml:space="preserve">Name</w:t>
@@ -5800,7 +5754,6 @@
           <w:p>
             <w:pPr>
               <w:pStyle w:val="Compact"/>
-              <w:jc w:val="left"/>
             </w:pPr>
             <w:r>
               <w:t xml:space="preserve">What it does</w:t>
@@ -5812,7 +5765,6 @@
           <w:p>
             <w:pPr>
               <w:pStyle w:val="Compact"/>
-              <w:jc w:val="left"/>
             </w:pPr>
             <w:r>
               <w:t xml:space="preserve">Header</w:t>
@@ -5826,7 +5778,6 @@
           <w:p>
             <w:pPr>
               <w:pStyle w:val="Compact"/>
-              <w:jc w:val="left"/>
             </w:pPr>
             <w:r>
               <w:rPr>
@@ -5841,7 +5792,6 @@
           <w:p>
             <w:pPr>
               <w:pStyle w:val="Compact"/>
-              <w:jc w:val="left"/>
             </w:pPr>
             <w:r>
               <w:t xml:space="preserve">A bubble with a title and a text, sent to notifyd (started if it does not run, waited for up to 2 s)</w:t>
@@ -5853,7 +5803,6 @@
           <w:p>
             <w:pPr>
               <w:pStyle w:val="Compact"/>
-              <w:jc w:val="left"/>
             </w:pPr>
             <w:r>
               <w:rPr>
@@ -5870,7 +5819,6 @@
           <w:p>
             <w:pPr>
               <w:pStyle w:val="Compact"/>
-              <w:jc w:val="left"/>
             </w:pPr>
             <w:r>
               <w:rPr>
@@ -5885,7 +5833,6 @@
           <w:p>
             <w:pPr>
               <w:pStyle w:val="Compact"/>
-              <w:jc w:val="left"/>
             </w:pPr>
             <w:r>
               <w:t xml:space="preserve">a bubble with a title and a text, no action (notify_action) -&gt; 1 sent, 0 not</w:t>
@@ -5897,7 +5844,6 @@
           <w:p>
             <w:pPr>
               <w:pStyle w:val="Compact"/>
-              <w:jc w:val="left"/>
             </w:pPr>
             <w:r>
               <w:rPr>
@@ -5914,7 +5860,6 @@
           <w:p>
             <w:pPr>
               <w:pStyle w:val="Compact"/>
-              <w:jc w:val="left"/>
             </w:pPr>
             <w:r>
               <w:rPr>
@@ -5929,7 +5874,6 @@
           <w:p>
             <w:pPr>
               <w:pStyle w:val="Compact"/>
-              <w:jc w:val="left"/>
             </w:pPr>
             <w:r>
               <w:t xml:space="preserve">One copy, n representations (a format and its bytes each).</w:t>
@@ -5941,7 +5885,6 @@
           <w:p>
             <w:pPr>
               <w:pStyle w:val="Compact"/>
-              <w:jc w:val="left"/>
             </w:pPr>
             <w:r>
               <w:rPr>
@@ -5958,7 +5901,6 @@
           <w:p>
             <w:pPr>
               <w:pStyle w:val="Compact"/>
-              <w:jc w:val="left"/>
             </w:pPr>
             <w:r>
               <w:rPr>
@@ -5973,7 +5915,6 @@
           <w:p>
             <w:pPr>
               <w:pStyle w:val="Compact"/>
-              <w:jc w:val="left"/>
             </w:pPr>
             <w:r>
               <w:t xml:space="preserve">The item under the cursor in the first of fmt[] it has (else the newest item that has one of them)</w:t>
@@ -5985,7 +5926,6 @@
           <w:p>
             <w:pPr>
               <w:pStyle w:val="Compact"/>
-              <w:jc w:val="left"/>
             </w:pPr>
             <w:r>
               <w:rPr>
@@ -6002,7 +5942,6 @@
           <w:p>
             <w:pPr>
               <w:pStyle w:val="Compact"/>
-              <w:jc w:val="left"/>
             </w:pPr>
             <w:r>
               <w:rPr>
@@ -6017,7 +5956,6 @@
           <w:p>
             <w:pPr>
               <w:pStyle w:val="Compact"/>
-              <w:jc w:val="left"/>
             </w:pPr>
             <w:r>
               <w:t xml:space="preserve">copy the n bytes of s as text (a "text" item to clipd, and the kernel's clipboard)</w:t>
@@ -6029,7 +5967,6 @@
           <w:p>
             <w:pPr>
               <w:pStyle w:val="Compact"/>
-              <w:jc w:val="left"/>
             </w:pPr>
             <w:r>
               <w:rPr>
@@ -6046,7 +5983,6 @@
           <w:p>
             <w:pPr>
               <w:pStyle w:val="Compact"/>
-              <w:jc w:val="left"/>
             </w:pPr>
             <w:r>
               <w:rPr>
@@ -6061,7 +5997,6 @@
           <w:p>
             <w:pPr>
               <w:pStyle w:val="Compact"/>
-              <w:jc w:val="left"/>
             </w:pPr>
             <w:r>
               <w:t xml:space="preserve">copy the NUL-terminated string s as text (clip_set_text_n)</w:t>
@@ -6073,7 +6008,6 @@
           <w:p>
             <w:pPr>
               <w:pStyle w:val="Compact"/>
-              <w:jc w:val="left"/>
             </w:pPr>
             <w:r>
               <w:rPr>
@@ -6090,7 +6024,6 @@
           <w:p>
             <w:pPr>
               <w:pStyle w:val="Compact"/>
-              <w:jc w:val="left"/>
             </w:pPr>
             <w:r>
               <w:rPr>
@@ -6105,7 +6038,6 @@
           <w:p>
             <w:pPr>
               <w:pStyle w:val="Compact"/>
-              <w:jc w:val="left"/>
             </w:pPr>
             <w:r>
               <w:t xml:space="preserve">The clipboard's text into buf (NUL-terminated, truncated to cap-1) -&gt; its length</w:t>
@@ -6117,7 +6049,6 @@
           <w:p>
             <w:pPr>
               <w:pStyle w:val="Compact"/>
-              <w:jc w:val="left"/>
             </w:pPr>
             <w:r>
               <w:rPr>
@@ -6134,7 +6065,6 @@
           <w:p>
             <w:pPr>
               <w:pStyle w:val="Compact"/>
-              <w:jc w:val="left"/>
             </w:pPr>
             <w:r>
               <w:rPr>
@@ -6149,7 +6079,6 @@
           <w:p>
             <w:pPr>
               <w:pStyle w:val="Compact"/>
-              <w:jc w:val="left"/>
             </w:pPr>
             <w:r>
               <w:t xml:space="preserve">File / folder paths ('\n'-separated)</w:t>
@@ -6161,7 +6090,6 @@
           <w:p>
             <w:pPr>
               <w:pStyle w:val="Compact"/>
-              <w:jc w:val="left"/>
             </w:pPr>
             <w:r>
               <w:rPr>
@@ -6178,7 +6106,6 @@
           <w:p>
             <w:pPr>
               <w:pStyle w:val="Compact"/>
-              <w:jc w:val="left"/>
             </w:pPr>
             <w:r>
               <w:rPr>
@@ -6193,7 +6120,6 @@
           <w:p>
             <w:pPr>
               <w:pStyle w:val="Compact"/>
-              <w:jc w:val="left"/>
             </w:pPr>
             <w:r>
               <w:t xml:space="preserve">The first path into buf</w:t>
@@ -6205,7 +6131,6 @@
           <w:p>
             <w:pPr>
               <w:pStyle w:val="Compact"/>
-              <w:jc w:val="left"/>
             </w:pPr>
             <w:r>
               <w:rPr>
@@ -6222,7 +6147,6 @@
           <w:p>
             <w:pPr>
               <w:pStyle w:val="Compact"/>
-              <w:jc w:val="left"/>
             </w:pPr>
             <w:r>
               <w:rPr>
@@ -6237,7 +6161,6 @@
           <w:p>
             <w:pPr>
               <w:pStyle w:val="Compact"/>
-              <w:jc w:val="left"/>
             </w:pPr>
             <w:r>
               <w:t xml:space="preserve">After a cut + paste moved the files</w:t>
@@ -6249,7 +6172,6 @@
           <w:p>
             <w:pPr>
               <w:pStyle w:val="Compact"/>
-              <w:jc w:val="left"/>
             </w:pPr>
             <w:r>
               <w:rPr>
@@ -6266,7 +6188,6 @@
           <w:p>
             <w:pPr>
               <w:pStyle w:val="Compact"/>
-              <w:jc w:val="left"/>
             </w:pPr>
             <w:r>
               <w:rPr>
@@ -6281,7 +6202,6 @@
           <w:p>
             <w:pPr>
               <w:pStyle w:val="Compact"/>
-              <w:jc w:val="left"/>
             </w:pPr>
             <w:r>
               <w:t xml:space="preserve">w x h pixels 0x00RRGGBB (a row after the other)</w:t>
@@ -6293,7 +6213,6 @@
           <w:p>
             <w:pPr>
               <w:pStyle w:val="Compact"/>
-              <w:jc w:val="left"/>
             </w:pPr>
             <w:r>
               <w:rPr>
@@ -6310,7 +6229,6 @@
           <w:p>
             <w:pPr>
               <w:pStyle w:val="Compact"/>
-              <w:jc w:val="left"/>
             </w:pPr>
             <w:r>
               <w:rPr>
@@ -6325,7 +6243,6 @@
           <w:p>
             <w:pPr>
               <w:pStyle w:val="Compact"/>
-              <w:jc w:val="left"/>
             </w:pPr>
             <w:r>
               <w:t xml:space="preserve">-&gt; new[] pixels (delete[] them) and the size, or 0</w:t>
@@ -6337,7 +6254,6 @@
           <w:p>
             <w:pPr>
               <w:pStyle w:val="Compact"/>
-              <w:jc w:val="left"/>
             </w:pPr>
             <w:r>
               <w:rPr>
@@ -6354,7 +6270,6 @@
           <w:p>
             <w:pPr>
               <w:pStyle w:val="Compact"/>
-              <w:jc w:val="left"/>
             </w:pPr>
             <w:r>
               <w:rPr>
@@ -6369,7 +6284,6 @@
           <w:p>
             <w:pPr>
               <w:pStyle w:val="Compact"/>
-              <w:jc w:val="left"/>
             </w:pPr>
             <w:r>
               <w:t xml:space="preserve">what the widget is told of an item (one message)</w:t>
@@ -6381,7 +6295,6 @@
           <w:p>
             <w:pPr>
               <w:pStyle w:val="Compact"/>
-              <w:jc w:val="left"/>
             </w:pPr>
             <w:r>
               <w:rPr>
@@ -6398,7 +6311,6 @@
           <w:p>
             <w:pPr>
               <w:pStyle w:val="Compact"/>
-              <w:jc w:val="left"/>
             </w:pPr>
             <w:r>
               <w:rPr>
@@ -6413,7 +6325,6 @@
           <w:p>
             <w:pPr>
               <w:pStyle w:val="Compact"/>
-              <w:jc w:val="left"/>
             </w:pPr>
             <w:r>
               <w:t xml:space="preserve">v stored at p as 4 bytes, the low one first (little endian)</w:t>
@@ -6425,7 +6336,6 @@
           <w:p>
             <w:pPr>
               <w:pStyle w:val="Compact"/>
-              <w:jc w:val="left"/>
             </w:pPr>
             <w:r>
               <w:rPr>
@@ -6442,7 +6352,6 @@
           <w:p>
             <w:pPr>
               <w:pStyle w:val="Compact"/>
-              <w:jc w:val="left"/>
             </w:pPr>
             <w:r>
               <w:rPr>
@@ -6457,7 +6366,6 @@
           <w:p>
             <w:pPr>
               <w:pStyle w:val="Compact"/>
-              <w:jc w:val="left"/>
             </w:pPr>
             <w:r>
               <w:t xml:space="preserve">the 4 bytes at p read as a little-endian number</w:t>
@@ -6469,7 +6377,6 @@
           <w:p>
             <w:pPr>
               <w:pStyle w:val="Compact"/>
-              <w:jc w:val="left"/>
             </w:pPr>
             <w:r>
               <w:rPr>
@@ -6486,7 +6393,6 @@
           <w:p>
             <w:pPr>
               <w:pStyle w:val="Compact"/>
-              <w:jc w:val="left"/>
             </w:pPr>
             <w:r>
               <w:rPr>
@@ -6501,7 +6407,6 @@
           <w:p>
             <w:pPr>
               <w:pStyle w:val="Compact"/>
-              <w:jc w:val="left"/>
             </w:pPr>
             <w:r>
               <w:t xml:space="preserve">the length of the string s (0 for a null pointer)</w:t>
@@ -6513,7 +6418,6 @@
           <w:p>
             <w:pPr>
               <w:pStyle w:val="Compact"/>
-              <w:jc w:val="left"/>
             </w:pPr>
             <w:r>
               <w:rPr>
@@ -6530,7 +6434,6 @@
           <w:p>
             <w:pPr>
               <w:pStyle w:val="Compact"/>
-              <w:jc w:val="left"/>
             </w:pPr>
             <w:r>
               <w:rPr>
@@ -6545,7 +6448,6 @@
           <w:p>
             <w:pPr>
               <w:pStyle w:val="Compact"/>
-              <w:jc w:val="left"/>
             </w:pPr>
             <w:r>
               <w:t xml:space="preserve">1 if the strings a and b are the same (the case counts), else 0</w:t>
@@ -6557,7 +6459,6 @@
           <w:p>
             <w:pPr>
               <w:pStyle w:val="Compact"/>
-              <w:jc w:val="left"/>
             </w:pPr>
             <w:r>
               <w:rPr>
@@ -6574,7 +6475,6 @@
           <w:p>
             <w:pPr>
               <w:pStyle w:val="Compact"/>
-              <w:jc w:val="left"/>
             </w:pPr>
             <w:r>
               <w:rPr>
@@ -6589,7 +6489,6 @@
           <w:p>
             <w:pPr>
               <w:pStyle w:val="Compact"/>
-              <w:jc w:val="left"/>
             </w:pPr>
             <w:r>
               <w:t xml:space="preserve">the size of a container of n representations</w:t>
@@ -6601,7 +6500,6 @@
           <w:p>
             <w:pPr>
               <w:pStyle w:val="Compact"/>
-              <w:jc w:val="left"/>
             </w:pPr>
             <w:r>
               <w:rPr>
@@ -6618,7 +6516,6 @@
           <w:p>
             <w:pPr>
               <w:pStyle w:val="Compact"/>
-              <w:jc w:val="left"/>
             </w:pPr>
             <w:r>
               <w:rPr>
@@ -6633,7 +6530,6 @@
           <w:p>
             <w:pPr>
               <w:pStyle w:val="Compact"/>
-              <w:jc w:val="left"/>
             </w:pPr>
             <w:r>
               <w:t xml:space="preserve">writes it into out (clipc_size bytes)</w:t>
@@ -6645,7 +6541,6 @@
           <w:p>
             <w:pPr>
               <w:pStyle w:val="Compact"/>
-              <w:jc w:val="left"/>
             </w:pPr>
             <w:r>
               <w:rPr>
@@ -6662,7 +6557,6 @@
           <w:p>
             <w:pPr>
               <w:pStyle w:val="Compact"/>
-              <w:jc w:val="left"/>
             </w:pPr>
             <w:r>
               <w:rPr>
@@ -6677,7 +6571,6 @@
           <w:p>
             <w:pPr>
               <w:pStyle w:val="Compact"/>
-              <w:jc w:val="left"/>
             </w:pPr>
             <w:r>
               <w:t xml:space="preserve">representation i of a container (0..count-1)</w:t>
@@ -6689,7 +6582,6 @@
           <w:p>
             <w:pPr>
               <w:pStyle w:val="Compact"/>
-              <w:jc w:val="left"/>
             </w:pPr>
             <w:r>
               <w:rPr>
@@ -6706,7 +6598,6 @@
           <w:p>
             <w:pPr>
               <w:pStyle w:val="Compact"/>
-              <w:jc w:val="left"/>
             </w:pPr>
             <w:r>
               <w:rPr>
@@ -6721,7 +6612,6 @@
           <w:p>
             <w:pPr>
               <w:pStyle w:val="Compact"/>
-              <w:jc w:val="left"/>
             </w:pPr>
             <w:r>
               <w:t xml:space="preserve">representation i of a container (0..count-1)</w:t>
@@ -6733,7 +6623,6 @@
           <w:p>
             <w:pPr>
               <w:pStyle w:val="Compact"/>
-              <w:jc w:val="left"/>
             </w:pPr>
             <w:r>
               <w:rPr>
@@ -6750,7 +6639,6 @@
           <w:p>
             <w:pPr>
               <w:pStyle w:val="Compact"/>
-              <w:jc w:val="left"/>
             </w:pPr>
             <w:r>
               <w:rPr>
@@ -6765,7 +6653,6 @@
           <w:p>
             <w:pPr>
               <w:pStyle w:val="Compact"/>
-              <w:jc w:val="left"/>
             </w:pPr>
             <w:r>
               <w:t xml:space="preserve">make the trash's folders (TRASH_DIR, TRASH_FILES, TRASH_INFO) if they are not there</w:t>
@@ -6777,7 +6664,6 @@
           <w:p>
             <w:pPr>
               <w:pStyle w:val="Compact"/>
-              <w:jc w:val="left"/>
             </w:pPr>
             <w:r>
               <w:rPr>
@@ -6794,7 +6680,6 @@
           <w:p>
             <w:pPr>
               <w:pStyle w:val="Compact"/>
-              <w:jc w:val="left"/>
             </w:pPr>
             <w:r>
               <w:rPr>
@@ -6809,7 +6694,6 @@
           <w:p>
             <w:pPr>
               <w:pStyle w:val="Compact"/>
-              <w:jc w:val="left"/>
             </w:pPr>
             <w:r>
               <w:t xml:space="preserve">Move</w:t>
@@ -6836,7 +6720,6 @@
           <w:p>
             <w:pPr>
               <w:pStyle w:val="Compact"/>
-              <w:jc w:val="left"/>
             </w:pPr>
             <w:r>
               <w:rPr>
@@ -6853,7 +6736,6 @@
           <w:p>
             <w:pPr>
               <w:pStyle w:val="Compact"/>
-              <w:jc w:val="left"/>
             </w:pPr>
             <w:r>
               <w:rPr>
@@ -6868,7 +6750,6 @@
           <w:p>
             <w:pPr>
               <w:pStyle w:val="Compact"/>
-              <w:jc w:val="left"/>
             </w:pPr>
             <w:r>
               <w:t xml:space="preserve">Original path of trashed item</w:t>
@@ -6895,7 +6776,6 @@
           <w:p>
             <w:pPr>
               <w:pStyle w:val="Compact"/>
-              <w:jc w:val="left"/>
             </w:pPr>
             <w:r>
               <w:rPr>
@@ -6912,7 +6792,6 @@
           <w:p>
             <w:pPr>
               <w:pStyle w:val="Compact"/>
-              <w:jc w:val="left"/>
             </w:pPr>
             <w:r>
               <w:rPr>
@@ -6927,7 +6806,6 @@
           <w:p>
             <w:pPr>
               <w:pStyle w:val="Compact"/>
-              <w:jc w:val="left"/>
             </w:pPr>
             <w:r>
               <w:t xml:space="preserve">Restore trashed item</w:t>
@@ -6954,7 +6832,6 @@
           <w:p>
             <w:pPr>
               <w:pStyle w:val="Compact"/>
-              <w:jc w:val="left"/>
             </w:pPr>
             <w:r>
               <w:rPr>
@@ -6971,7 +6848,6 @@
           <w:p>
             <w:pPr>
               <w:pStyle w:val="Compact"/>
-              <w:jc w:val="left"/>
             </w:pPr>
             <w:r>
               <w:rPr>
@@ -6986,7 +6862,6 @@
           <w:p>
             <w:pPr>
               <w:pStyle w:val="Compact"/>
-              <w:jc w:val="left"/>
             </w:pPr>
             <w:r>
               <w:t xml:space="preserve">Delete trashed item</w:t>
@@ -7013,7 +6888,6 @@
           <w:p>
             <w:pPr>
               <w:pStyle w:val="Compact"/>
-              <w:jc w:val="left"/>
             </w:pPr>
             <w:r>
               <w:rPr>
@@ -7030,7 +6904,6 @@
           <w:p>
             <w:pPr>
               <w:pStyle w:val="Compact"/>
-              <w:jc w:val="left"/>
             </w:pPr>
             <w:r>
               <w:rPr>
@@ -7045,7 +6918,6 @@
           <w:p>
             <w:pPr>
               <w:pStyle w:val="Compact"/>
-              <w:jc w:val="left"/>
             </w:pPr>
             <w:r>
               <w:t xml:space="preserve">Number of items in the trash.</w:t>
@@ -7057,7 +6929,6 @@
           <w:p>
             <w:pPr>
               <w:pStyle w:val="Compact"/>
-              <w:jc w:val="left"/>
             </w:pPr>
             <w:r>
               <w:rPr>
@@ -7074,7 +6945,6 @@
           <w:p>
             <w:pPr>
               <w:pStyle w:val="Compact"/>
-              <w:jc w:val="left"/>
             </w:pPr>
             <w:r>
               <w:rPr>
@@ -7089,7 +6959,6 @@
           <w:p>
             <w:pPr>
               <w:pStyle w:val="Compact"/>
-              <w:jc w:val="left"/>
             </w:pPr>
             <w:r>
               <w:t xml:space="preserve">Empty the trash (everything in files/ and info/).</w:t>
@@ -7101,7 +6970,6 @@
           <w:p>
             <w:pPr>
               <w:pStyle w:val="Compact"/>
-              <w:jc w:val="left"/>
             </w:pPr>
             <w:r>
               <w:rPr>
@@ -7118,7 +6986,6 @@
           <w:p>
             <w:pPr>
               <w:pStyle w:val="Compact"/>
-              <w:jc w:val="left"/>
             </w:pPr>
             <w:r>
               <w:rPr>
@@ -7133,7 +7000,6 @@
           <w:p>
             <w:pPr>
               <w:pStyle w:val="Compact"/>
-              <w:jc w:val="left"/>
             </w:pPr>
             <w:r>
               <w:t xml:space="preserve">Extension of path (after the last '.' of its basename), or "" if none.</w:t>
@@ -7145,7 +7011,6 @@
           <w:p>
             <w:pPr>
               <w:pStyle w:val="Compact"/>
-              <w:jc w:val="left"/>
             </w:pPr>
             <w:r>
               <w:rPr>
@@ -7162,7 +7027,6 @@
           <w:p>
             <w:pPr>
               <w:pStyle w:val="Compact"/>
-              <w:jc w:val="left"/>
             </w:pPr>
             <w:r>
               <w:rPr>
@@ -7177,7 +7041,6 @@
           <w:p>
             <w:pPr>
               <w:pStyle w:val="Compact"/>
-              <w:jc w:val="left"/>
             </w:pPr>
             <w:r>
               <w:t xml:space="preserve">Extension of path (after the last '.' of its basename), or "" if none.</w:t>
@@ -7189,7 +7052,6 @@
           <w:p>
             <w:pPr>
               <w:pStyle w:val="Compact"/>
-              <w:jc w:val="left"/>
             </w:pPr>
             <w:r>
               <w:rPr>
@@ -7206,7 +7068,6 @@
           <w:p>
             <w:pPr>
               <w:pStyle w:val="Compact"/>
-              <w:jc w:val="left"/>
             </w:pPr>
             <w:r>
               <w:rPr>
@@ -7221,7 +7082,6 @@
           <w:p>
             <w:pPr>
               <w:pStyle w:val="Compact"/>
-              <w:jc w:val="left"/>
             </w:pPr>
             <w:r>
               <w:t xml:space="preserve">Extension of path (after the last '.' of its basename), or "" if none.</w:t>
@@ -7233,7 +7093,6 @@
           <w:p>
             <w:pPr>
               <w:pStyle w:val="Compact"/>
-              <w:jc w:val="left"/>
             </w:pPr>
             <w:r>
               <w:rPr>
@@ -7250,7 +7109,6 @@
           <w:p>
             <w:pPr>
               <w:pStyle w:val="Compact"/>
-              <w:jc w:val="left"/>
             </w:pPr>
             <w:r>
               <w:rPr>
@@ -7265,7 +7123,6 @@
           <w:p>
             <w:pPr>
               <w:pStyle w:val="Compact"/>
-              <w:jc w:val="left"/>
             </w:pPr>
             <w:r>
               <w:t xml:space="preserve">Extension of path (after the last '.' of its basename), or "" if none.</w:t>
@@ -7277,7 +7134,6 @@
           <w:p>
             <w:pPr>
               <w:pStyle w:val="Compact"/>
-              <w:jc w:val="left"/>
             </w:pPr>
             <w:r>
               <w:rPr>
@@ -7294,7 +7150,6 @@
           <w:p>
             <w:pPr>
               <w:pStyle w:val="Compact"/>
-              <w:jc w:val="left"/>
             </w:pPr>
             <w:r>
               <w:rPr>
@@ -7309,7 +7164,6 @@
           <w:p>
             <w:pPr>
               <w:pStyle w:val="Compact"/>
-              <w:jc w:val="left"/>
             </w:pPr>
             <w:r>
               <w:t xml:space="preserve">An output's word in sound.ini (KAPI_SND_OUT_*).</w:t>
@@ -7321,7 +7175,6 @@
           <w:p>
             <w:pPr>
               <w:pStyle w:val="Compact"/>
-              <w:jc w:val="left"/>
             </w:pPr>
             <w:r>
               <w:rPr>
@@ -7338,7 +7191,6 @@
           <w:p>
             <w:pPr>
               <w:pStyle w:val="Compact"/>
-              <w:jc w:val="left"/>
             </w:pPr>
             <w:r>
               <w:rPr>
@@ -7353,7 +7205,6 @@
           <w:p>
             <w:pPr>
               <w:pStyle w:val="Compact"/>
-              <w:jc w:val="left"/>
             </w:pPr>
             <w:r>
               <w:t xml:space="preserve">An output's word in sound.ini (KAPI_SND_OUT_*).</w:t>
@@ -7365,7 +7216,6 @@
           <w:p>
             <w:pPr>
               <w:pStyle w:val="Compact"/>
-              <w:jc w:val="left"/>
             </w:pPr>
             <w:r>
               <w:rPr>
@@ -7382,7 +7232,6 @@
           <w:p>
             <w:pPr>
               <w:pStyle w:val="Compact"/>
-              <w:jc w:val="left"/>
             </w:pPr>
             <w:r>
               <w:rPr>
@@ -7397,7 +7246,6 @@
           <w:p>
             <w:pPr>
               <w:pStyle w:val="Compact"/>
-              <w:jc w:val="left"/>
             </w:pPr>
             <w:r>
               <w:t xml:space="preserve">The output chosen (KAPI_SND_OUT_*)</w:t>
@@ -7409,7 +7257,6 @@
           <w:p>
             <w:pPr>
               <w:pStyle w:val="Compact"/>
-              <w:jc w:val="left"/>
             </w:pPr>
             <w:r>
               <w:rPr>
@@ -7426,7 +7273,6 @@
           <w:p>
             <w:pPr>
               <w:pStyle w:val="Compact"/>
-              <w:jc w:val="left"/>
             </w:pPr>
             <w:r>
               <w:rPr>
@@ -7441,7 +7287,6 @@
           <w:p>
             <w:pPr>
               <w:pStyle w:val="Compact"/>
-              <w:jc w:val="left"/>
             </w:pPr>
             <w:r>
               <w:t xml:space="preserve">The channel's volume and mute set now (-1</w:t>
@@ -7453,7 +7298,6 @@
           <w:p>
             <w:pPr>
               <w:pStyle w:val="Compact"/>
-              <w:jc w:val="left"/>
             </w:pPr>
             <w:r>
               <w:rPr>
@@ -7470,7 +7314,6 @@
           <w:p>
             <w:pPr>
               <w:pStyle w:val="Compact"/>
-              <w:jc w:val="left"/>
             </w:pPr>
             <w:r>
               <w:rPr>
@@ -7485,7 +7328,6 @@
           <w:p>
             <w:pPr>
               <w:pStyle w:val="Compact"/>
-              <w:jc w:val="left"/>
             </w:pPr>
             <w:r>
               <w:t xml:space="preserve">the saved volume -&gt; the kernel (no file</w:t>
@@ -7497,7 +7339,6 @@
           <w:p>
             <w:pPr>
               <w:pStyle w:val="Compact"/>
-              <w:jc w:val="left"/>
             </w:pPr>
             <w:r>
               <w:rPr>
@@ -7514,7 +7355,6 @@
           <w:p>
             <w:pPr>
               <w:pStyle w:val="Compact"/>
-              <w:jc w:val="left"/>
             </w:pPr>
             <w:r>
               <w:rPr>
@@ -7529,7 +7369,6 @@
           <w:p>
             <w:pPr>
               <w:pStyle w:val="Compact"/>
-              <w:jc w:val="left"/>
             </w:pPr>
             <w:r>
               <w:t xml:space="preserve">(a type)</w:t>
@@ -7541,7 +7380,6 @@
           <w:p>
             <w:pPr>
               <w:pStyle w:val="Compact"/>
-              <w:jc w:val="left"/>
             </w:pPr>
             <w:r>
               <w:rPr>
@@ -7558,7 +7396,6 @@
           <w:p>
             <w:pPr>
               <w:pStyle w:val="Compact"/>
-              <w:jc w:val="left"/>
             </w:pPr>
             <w:r>
               <w:rPr>
@@ -7573,7 +7410,6 @@
           <w:p>
             <w:pPr>
               <w:pStyle w:val="Compact"/>
-              <w:jc w:val="left"/>
             </w:pPr>
             <w:r>
               <w:t xml:space="preserve">the wallpaper without a file: voronoi, 28 points, the blues 0x4878B0 and 0x1C2C48, the pattern waves.png</w:t>
@@ -7585,7 +7421,6 @@
           <w:p>
             <w:pPr>
               <w:pStyle w:val="Compact"/>
-              <w:jc w:val="left"/>
             </w:pPr>
             <w:r>
               <w:rPr>
@@ -7602,7 +7437,6 @@
           <w:p>
             <w:pPr>
               <w:pStyle w:val="Compact"/>
-              <w:jc w:val="left"/>
             </w:pPr>
             <w:r>
               <w:rPr>
@@ -7617,7 +7451,6 @@
           <w:p>
             <w:pPr>
               <w:pStyle w:val="Compact"/>
-              <w:jc w:val="left"/>
             </w:pPr>
             <w:r>
               <w:t xml:space="preserve">true if a and b are the same string, the case of A..Z ignored</w:t>
@@ -7629,7 +7462,6 @@
           <w:p>
             <w:pPr>
               <w:pStyle w:val="Compact"/>
-              <w:jc w:val="left"/>
             </w:pPr>
             <w:r>
               <w:rPr>
@@ -7646,7 +7478,6 @@
           <w:p>
             <w:pPr>
               <w:pStyle w:val="Compact"/>
-              <w:jc w:val="left"/>
             </w:pPr>
             <w:r>
               <w:rPr>
@@ -7661,7 +7492,6 @@
           <w:p>
             <w:pPr>
               <w:pStyle w:val="Compact"/>
-              <w:jc w:val="left"/>
             </w:pPr>
             <w:r>
               <w:t xml:space="preserve">a colour in hexadecimal ("0xRRGGBB", "#RRGGBB", "RRGGBB") -&gt; 0x00RRGGBB; def if v has no hex digit</w:t>
@@ -7673,7 +7503,6 @@
           <w:p>
             <w:pPr>
               <w:pStyle w:val="Compact"/>
-              <w:jc w:val="left"/>
             </w:pPr>
             <w:r>
               <w:rPr>
@@ -7690,7 +7519,6 @@
           <w:p>
             <w:pPr>
               <w:pStyle w:val="Compact"/>
-              <w:jc w:val="left"/>
             </w:pPr>
             <w:r>
               <w:rPr>
@@ -7705,7 +7533,6 @@
           <w:p>
             <w:pPr>
               <w:pStyle w:val="Compact"/>
-              <w:jc w:val="left"/>
             </w:pPr>
             <w:r>
               <w:t xml:space="preserve">"key = value" lines of a file</w:t>
@@ -7717,7 +7544,6 @@
           <w:p>
             <w:pPr>
               <w:pStyle w:val="Compact"/>
-              <w:jc w:val="left"/>
             </w:pPr>
             <w:r>
               <w:rPr>
@@ -7734,7 +7560,6 @@
           <w:p>
             <w:pPr>
               <w:pStyle w:val="Compact"/>
-              <w:jc w:val="left"/>
             </w:pPr>
             <w:r>
               <w:rPr>
@@ -7749,7 +7574,6 @@
           <w:p>
             <w:pPr>
               <w:pStyle w:val="Compact"/>
-              <w:jc w:val="left"/>
             </w:pPr>
             <w:r>
               <w:t xml:space="preserve">"key = value" lines of a file</w:t>
@@ -7761,7 +7585,6 @@
           <w:p>
             <w:pPr>
               <w:pStyle w:val="Compact"/>
-              <w:jc w:val="left"/>
             </w:pPr>
             <w:r>
               <w:rPr>
@@ -7778,7 +7601,6 @@
           <w:p>
             <w:pPr>
               <w:pStyle w:val="Compact"/>
-              <w:jc w:val="left"/>
             </w:pPr>
             <w:r>
               <w:rPr>
@@ -7793,7 +7615,6 @@
           <w:p>
             <w:pPr>
               <w:pStyle w:val="Compact"/>
-              <w:jc w:val="left"/>
             </w:pPr>
             <w:r>
               <w:t xml:space="preserve">"key = value" lines of a file</w:t>
@@ -7805,7 +7626,6 @@
           <w:p>
             <w:pPr>
               <w:pStyle w:val="Compact"/>
-              <w:jc w:val="left"/>
             </w:pPr>
             <w:r>
               <w:rPr>
@@ -7822,7 +7642,6 @@
           <w:p>
             <w:pPr>
               <w:pStyle w:val="Compact"/>
-              <w:jc w:val="left"/>
             </w:pPr>
             <w:r>
               <w:rPr>
@@ -7837,7 +7656,6 @@
           <w:p>
             <w:pPr>
               <w:pStyle w:val="Compact"/>
-              <w:jc w:val="left"/>
             </w:pPr>
             <w:r>
               <w:t xml:space="preserve">"key = value" lines of a file</w:t>
@@ -7849,7 +7667,6 @@
           <w:p>
             <w:pPr>
               <w:pStyle w:val="Compact"/>
-              <w:jc w:val="left"/>
             </w:pPr>
             <w:r>
               <w:rPr>
@@ -7866,7 +7683,6 @@
           <w:p>
             <w:pPr>
               <w:pStyle w:val="Compact"/>
-              <w:jc w:val="left"/>
             </w:pPr>
             <w:r>
               <w:rPr>
@@ -7881,7 +7697,6 @@
           <w:p>
             <w:pPr>
               <w:pStyle w:val="Compact"/>
-              <w:jc w:val="left"/>
             </w:pPr>
             <w:r>
               <w:t xml:space="preserve">"key = value" lines of a file</w:t>
@@ -7893,7 +7708,6 @@
           <w:p>
             <w:pPr>
               <w:pStyle w:val="Compact"/>
-              <w:jc w:val="left"/>
             </w:pPr>
             <w:r>
               <w:rPr>
@@ -7910,7 +7724,6 @@
           <w:p>
             <w:pPr>
               <w:pStyle w:val="Compact"/>
-              <w:jc w:val="left"/>
             </w:pPr>
             <w:r>
               <w:rPr>
@@ -7925,7 +7738,6 @@
           <w:p>
             <w:pPr>
               <w:pStyle w:val="Compact"/>
-              <w:jc w:val="left"/>
             </w:pPr>
             <w:r>
               <w:t xml:space="preserve">"key = value" lines of a file</w:t>
@@ -7937,7 +7749,6 @@
           <w:p>
             <w:pPr>
               <w:pStyle w:val="Compact"/>
-              <w:jc w:val="left"/>
             </w:pPr>
             <w:r>
               <w:rPr>
@@ -7954,7 +7765,6 @@
           <w:p>
             <w:pPr>
               <w:pStyle w:val="Compact"/>
-              <w:jc w:val="left"/>
             </w:pPr>
             <w:r>
               <w:rPr>
@@ -7969,7 +7779,6 @@
           <w:p>
             <w:pPr>
               <w:pStyle w:val="Compact"/>
-              <w:jc w:val="left"/>
             </w:pPr>
             <w:r>
               <w:t xml:space="preserve">the integer square root of n (rounded down)</w:t>
@@ -7981,7 +7790,6 @@
           <w:p>
             <w:pPr>
               <w:pStyle w:val="Compact"/>
-              <w:jc w:val="left"/>
             </w:pPr>
             <w:r>
               <w:rPr>
@@ -7998,7 +7806,6 @@
           <w:p>
             <w:pPr>
               <w:pStyle w:val="Compact"/>
-              <w:jc w:val="left"/>
             </w:pPr>
             <w:r>
               <w:rPr>
@@ -8013,7 +7820,6 @@
           <w:p>
             <w:pPr>
               <w:pStyle w:val="Compact"/>
-              <w:jc w:val="left"/>
             </w:pPr>
             <w:r>
               <w:t xml:space="preserve">The colour between a and b (0x00RRGGBB), each channel apart -&gt; a for t 0, b for t 255.</w:t>
@@ -8025,7 +7831,6 @@
           <w:p>
             <w:pPr>
               <w:pStyle w:val="Compact"/>
-              <w:jc w:val="left"/>
             </w:pPr>
             <w:r>
               <w:rPr>
@@ -8042,7 +7847,6 @@
           <w:p>
             <w:pPr>
               <w:pStyle w:val="Compact"/>
-              <w:jc w:val="left"/>
             </w:pPr>
             <w:r>
               <w:rPr>
@@ -8057,7 +7861,6 @@
           <w:p>
             <w:pPr>
               <w:pStyle w:val="Compact"/>
-              <w:jc w:val="left"/>
             </w:pPr>
             <w:r>
               <w:t xml:space="preserve">Paint w x h pixels (stride</w:t>
@@ -8069,7 +7872,6 @@
           <w:p>
             <w:pPr>
               <w:pStyle w:val="Compact"/>
-              <w:jc w:val="left"/>
             </w:pPr>
             <w:r>
               <w:rPr>
@@ -8086,7 +7888,6 @@
           <w:p>
             <w:pPr>
               <w:pStyle w:val="Compact"/>
-              <w:jc w:val="left"/>
             </w:pPr>
             <w:r>
               <w:rPr>
@@ -8101,7 +7902,6 @@
           <w:p>
             <w:pPr>
               <w:pStyle w:val="Compact"/>
-              <w:jc w:val="left"/>
             </w:pPr>
             <w:r>
               <w:t xml:space="preserve">the luminance 0..255 of a colour: (77 R + 150 G + 29 B) / 256</w:t>
@@ -8113,7 +7913,6 @@
           <w:p>
             <w:pPr>
               <w:pStyle w:val="Compact"/>
-              <w:jc w:val="left"/>
             </w:pPr>
             <w:r>
               <w:rPr>
@@ -8130,7 +7929,6 @@
           <w:p>
             <w:pPr>
               <w:pStyle w:val="Compact"/>
-              <w:jc w:val="left"/>
             </w:pPr>
             <w:r>
               <w:rPr>
@@ -8145,7 +7943,6 @@
           <w:p>
             <w:pPr>
               <w:pStyle w:val="Compact"/>
-              <w:jc w:val="left"/>
             </w:pPr>
             <w:r>
               <w:t xml:space="preserve">The grey of a picture (0xAARRGGBB, iw x ih</w:t>
@@ -8157,7 +7954,6 @@
           <w:p>
             <w:pPr>
               <w:pStyle w:val="Compact"/>
-              <w:jc w:val="left"/>
             </w:pPr>
             <w:r>
               <w:rPr>
@@ -8174,7 +7970,6 @@
           <w:p>
             <w:pPr>
               <w:pStyle w:val="Compact"/>
-              <w:jc w:val="left"/>
             </w:pPr>
             <w:r>
               <w:rPr>
@@ -8189,7 +7984,6 @@
           <w:p>
             <w:pPr>
               <w:pStyle w:val="Compact"/>
-              <w:jc w:val="left"/>
             </w:pPr>
             <w:r>
               <w:t xml:space="preserve">...</w:t>
@@ -8201,7 +7995,6 @@
           <w:p>
             <w:pPr>
               <w:pStyle w:val="Compact"/>
-              <w:jc w:val="left"/>
             </w:pPr>
             <w:r>
               <w:rPr>
@@ -8218,7 +8011,6 @@
           <w:p>
             <w:pPr>
               <w:pStyle w:val="Compact"/>
-              <w:jc w:val="left"/>
             </w:pPr>
             <w:r>
               <w:rPr>
@@ -8233,7 +8025,6 @@
           <w:p>
             <w:pPr>
               <w:pStyle w:val="Compact"/>
-              <w:jc w:val="left"/>
             </w:pPr>
             <w:r>
               <w:t xml:space="preserve">The colours multiplied by the grey (w x h)</w:t>
@@ -8245,7 +8036,6 @@
           <w:p>
             <w:pPr>
               <w:pStyle w:val="Compact"/>
-              <w:jc w:val="left"/>
             </w:pPr>
             <w:r>
               <w:rPr>
@@ -8262,7 +8052,6 @@
           <w:p>
             <w:pPr>
               <w:pStyle w:val="Compact"/>
-              <w:jc w:val="left"/>
             </w:pPr>
             <w:r>
               <w:rPr>
@@ -8277,7 +8066,6 @@
           <w:p>
             <w:pPr>
               <w:pStyle w:val="Compact"/>
-              <w:jc w:val="left"/>
             </w:pPr>
             <w:r>
               <w:t xml:space="preserve">(a type)</w:t>
@@ -8289,7 +8077,6 @@
           <w:p>
             <w:pPr>
               <w:pStyle w:val="Compact"/>
-              <w:jc w:val="left"/>
             </w:pPr>
             <w:r>
               <w:rPr>
@@ -8306,7 +8093,6 @@
           <w:p>
             <w:pPr>
               <w:pStyle w:val="Compact"/>
-              <w:jc w:val="left"/>
             </w:pPr>
             <w:r>
               <w:rPr>
@@ -8321,7 +8107,6 @@
           <w:p>
             <w:pPr>
               <w:pStyle w:val="Compact"/>
-              <w:jc w:val="left"/>
             </w:pPr>
             <w:r>
               <w:t xml:space="preserve">s (0: "") copied into d, cut at cap - 1 characters, NUL-terminated</w:t>
@@ -8333,7 +8118,6 @@
           <w:p>
             <w:pPr>
               <w:pStyle w:val="Compact"/>
-              <w:jc w:val="left"/>
             </w:pPr>
             <w:r>
               <w:rPr>
@@ -8350,7 +8134,6 @@
           <w:p>
             <w:pPr>
               <w:pStyle w:val="Compact"/>
-              <w:jc w:val="left"/>
             </w:pPr>
             <w:r>
               <w:rPr>
@@ -8365,7 +8148,6 @@
           <w:p>
             <w:pPr>
               <w:pStyle w:val="Compact"/>
-              <w:jc w:val="left"/>
             </w:pPr>
             <w:r>
               <w:t xml:space="preserve">the dock without a file: 6 drawers (Productivity .. Demos), the terminal and fileviewer launchers, desks "1" .. "4"</w:t>
@@ -8377,7 +8159,6 @@
           <w:p>
             <w:pPr>
               <w:pStyle w:val="Compact"/>
-              <w:jc w:val="left"/>
             </w:pPr>
             <w:r>
               <w:rPr>
@@ -8394,7 +8175,6 @@
           <w:p>
             <w:pPr>
               <w:pStyle w:val="Compact"/>
-              <w:jc w:val="left"/>
             </w:pPr>
             <w:r>
               <w:rPr>
@@ -8409,7 +8189,6 @@
           <w:p>
             <w:pPr>
               <w:pStyle w:val="Compact"/>
-              <w:jc w:val="left"/>
             </w:pPr>
             <w:r>
               <w:t xml:space="preserve">A value's two parts</w:t>
@@ -8421,7 +8200,6 @@
           <w:p>
             <w:pPr>
               <w:pStyle w:val="Compact"/>
-              <w:jc w:val="left"/>
             </w:pPr>
             <w:r>
               <w:rPr>
@@ -8438,7 +8216,6 @@
           <w:p>
             <w:pPr>
               <w:pStyle w:val="Compact"/>
-              <w:jc w:val="left"/>
             </w:pPr>
             <w:r>
               <w:rPr>
@@ -8453,7 +8230,6 @@
           <w:p>
             <w:pPr>
               <w:pStyle w:val="Compact"/>
-              <w:jc w:val="left"/>
             </w:pPr>
             <w:r>
               <w:t xml:space="preserve">-&gt; false</w:t>
@@ -8465,7 +8241,6 @@
           <w:p>
             <w:pPr>
               <w:pStyle w:val="Compact"/>
-              <w:jc w:val="left"/>
             </w:pPr>
             <w:r>
               <w:rPr>
@@ -8482,7 +8257,6 @@
           <w:p>
             <w:pPr>
               <w:pStyle w:val="Compact"/>
-              <w:jc w:val="left"/>
             </w:pPr>
             <w:r>
               <w:rPr>
@@ -8497,7 +8271,6 @@
           <w:p>
             <w:pPr>
               <w:pStyle w:val="Compact"/>
-              <w:jc w:val="left"/>
             </w:pPr>
             <w:r>
               <w:t xml:space="preserve">-&gt; false</w:t>
@@ -8509,7 +8282,6 @@
           <w:p>
             <w:pPr>
               <w:pStyle w:val="Compact"/>
-              <w:jc w:val="left"/>
             </w:pPr>
             <w:r>
               <w:rPr>
@@ -8526,7 +8298,6 @@
           <w:p>
             <w:pPr>
               <w:pStyle w:val="Compact"/>
-              <w:jc w:val="left"/>
             </w:pPr>
             <w:r>
               <w:rPr>
@@ -8541,7 +8312,6 @@
           <w:p>
             <w:pPr>
               <w:pStyle w:val="Compact"/>
-              <w:jc w:val="left"/>
             </w:pPr>
             <w:r>
               <w:t xml:space="preserve">-&gt; false</w:t>
@@ -8553,7 +8323,6 @@
           <w:p>
             <w:pPr>
               <w:pStyle w:val="Compact"/>
-              <w:jc w:val="left"/>
             </w:pPr>
             <w:r>
               <w:rPr>
@@ -8570,7 +8339,6 @@
           <w:p>
             <w:pPr>
               <w:pStyle w:val="Compact"/>
-              <w:jc w:val="left"/>
             </w:pPr>
             <w:r>
               <w:rPr>
@@ -8585,7 +8353,6 @@
           <w:p>
             <w:pPr>
               <w:pStyle w:val="Compact"/>
-              <w:jc w:val="left"/>
             </w:pPr>
             <w:r>
               <w:t xml:space="preserve">The dock takes its settings (and the theme) again</w:t>
@@ -8597,7 +8364,6 @@
           <w:p>
             <w:pPr>
               <w:pStyle w:val="Compact"/>
-              <w:jc w:val="left"/>
             </w:pPr>
             <w:r>
               <w:rPr>
@@ -8614,7 +8380,6 @@
           <w:p>
             <w:pPr>
               <w:pStyle w:val="Compact"/>
-              <w:jc w:val="left"/>
             </w:pPr>
             <w:r>
               <w:rPr>
@@ -8629,7 +8394,6 @@
           <w:p>
             <w:pPr>
               <w:pStyle w:val="Compact"/>
-              <w:jc w:val="left"/>
             </w:pPr>
             <w:r>
               <w:t xml:space="preserve">The dock takes its settings (and the theme) again</w:t>
@@ -8641,7 +8405,6 @@
           <w:p>
             <w:pPr>
               <w:pStyle w:val="Compact"/>
-              <w:jc w:val="left"/>
             </w:pPr>
             <w:r>
               <w:rPr>
@@ -8658,7 +8421,6 @@
           <w:p>
             <w:pPr>
               <w:pStyle w:val="Compact"/>
-              <w:jc w:val="left"/>
             </w:pPr>
             <w:r>
               <w:rPr>
@@ -8673,7 +8435,6 @@
           <w:p>
             <w:pPr>
               <w:pStyle w:val="Compact"/>
-              <w:jc w:val="left"/>
             </w:pPr>
             <w:r>
               <w:t xml:space="preserve">(a type)</w:t>
@@ -8685,7 +8446,6 @@
           <w:p>
             <w:pPr>
               <w:pStyle w:val="Compact"/>
-              <w:jc w:val="left"/>
             </w:pPr>
             <w:r>
               <w:rPr>
@@ -8702,7 +8462,6 @@
           <w:p>
             <w:pPr>
               <w:pStyle w:val="Compact"/>
-              <w:jc w:val="left"/>
             </w:pPr>
             <w:r>
               <w:rPr>
@@ -8717,7 +8476,6 @@
           <w:p>
             <w:pPr>
               <w:pStyle w:val="Compact"/>
-              <w:jc w:val="left"/>
             </w:pPr>
             <w:r>
               <w:t xml:space="preserve">(a type)</w:t>
@@ -8729,7 +8487,6 @@
           <w:p>
             <w:pPr>
               <w:pStyle w:val="Compact"/>
-              <w:jc w:val="left"/>
             </w:pPr>
             <w:r>
               <w:rPr>
@@ -8746,7 +8503,6 @@
           <w:p>
             <w:pPr>
               <w:pStyle w:val="Compact"/>
-              <w:jc w:val="left"/>
             </w:pPr>
             <w:r>
               <w:rPr>
@@ -8761,7 +8517,6 @@
           <w:p>
             <w:pPr>
               <w:pStyle w:val="Compact"/>
-              <w:jc w:val="left"/>
             </w:pPr>
             <w:r>
               <w:t xml:space="preserve">The categories that may have a drawer</w:t>
@@ -8773,7 +8528,6 @@
           <w:p>
             <w:pPr>
               <w:pStyle w:val="Compact"/>
-              <w:jc w:val="left"/>
             </w:pPr>
             <w:r>
               <w:rPr>
@@ -8790,7 +8544,6 @@
           <w:p>
             <w:pPr>
               <w:pStyle w:val="Compact"/>
-              <w:jc w:val="left"/>
             </w:pPr>
             <w:r>
               <w:rPr>
@@ -8805,7 +8558,6 @@
           <w:p>
             <w:pPr>
               <w:pStyle w:val="Compact"/>
-              <w:jc w:val="left"/>
             </w:pPr>
             <w:r>
               <w:t xml:space="preserve">dock.ini (or the defaults) merged with the card's apps</w:t>
@@ -8817,7 +8569,6 @@
           <w:p>
             <w:pPr>
               <w:pStyle w:val="Compact"/>
-              <w:jc w:val="left"/>
             </w:pPr>
             <w:r>
               <w:rPr>
@@ -8834,7 +8585,6 @@
           <w:p>
             <w:pPr>
               <w:pStyle w:val="Compact"/>
-              <w:jc w:val="left"/>
             </w:pPr>
             <w:r>
               <w:rPr>
@@ -8849,7 +8599,6 @@
           <w:p>
             <w:pPr>
               <w:pStyle w:val="Compact"/>
-              <w:jc w:val="left"/>
             </w:pPr>
             <w:r>
               <w:t xml:space="preserve">dock.ini written</w:t>
@@ -8861,7 +8610,6 @@
           <w:p>
             <w:pPr>
               <w:pStyle w:val="Compact"/>
-              <w:jc w:val="left"/>
             </w:pPr>
             <w:r>
               <w:rPr>
@@ -8878,7 +8626,6 @@
           <w:p>
             <w:pPr>
               <w:pStyle w:val="Compact"/>
-              <w:jc w:val="left"/>
             </w:pPr>
             <w:r>
               <w:rPr>
@@ -8893,7 +8640,6 @@
           <w:p>
             <w:pPr>
               <w:pStyle w:val="Compact"/>
-              <w:jc w:val="left"/>
             </w:pPr>
             <w:r>
               <w:t xml:space="preserve">(a type)</w:t>
@@ -8905,7 +8651,6 @@
           <w:p>
             <w:pPr>
               <w:pStyle w:val="Compact"/>
-              <w:jc w:val="left"/>
             </w:pPr>
             <w:r>
               <w:rPr>
@@ -8922,7 +8667,6 @@
           <w:p>
             <w:pPr>
               <w:pStyle w:val="Compact"/>
-              <w:jc w:val="left"/>
             </w:pPr>
             <w:r>
               <w:rPr>
@@ -8937,7 +8681,6 @@
           <w:p>
             <w:pPr>
               <w:pStyle w:val="Compact"/>
-              <w:jc w:val="left"/>
             </w:pPr>
             <w:r>
               <w:t xml:space="preserve">-&gt; how many programs the file lists (0</w:t>
@@ -8949,7 +8692,6 @@
           <w:p>
             <w:pPr>
               <w:pStyle w:val="Compact"/>
-              <w:jc w:val="left"/>
             </w:pPr>
             <w:r>
               <w:rPr>
@@ -8966,7 +8708,6 @@
           <w:p>
             <w:pPr>
               <w:pStyle w:val="Compact"/>
-              <w:jc w:val="left"/>
             </w:pPr>
             <w:r>
               <w:rPr>
@@ -8981,7 +8722,6 @@
           <w:p>
             <w:pPr>
               <w:pStyle w:val="Compact"/>
-              <w:jc w:val="left"/>
             </w:pPr>
             <w:r>
               <w:t xml:space="preserve">-&gt; 1 written, 0 not</w:t>
@@ -8993,7 +8733,6 @@
           <w:p>
             <w:pPr>
               <w:pStyle w:val="Compact"/>
-              <w:jc w:val="left"/>
             </w:pPr>
             <w:r>
               <w:rPr>
@@ -9010,7 +8749,6 @@
           <w:p>
             <w:pPr>
               <w:pStyle w:val="Compact"/>
-              <w:jc w:val="left"/>
             </w:pPr>
             <w:r>
               <w:rPr>
@@ -9025,7 +8763,6 @@
           <w:p>
             <w:pPr>
               <w:pStyle w:val="Compact"/>
-              <w:jc w:val="left"/>
             </w:pPr>
             <w:r>
               <w:t xml:space="preserve">Is</w:t>
@@ -9052,7 +8789,6 @@
           <w:p>
             <w:pPr>
               <w:pStyle w:val="Compact"/>
-              <w:jc w:val="left"/>
             </w:pPr>
             <w:r>
               <w:rPr>
@@ -9069,7 +8805,6 @@
           <w:p>
             <w:pPr>
               <w:pStyle w:val="Compact"/>
-              <w:jc w:val="left"/>
             </w:pPr>
             <w:r>
               <w:rPr>
@@ -9084,7 +8819,6 @@
           <w:p>
             <w:pPr>
               <w:pStyle w:val="Compact"/>
-              <w:jc w:val="left"/>
             </w:pPr>
             <w:r>
               <w:t xml:space="preserve">Make sure</w:t>
@@ -9111,7 +8845,6 @@
           <w:p>
             <w:pPr>
               <w:pStyle w:val="Compact"/>
-              <w:jc w:val="left"/>
             </w:pPr>
             <w:r>
               <w:rPr>
@@ -9128,7 +8861,6 @@
           <w:p>
             <w:pPr>
               <w:pStyle w:val="Compact"/>
-              <w:jc w:val="left"/>
             </w:pPr>
             <w:r>
               <w:rPr>
@@ -9143,7 +8875,6 @@
           <w:p>
             <w:pPr>
               <w:pStyle w:val="Compact"/>
-              <w:jc w:val="left"/>
             </w:pPr>
             <w:r>
               <w:t xml:space="preserve">system.ini's "key=value"</w:t>
@@ -9155,7 +8886,6 @@
           <w:p>
             <w:pPr>
               <w:pStyle w:val="Compact"/>
-              <w:jc w:val="left"/>
             </w:pPr>
             <w:r>
               <w:rPr>
@@ -9172,7 +8902,6 @@
           <w:p>
             <w:pPr>
               <w:pStyle w:val="Compact"/>
-              <w:jc w:val="left"/>
             </w:pPr>
             <w:r>
               <w:rPr>
@@ -9187,7 +8916,6 @@
           <w:p>
             <w:pPr>
               <w:pStyle w:val="Compact"/>
-              <w:jc w:val="left"/>
             </w:pPr>
             <w:r>
               <w:t xml:space="preserve">system.ini's "key=value"</w:t>
@@ -9199,7 +8927,6 @@
           <w:p>
             <w:pPr>
               <w:pStyle w:val="Compact"/>
-              <w:jc w:val="left"/>
             </w:pPr>
             <w:r>
               <w:rPr>
@@ -9216,7 +8943,6 @@
           <w:p>
             <w:pPr>
               <w:pStyle w:val="Compact"/>
-              <w:jc w:val="left"/>
             </w:pPr>
             <w:r>
               <w:rPr>
@@ -9239,7 +8965,6 @@
           <w:p>
             <w:pPr>
               <w:pStyle w:val="Compact"/>
-              <w:jc w:val="left"/>
             </w:pPr>
             <w:r>
               <w:rPr>
@@ -9256,7 +8981,6 @@
           <w:p>
             <w:pPr>
               <w:pStyle w:val="Compact"/>
-              <w:jc w:val="left"/>
             </w:pPr>
             <w:r>
               <w:rPr>
@@ -9271,7 +8995,6 @@
           <w:p>
             <w:pPr>
               <w:pStyle w:val="Compact"/>
-              <w:jc w:val="left"/>
             </w:pPr>
             <w:r>
               <w:t xml:space="preserve">"en", "fr" ("" out of range)</w:t>
@@ -9283,7 +9006,6 @@
           <w:p>
             <w:pPr>
               <w:pStyle w:val="Compact"/>
-              <w:jc w:val="left"/>
             </w:pPr>
             <w:r>
               <w:rPr>
@@ -9300,7 +9022,6 @@
           <w:p>
             <w:pPr>
               <w:pStyle w:val="Compact"/>
-              <w:jc w:val="left"/>
             </w:pPr>
             <w:r>
               <w:rPr>
@@ -9315,7 +9036,6 @@
           <w:p>
             <w:pPr>
               <w:pStyle w:val="Compact"/>
-              <w:jc w:val="left"/>
             </w:pPr>
             <w:r>
               <w:t xml:space="preserve">in the language itself, UTF-8: "English", "Français"</w:t>
@@ -9327,7 +9047,6 @@
           <w:p>
             <w:pPr>
               <w:pStyle w:val="Compact"/>
-              <w:jc w:val="left"/>
             </w:pPr>
             <w:r>
               <w:rPr>
@@ -9344,7 +9063,6 @@
           <w:p>
             <w:pPr>
               <w:pStyle w:val="Compact"/>
-              <w:jc w:val="left"/>
             </w:pPr>
             <w:r>
               <w:rPr>
@@ -9359,7 +9077,6 @@
           <w:p>
             <w:pPr>
               <w:pStyle w:val="Compact"/>
-              <w:jc w:val="left"/>
             </w:pPr>
             <w:r>
               <w:t xml:space="preserve">The system's language</w:t>
@@ -9371,7 +9088,6 @@
           <w:p>
             <w:pPr>
               <w:pStyle w:val="Compact"/>
-              <w:jc w:val="left"/>
             </w:pPr>
             <w:r>
               <w:rPr>
@@ -9388,7 +9104,6 @@
           <w:p>
             <w:pPr>
               <w:pStyle w:val="Compact"/>
-              <w:jc w:val="left"/>
             </w:pPr>
             <w:r>
               <w:rPr>
@@ -9403,7 +9118,6 @@
           <w:p>
             <w:pPr>
               <w:pStyle w:val="Compact"/>
-              <w:jc w:val="left"/>
             </w:pPr>
             <w:r>
               <w:t xml:space="preserve">its place in the list</w:t>
@@ -9415,7 +9129,6 @@
           <w:p>
             <w:pPr>
               <w:pStyle w:val="Compact"/>
-              <w:jc w:val="left"/>
             </w:pPr>
             <w:r>
               <w:rPr>
@@ -9432,7 +9145,6 @@
           <w:p>
             <w:pPr>
               <w:pStyle w:val="Compact"/>
-              <w:jc w:val="left"/>
             </w:pPr>
             <w:r>
               <w:rPr>
@@ -9447,7 +9159,6 @@
           <w:p>
             <w:pPr>
               <w:pStyle w:val="Compact"/>
-              <w:jc w:val="left"/>
             </w:pPr>
             <w:r>
               <w:t xml:space="preserve">kept in system.ini -&gt; 1 written (the programs started next take it)</w:t>
@@ -9459,7 +9170,6 @@
           <w:p>
             <w:pPr>
               <w:pStyle w:val="Compact"/>
-              <w:jc w:val="left"/>
             </w:pPr>
             <w:r>
               <w:rPr>
@@ -9476,7 +9186,6 @@
           <w:p>
             <w:pPr>
               <w:pStyle w:val="Compact"/>
-              <w:jc w:val="left"/>
             </w:pPr>
             <w:r>
               <w:rPr>
@@ -9499,7 +9208,6 @@
           <w:p>
             <w:pPr>
               <w:pStyle w:val="Compact"/>
-              <w:jc w:val="left"/>
             </w:pPr>
             <w:r>
               <w:rPr>
@@ -9516,7 +9224,6 @@
           <w:p>
             <w:pPr>
               <w:pStyle w:val="Compact"/>
-              <w:jc w:val="left"/>
             </w:pPr>
             <w:r>
               <w:rPr>
@@ -9531,7 +9238,6 @@
           <w:p>
             <w:pPr>
               <w:pStyle w:val="Compact"/>
-              <w:jc w:val="left"/>
             </w:pPr>
             <w:r>
               <w:t xml:space="preserve">"Brussels" ("" out of range)</w:t>
@@ -9543,7 +9249,6 @@
           <w:p>
             <w:pPr>
               <w:pStyle w:val="Compact"/>
-              <w:jc w:val="left"/>
             </w:pPr>
             <w:r>
               <w:rPr>
@@ -9560,7 +9265,6 @@
           <w:p>
             <w:pPr>
               <w:pStyle w:val="Compact"/>
-              <w:jc w:val="left"/>
             </w:pPr>
             <w:r>
               <w:rPr>
@@ -9575,7 +9279,6 @@
           <w:p>
             <w:pPr>
               <w:pStyle w:val="Compact"/>
-              <w:jc w:val="left"/>
             </w:pPr>
             <w:r>
               <w:t xml:space="preserve">1: the zone is on summer time today (by the clock's date)</w:t>
@@ -9587,7 +9290,6 @@
           <w:p>
             <w:pPr>
               <w:pStyle w:val="Compact"/>
-              <w:jc w:val="left"/>
             </w:pPr>
             <w:r>
               <w:rPr>
@@ -9604,7 +9306,6 @@
           <w:p>
             <w:pPr>
               <w:pStyle w:val="Compact"/>
-              <w:jc w:val="left"/>
             </w:pPr>
             <w:r>
               <w:rPr>
@@ -9619,7 +9320,6 @@
           <w:p>
             <w:pPr>
               <w:pStyle w:val="Compact"/>
-              <w:jc w:val="left"/>
             </w:pPr>
             <w:r>
               <w:t xml:space="preserve">minutes from UTC today (the summer time counted)</w:t>
@@ -9631,7 +9331,6 @@
           <w:p>
             <w:pPr>
               <w:pStyle w:val="Compact"/>
-              <w:jc w:val="left"/>
             </w:pPr>
             <w:r>
               <w:rPr>
@@ -9648,7 +9347,6 @@
           <w:p>
             <w:pPr>
               <w:pStyle w:val="Compact"/>
-              <w:jc w:val="left"/>
             </w:pPr>
             <w:r>
               <w:rPr>
@@ -9663,7 +9361,6 @@
           <w:p>
             <w:pPr>
               <w:pStyle w:val="Compact"/>
-              <w:jc w:val="left"/>
             </w:pPr>
             <w:r>
               <w:t xml:space="preserve">"UTC+2", "UTC-3:30", "UTC"</w:t>
@@ -9675,7 +9372,6 @@
           <w:p>
             <w:pPr>
               <w:pStyle w:val="Compact"/>
-              <w:jc w:val="left"/>
             </w:pPr>
             <w:r>
               <w:rPr>
@@ -9692,7 +9388,6 @@
           <w:p>
             <w:pPr>
               <w:pStyle w:val="Compact"/>
-              <w:jc w:val="left"/>
             </w:pPr>
             <w:r>
               <w:rPr>
@@ -9707,7 +9402,6 @@
           <w:p>
             <w:pPr>
               <w:pStyle w:val="Compact"/>
-              <w:jc w:val="left"/>
             </w:pPr>
             <w:r>
               <w:t xml:space="preserve">the one chosen: system.ini's zone=, else the first of its timezone= (-1 none)</w:t>
@@ -9719,7 +9413,6 @@
           <w:p>
             <w:pPr>
               <w:pStyle w:val="Compact"/>
-              <w:jc w:val="left"/>
             </w:pPr>
             <w:r>
               <w:rPr>
@@ -9736,7 +9429,6 @@
           <w:p>
             <w:pPr>
               <w:pStyle w:val="Compact"/>
-              <w:jc w:val="left"/>
             </w:pPr>
             <w:r>
               <w:rPr>
@@ -9751,7 +9443,6 @@
           <w:p>
             <w:pPr>
               <w:pStyle w:val="Compact"/>
-              <w:jc w:val="left"/>
             </w:pPr>
             <w:r>
               <w:t xml:space="preserve">the clock's offset at once, zone= and timezone= kept -&gt; 1 written</w:t>
@@ -9763,7 +9454,6 @@
           <w:p>
             <w:pPr>
               <w:pStyle w:val="Compact"/>
-              <w:jc w:val="left"/>
             </w:pPr>
             <w:r>
               <w:rPr>
@@ -9780,7 +9470,6 @@
           <w:p>
             <w:pPr>
               <w:pStyle w:val="Compact"/>
-              <w:jc w:val="left"/>
             </w:pPr>
             <w:r>
               <w:rPr>
@@ -9795,7 +9484,6 @@
           <w:p>
             <w:pPr>
               <w:pStyle w:val="Compact"/>
-              <w:jc w:val="left"/>
             </w:pPr>
             <w:r>
               <w:t xml:space="preserve">The zone's offset from UTC at that instant (minutes since 1970, UTC), the hour of the change counted</w:t>
@@ -9807,7 +9495,6 @@
           <w:p>
             <w:pPr>
               <w:pStyle w:val="Compact"/>
-              <w:jc w:val="left"/>
             </w:pPr>
             <w:r>
               <w:rPr>
@@ -9824,7 +9511,6 @@
           <w:p>
             <w:pPr>
               <w:pStyle w:val="Compact"/>
-              <w:jc w:val="left"/>
             </w:pPr>
             <w:r>
               <w:rPr>
@@ -9839,7 +9525,6 @@
           <w:p>
             <w:pPr>
               <w:pStyle w:val="Compact"/>
-              <w:jc w:val="left"/>
             </w:pPr>
             <w:r>
               <w:t xml:space="preserve">The zone named by system.ini's zone= (that one only</w:t>
@@ -9851,7 +9536,6 @@
           <w:p>
             <w:pPr>
               <w:pStyle w:val="Compact"/>
-              <w:jc w:val="left"/>
             </w:pPr>
             <w:r>
               <w:rPr>
@@ -9868,7 +9552,6 @@
           <w:p>
             <w:pPr>
               <w:pStyle w:val="Compact"/>
-              <w:jc w:val="left"/>
             </w:pPr>
             <w:r>
               <w:rPr>
@@ -9883,7 +9566,6 @@
           <w:p>
             <w:pPr>
               <w:pStyle w:val="Compact"/>
-              <w:jc w:val="left"/>
             </w:pPr>
             <w:r>
               <w:t xml:space="preserve">how many modes: 3</w:t>
@@ -9895,7 +9577,6 @@
           <w:p>
             <w:pPr>
               <w:pStyle w:val="Compact"/>
-              <w:jc w:val="left"/>
             </w:pPr>
             <w:r>
               <w:rPr>
@@ -9912,7 +9593,6 @@
           <w:p>
             <w:pPr>
               <w:pStyle w:val="Compact"/>
-              <w:jc w:val="left"/>
             </w:pPr>
             <w:r>
               <w:rPr>
@@ -9927,7 +9607,6 @@
           <w:p>
             <w:pPr>
               <w:pStyle w:val="Compact"/>
-              <w:jc w:val="left"/>
             </w:pPr>
             <w:r>
               <w:t xml:space="preserve">"desktop", "pocket", "console" ("" out of range)</w:t>
@@ -9939,7 +9618,6 @@
           <w:p>
             <w:pPr>
               <w:pStyle w:val="Compact"/>
-              <w:jc w:val="left"/>
             </w:pPr>
             <w:r>
               <w:rPr>
@@ -9956,7 +9634,6 @@
           <w:p>
             <w:pPr>
               <w:pStyle w:val="Compact"/>
-              <w:jc w:val="left"/>
             </w:pPr>
             <w:r>
               <w:rPr>
@@ -9971,7 +9648,6 @@
           <w:p>
             <w:pPr>
               <w:pStyle w:val="Compact"/>
-              <w:jc w:val="left"/>
             </w:pPr>
             <w:r>
               <w:t xml:space="preserve">the mode of that name (any case) -&gt; SESSION_*, -1 none</w:t>
@@ -9983,7 +9659,6 @@
           <w:p>
             <w:pPr>
               <w:pStyle w:val="Compact"/>
-              <w:jc w:val="left"/>
             </w:pPr>
             <w:r>
               <w:rPr>
@@ -10000,7 +9675,6 @@
           <w:p>
             <w:pPr>
               <w:pStyle w:val="Compact"/>
-              <w:jc w:val="left"/>
             </w:pPr>
             <w:r>
               <w:rPr>
@@ -10015,7 +9689,6 @@
           <w:p>
             <w:pPr>
               <w:pStyle w:val="Compact"/>
-              <w:jc w:val="left"/>
             </w:pPr>
             <w:r>
               <w:t xml:space="preserve">The mode chosen</w:t>
@@ -10027,7 +9700,6 @@
           <w:p>
             <w:pPr>
               <w:pStyle w:val="Compact"/>
-              <w:jc w:val="left"/>
             </w:pPr>
             <w:r>
               <w:rPr>
@@ -10044,7 +9716,6 @@
           <w:p>
             <w:pPr>
               <w:pStyle w:val="Compact"/>
-              <w:jc w:val="left"/>
             </w:pPr>
             <w:r>
               <w:rPr>
@@ -10059,7 +9730,6 @@
           <w:p>
             <w:pPr>
               <w:pStyle w:val="Compact"/>
-              <w:jc w:val="left"/>
             </w:pPr>
             <w:r>
               <w:t xml:space="preserve">"shell =</w:t>
@@ -10077,7 +9747,6 @@
           <w:p>
             <w:pPr>
               <w:pStyle w:val="Compact"/>
-              <w:jc w:val="left"/>
             </w:pPr>
             <w:r>
               <w:rPr>
@@ -10094,7 +9763,6 @@
           <w:p>
             <w:pPr>
               <w:pStyle w:val="Compact"/>
-              <w:jc w:val="left"/>
             </w:pPr>
             <w:r>
               <w:rPr>
@@ -10109,7 +9777,6 @@
           <w:p>
             <w:pPr>
               <w:pStyle w:val="Compact"/>
-              <w:jc w:val="left"/>
             </w:pPr>
             <w:r>
               <w:t xml:space="preserve">the mode's session file's path ("SD:/etc/session/pocket") -&gt; its length, 0</w:t>
@@ -10121,7 +9788,6 @@
           <w:p>
             <w:pPr>
               <w:pStyle w:val="Compact"/>
-              <w:jc w:val="left"/>
             </w:pPr>
             <w:r>
               <w:rPr>
@@ -10138,7 +9804,6 @@
           <w:p>
             <w:pPr>
               <w:pStyle w:val="Compact"/>
-              <w:jc w:val="left"/>
             </w:pPr>
             <w:r>
               <w:rPr>
@@ -10153,7 +9818,6 @@
           <w:p>
             <w:pPr>
               <w:pStyle w:val="Compact"/>
-              <w:jc w:val="left"/>
             </w:pPr>
             <w:r>
               <w:t xml:space="preserve">The programs the mode's file starts ("menubar", "dock", "notifyd"...</w:t>
@@ -10165,7 +9829,6 @@
           <w:p>
             <w:pPr>
               <w:pStyle w:val="Compact"/>
-              <w:jc w:val="left"/>
             </w:pPr>
             <w:r>
               <w:rPr>
@@ -10182,7 +9845,6 @@
           <w:p>
             <w:pPr>
               <w:pStyle w:val="Compact"/>
-              <w:jc w:val="left"/>
             </w:pPr>
             <w:r>
               <w:rPr>
@@ -10197,7 +9859,6 @@
           <w:p>
             <w:pPr>
               <w:pStyle w:val="Compact"/>
-              <w:jc w:val="left"/>
             </w:pPr>
             <w:r>
               <w:t xml:space="preserve">The switch to mode m (/bin/session switch, started with the flags</w:t>
@@ -10209,7 +9870,6 @@
           <w:p>
             <w:pPr>
               <w:pStyle w:val="Compact"/>
-              <w:jc w:val="left"/>
             </w:pPr>
             <w:r>
               <w:rPr>
@@ -10226,7 +9886,6 @@
           <w:p>
             <w:pPr>
               <w:pStyle w:val="Compact"/>
-              <w:jc w:val="left"/>
             </w:pPr>
             <w:r>
               <w:rPr>
@@ -10241,7 +9900,6 @@
           <w:p>
             <w:pPr>
               <w:pStyle w:val="Compact"/>
-              <w:jc w:val="left"/>
             </w:pPr>
             <w:r>
               <w:t xml:space="preserve">... and waited for -&gt; SESSION_*</w:t>
@@ -10253,7 +9911,6 @@
           <w:p>
             <w:pPr>
               <w:pStyle w:val="Compact"/>
-              <w:jc w:val="left"/>
             </w:pPr>
             <w:r>
               <w:rPr>
@@ -10270,7 +9927,6 @@
           <w:p>
             <w:pPr>
               <w:pStyle w:val="Compact"/>
-              <w:jc w:val="left"/>
             </w:pPr>
             <w:r>
               <w:rPr>
@@ -10285,7 +9941,6 @@
           <w:p>
             <w:pPr>
               <w:pStyle w:val="Compact"/>
-              <w:jc w:val="left"/>
             </w:pPr>
             <w:r>
               <w:t xml:space="preserve">After SESSION_WAITING_APPS</w:t>
@@ -10297,7 +9952,6 @@
           <w:p>
             <w:pPr>
               <w:pStyle w:val="Compact"/>
-              <w:jc w:val="left"/>
             </w:pPr>
             <w:r>
               <w:rPr>
@@ -10314,7 +9968,6 @@
           <w:p>
             <w:pPr>
               <w:pStyle w:val="Compact"/>
-              <w:jc w:val="left"/>
             </w:pPr>
             <w:r>
               <w:rPr>
@@ -10329,7 +9982,6 @@
           <w:p>
             <w:pPr>
               <w:pStyle w:val="Compact"/>
-              <w:jc w:val="left"/>
             </w:pPr>
             <w:r>
               <w:t xml:space="preserve">The autostart of a card from before the sessions split, once</w:t>
@@ -10341,7 +9993,6 @@
           <w:p>
             <w:pPr>
               <w:pStyle w:val="Compact"/>
-              <w:jc w:val="left"/>
             </w:pPr>
             <w:r>
               <w:rPr>
@@ -10360,8 +10011,8 @@
         </w:pict>
       </w:r>
     </w:p>
-    <w:bookmarkEnd w:id="24"/>
-    <w:bookmarkStart w:id="25" w:name="systemkitnotifyh"/>
+    <w:bookmarkEnd w:id="22"/>
+    <w:bookmarkStart w:id="23" w:name="systemkitnotifyh"/>
     <w:p>
       <w:pPr>
         <w:pStyle w:val="Heading2"/>
@@ -10782,8 +10433,8 @@
         <w:t xml:space="preserve">// a bubble with a title and a text, no action (notify_action) -&gt; 1 sent, 0 not</w:t>
       </w:r>
     </w:p>
-    <w:bookmarkEnd w:id="25"/>
-    <w:bookmarkStart w:id="31" w:name="systemkitclipboardh"/>
+    <w:bookmarkEnd w:id="23"/>
+    <w:bookmarkStart w:id="29" w:name="systemkitclipboardh"/>
     <w:p>
       <w:pPr>
         <w:pStyle w:val="Heading2"/>
@@ -10873,7 +10524,7 @@
         <w:t xml:space="preserve">A copy is also kept by the kernel's clipboard (one text or one path: v40), which is what is pasted when clipd cannot be reached (an older card, the PC's desktop simulator).</w:t>
       </w:r>
     </w:p>
-    <w:bookmarkStart w:id="26" w:name="the-service"/>
+    <w:bookmarkStart w:id="24" w:name="the-service"/>
     <w:p>
       <w:pPr>
         <w:pStyle w:val="Heading3"/>
@@ -10890,8 +10541,8 @@
         <w:t xml:space="preserve">clipd's pid; launched when it is not running (0: not there)</w:t>
       </w:r>
     </w:p>
-    <w:bookmarkEnd w:id="26"/>
-    <w:bookmarkStart w:id="27" w:name="copying"/>
+    <w:bookmarkEnd w:id="24"/>
+    <w:bookmarkStart w:id="25" w:name="copying"/>
     <w:p>
       <w:pPr>
         <w:pStyle w:val="Heading3"/>
@@ -11129,8 +10780,8 @@
         <w:t xml:space="preserve">);</w:t>
       </w:r>
     </w:p>
-    <w:bookmarkEnd w:id="27"/>
-    <w:bookmarkStart w:id="28" w:name="pasting"/>
+    <w:bookmarkEnd w:id="25"/>
+    <w:bookmarkStart w:id="26" w:name="pasting"/>
     <w:p>
       <w:pPr>
         <w:pStyle w:val="Heading3"/>
@@ -11398,8 +11049,8 @@
         <w:t xml:space="preserve">);</w:t>
       </w:r>
     </w:p>
-    <w:bookmarkEnd w:id="28"/>
-    <w:bookmarkStart w:id="29" w:name="text-and-paths-the-calls-every-app-had"/>
+    <w:bookmarkEnd w:id="26"/>
+    <w:bookmarkStart w:id="27" w:name="text-and-paths-the-calls-every-app-had"/>
     <w:p>
       <w:pPr>
         <w:pStyle w:val="Heading3"/>
@@ -11945,8 +11596,8 @@
         <w:t xml:space="preserve">);</w:t>
       </w:r>
     </w:p>
-    <w:bookmarkEnd w:id="29"/>
-    <w:bookmarkStart w:id="30" w:name="images"/>
+    <w:bookmarkEnd w:id="27"/>
+    <w:bookmarkStart w:id="28" w:name="images"/>
     <w:p>
       <w:pPr>
         <w:pStyle w:val="Heading3"/>
@@ -12185,9 +11836,9 @@
         <w:t xml:space="preserve">);</w:t>
       </w:r>
     </w:p>
-    <w:bookmarkEnd w:id="30"/>
-    <w:bookmarkEnd w:id="31"/>
-    <w:bookmarkStart w:id="33" w:name="systemkitclipprotoh"/>
+    <w:bookmarkEnd w:id="28"/>
+    <w:bookmarkEnd w:id="29"/>
+    <w:bookmarkStart w:id="31" w:name="systemkitclipprotoh"/>
     <w:p>
       <w:pPr>
         <w:pStyle w:val="Heading2"/>
@@ -13300,7 +12951,7 @@
         <w:t xml:space="preserve">};</w:t>
       </w:r>
     </w:p>
-    <w:bookmarkStart w:id="32" w:name="the-container"/>
+    <w:bookmarkStart w:id="30" w:name="the-container"/>
     <w:p>
       <w:pPr>
         <w:pStyle w:val="Heading3"/>
@@ -14513,9 +14164,9 @@
         <w:t xml:space="preserve">);</w:t>
       </w:r>
     </w:p>
-    <w:bookmarkEnd w:id="32"/>
-    <w:bookmarkEnd w:id="33"/>
-    <w:bookmarkStart w:id="34" w:name="systemkittrashh"/>
+    <w:bookmarkEnd w:id="30"/>
+    <w:bookmarkEnd w:id="31"/>
+    <w:bookmarkStart w:id="32" w:name="systemkittrashh"/>
     <w:p>
       <w:pPr>
         <w:pStyle w:val="Heading2"/>
@@ -15264,8 +14915,8 @@
         <w:t xml:space="preserve">);</w:t>
       </w:r>
     </w:p>
-    <w:bookmarkEnd w:id="34"/>
-    <w:bookmarkStart w:id="35" w:name="systemkitfileassoch"/>
+    <w:bookmarkEnd w:id="32"/>
+    <w:bookmarkStart w:id="33" w:name="systemkitfileassoch"/>
     <w:p>
       <w:pPr>
         <w:pStyle w:val="Heading2"/>
@@ -15686,8 +15337,8 @@
         <w:t xml:space="preserve">);</w:t>
       </w:r>
     </w:p>
-    <w:bookmarkEnd w:id="35"/>
-    <w:bookmarkStart w:id="37" w:name="systemkitvolumeh"/>
+    <w:bookmarkEnd w:id="33"/>
+    <w:bookmarkStart w:id="35" w:name="systemkitvolumeh"/>
     <w:p>
       <w:pPr>
         <w:pStyle w:val="Heading2"/>
@@ -15909,7 +15560,7 @@
         <w:t xml:space="preserve">);</w:t>
       </w:r>
     </w:p>
-    <w:bookmarkStart w:id="36" w:name="the-mixer-kapi-v85-a-programs-own-volume"/>
+    <w:bookmarkStart w:id="34" w:name="the-mixer-kapi-v85-a-programs-own-volume"/>
     <w:p>
       <w:pPr>
         <w:pStyle w:val="Heading3"/>
@@ -16107,9 +15758,9 @@
         <w:t xml:space="preserve">);</w:t>
       </w:r>
     </w:p>
-    <w:bookmarkEnd w:id="36"/>
-    <w:bookmarkEnd w:id="37"/>
-    <w:bookmarkStart w:id="40" w:name="systemkitwallpaperh"/>
+    <w:bookmarkEnd w:id="34"/>
+    <w:bookmarkEnd w:id="35"/>
+    <w:bookmarkStart w:id="38" w:name="systemkitwallpaperh"/>
     <w:p>
       <w:pPr>
         <w:pStyle w:val="Heading2"/>
@@ -17849,7 +17500,7 @@
         <w:t xml:space="preserve">);</w:t>
       </w:r>
     </w:p>
-    <w:bookmarkStart w:id="38" w:name="the-painter"/>
+    <w:bookmarkStart w:id="36" w:name="the-painter"/>
     <w:p>
       <w:pPr>
         <w:pStyle w:val="Heading3"/>
@@ -19452,8 +19103,8 @@
         <w:t xml:space="preserve">));</w:t>
       </w:r>
     </w:p>
-    <w:bookmarkEnd w:id="38"/>
-    <w:bookmarkStart w:id="39" w:name="Xb6016473025c6c273b8c5fb14e8dd998e45d901"/>
+    <w:bookmarkEnd w:id="36"/>
+    <w:bookmarkStart w:id="37" w:name="Xb6016473025c6c273b8c5fb14e8dd998e45d901"/>
     <w:p>
       <w:pPr>
         <w:pStyle w:val="Heading3"/>
@@ -20190,9 +19841,9 @@
         <w:t xml:space="preserve">);</w:t>
       </w:r>
     </w:p>
-    <w:bookmarkEnd w:id="39"/>
-    <w:bookmarkEnd w:id="40"/>
-    <w:bookmarkStart w:id="42" w:name="systemkitdockconfh"/>
+    <w:bookmarkEnd w:id="37"/>
+    <w:bookmarkEnd w:id="38"/>
+    <w:bookmarkStart w:id="40" w:name="systemkitdockconfh"/>
     <w:p>
       <w:pPr>
         <w:pStyle w:val="Heading2"/>
@@ -21463,7 +21114,7 @@
         <w:t xml:space="preserve">);</w:t>
       </w:r>
     </w:p>
-    <w:bookmarkStart w:id="41" w:name="X57d4995133c680abdabe9c1ce9d1d4aa51d942d"/>
+    <w:bookmarkStart w:id="39" w:name="X57d4995133c680abdabe9c1ce9d1d4aa51d942d"/>
     <w:p>
       <w:pPr>
         <w:pStyle w:val="Heading3"/>
@@ -22215,9 +21866,9 @@
         <w:t xml:space="preserve">);</w:t>
       </w:r>
     </w:p>
-    <w:bookmarkEnd w:id="41"/>
-    <w:bookmarkEnd w:id="42"/>
-    <w:bookmarkStart w:id="43" w:name="systemkitpreloadinih"/>
+    <w:bookmarkEnd w:id="39"/>
+    <w:bookmarkEnd w:id="40"/>
+    <w:bookmarkStart w:id="41" w:name="systemkitpreloadinih"/>
     <w:p>
       <w:pPr>
         <w:pStyle w:val="Heading2"/>
@@ -22552,8 +22203,8 @@
         <w:t xml:space="preserve">);</w:t>
       </w:r>
     </w:p>
-    <w:bookmarkEnd w:id="43"/>
-    <w:bookmarkStart w:id="44" w:name="systemkitautostarth"/>
+    <w:bookmarkEnd w:id="41"/>
+    <w:bookmarkStart w:id="42" w:name="systemkitautostarth"/>
     <w:p>
       <w:pPr>
         <w:pStyle w:val="Heading2"/>
@@ -23047,8 +22698,8 @@
         <w:t xml:space="preserve">);</w:t>
       </w:r>
     </w:p>
-    <w:bookmarkEnd w:id="44"/>
-    <w:bookmarkStart w:id="47" w:name="systemkitlocaleh"/>
+    <w:bookmarkEnd w:id="42"/>
+    <w:bookmarkStart w:id="45" w:name="systemkitlocaleh"/>
     <w:p>
       <w:pPr>
         <w:pStyle w:val="Heading2"/>
@@ -23392,7 +23043,7 @@
         <w:t xml:space="preserve">);</w:t>
       </w:r>
     </w:p>
-    <w:bookmarkStart w:id="45" w:name="the-languages-onyx-speaks"/>
+    <w:bookmarkStart w:id="43" w:name="the-languages-onyx-speaks"/>
     <w:p>
       <w:pPr>
         <w:pStyle w:val="Heading3"/>
@@ -23773,8 +23424,8 @@
         <w:t xml:space="preserve">// kept in system.ini -&gt; 1 written (the programs started next take it)</w:t>
       </w:r>
     </w:p>
-    <w:bookmarkEnd w:id="45"/>
-    <w:bookmarkStart w:id="46" w:name="the-time-zones"/>
+    <w:bookmarkEnd w:id="43"/>
+    <w:bookmarkStart w:id="44" w:name="the-time-zones"/>
     <w:p>
       <w:pPr>
         <w:pStyle w:val="Heading3"/>
@@ -24330,9 +23981,9 @@
         <w:t xml:space="preserve">);</w:t>
       </w:r>
     </w:p>
-    <w:bookmarkEnd w:id="46"/>
-    <w:bookmarkEnd w:id="47"/>
-    <w:bookmarkStart w:id="48" w:name="systemkitsessionh"/>
+    <w:bookmarkEnd w:id="44"/>
+    <w:bookmarkEnd w:id="45"/>
+    <w:bookmarkStart w:id="46" w:name="systemkitsessionh"/>
     <w:p>
       <w:pPr>
         <w:pStyle w:val="Heading2"/>
@@ -25708,8 +25359,8 @@
         <w:t xml:space="preserve">);</w:t>
       </w:r>
     </w:p>
-    <w:bookmarkEnd w:id="48"/>
-    <w:bookmarkStart w:id="49" w:name="systemkitapplet_protoh"/>
+    <w:bookmarkEnd w:id="46"/>
+    <w:bookmarkStart w:id="47" w:name="systemkitapplet_protoh"/>
     <w:p>
       <w:pPr>
         <w:pStyle w:val="Heading2"/>
@@ -26347,7 +25998,7 @@
         <w:t xml:space="preserve">};</w:t>
       </w:r>
     </w:p>
-    <w:bookmarkEnd w:id="49"/>
+    <w:bookmarkEnd w:id="47"/>
     <w:sectPr>
       <w:footerReference r:id="rId9" w:type="default"/>
       <w:footnotePr>
@@ -26429,14 +26080,14 @@
 <file path=word/numbering.xml><?xml version="1.0" encoding="utf-8"?>
 <w:numbering xmlns:w="http://schemas.openxmlformats.org/wordprocessingml/2006/main">
   <w:abstractNum w:abstractNumId="990">
-    <w:nsid w:val="A990"/>
+    <w:nsid w:val="0000A990"/>
     <w:multiLevelType w:val="multilevel"/>
     <w:lvl w:ilvl="0">
       <w:numFmt w:val="bullet"/>
       <w:lvlText w:val=" "/>
       <w:lvlJc w:val="left"/>
       <w:pPr>
-        <w:ind w:left="720" w:hanging="480"/>
+        <w:ind w:left="720" w:hanging="360"/>
       </w:pPr>
     </w:lvl>
     <w:lvl w:ilvl="1">
@@ -26444,7 +26095,7 @@
       <w:lvlText w:val=" "/>
       <w:lvlJc w:val="left"/>
       <w:pPr>
-        <w:ind w:left="1440" w:hanging="480"/>
+        <w:ind w:left="1440" w:hanging="360"/>
       </w:pPr>
     </w:lvl>
     <w:lvl w:ilvl="2">
@@ -26452,7 +26103,7 @@
       <w:lvlText w:val=" "/>
       <w:lvlJc w:val="left"/>
       <w:pPr>
-        <w:ind w:left="2160" w:hanging="480"/>
+        <w:ind w:left="2160" w:hanging="360"/>
       </w:pPr>
     </w:lvl>
     <w:lvl w:ilvl="3">
@@ -26460,7 +26111,7 @@
       <w:lvlText w:val=" "/>
       <w:lvlJc w:val="left"/>
       <w:pPr>
-        <w:ind w:left="2880" w:hanging="480"/>
+        <w:ind w:left="2880" w:hanging="360"/>
       </w:pPr>
     </w:lvl>
     <w:lvl w:ilvl="4">
@@ -26468,7 +26119,7 @@
       <w:lvlText w:val=" "/>
       <w:lvlJc w:val="left"/>
       <w:pPr>
-        <w:ind w:left="3600" w:hanging="480"/>
+        <w:ind w:left="3600" w:hanging="360"/>
       </w:pPr>
     </w:lvl>
     <w:lvl w:ilvl="5">
@@ -26476,7 +26127,7 @@
       <w:lvlText w:val=" "/>
       <w:lvlJc w:val="left"/>
       <w:pPr>
-        <w:ind w:left="4320" w:hanging="480"/>
+        <w:ind w:left="4320" w:hanging="360"/>
       </w:pPr>
     </w:lvl>
     <w:lvl w:ilvl="6">
@@ -26484,7 +26135,7 @@
       <w:lvlText w:val=" "/>
       <w:lvlJc w:val="left"/>
       <w:pPr>
-        <w:ind w:left="5040" w:hanging="480"/>
+        <w:ind w:left="5040" w:hanging="360"/>
       </w:pPr>
     </w:lvl>
     <w:lvl w:ilvl="7">
@@ -26492,7 +26143,7 @@
       <w:lvlText w:val=" "/>
       <w:lvlJc w:val="left"/>
       <w:pPr>
-        <w:ind w:left="5760" w:hanging="480"/>
+        <w:ind w:left="5760" w:hanging="360"/>
       </w:pPr>
     </w:lvl>
     <w:lvl w:ilvl="8">
@@ -26500,12 +26151,12 @@
       <w:lvlText w:val=" "/>
       <w:lvlJc w:val="left"/>
       <w:pPr>
-        <w:ind w:left="6480" w:hanging="480"/>
+        <w:ind w:left="6480" w:hanging="360"/>
       </w:pPr>
     </w:lvl>
   </w:abstractNum>
   <w:abstractNum w:abstractNumId="99411">
-    <w:nsid w:val="A99411"/>
+    <w:nsid w:val="00A99411"/>
     <w:multiLevelType w:val="multilevel"/>
     <w:lvl w:ilvl="0">
       <w:start w:val="1"/>
@@ -26513,7 +26164,7 @@
       <w:lvlText w:val="%1."/>
       <w:lvlJc w:val="left"/>
       <w:pPr>
-        <w:ind w:left="720" w:hanging="480"/>
+        <w:ind w:left="720" w:hanging="360"/>
       </w:pPr>
     </w:lvl>
     <w:lvl w:ilvl="1">
@@ -26522,7 +26173,7 @@
       <w:lvlText w:val="%2."/>
       <w:lvlJc w:val="left"/>
       <w:pPr>
-        <w:ind w:left="1440" w:hanging="480"/>
+        <w:ind w:left="1440" w:hanging="360"/>
       </w:pPr>
     </w:lvl>
     <w:lvl w:ilvl="2">
@@ -26531,7 +26182,7 @@
       <w:lvlText w:val="%3."/>
       <w:lvlJc w:val="left"/>
       <w:pPr>
-        <w:ind w:left="2160" w:hanging="480"/>
+        <w:ind w:left="2160" w:hanging="360"/>
       </w:pPr>
     </w:lvl>
     <w:lvl w:ilvl="3">
@@ -26540,7 +26191,7 @@
       <w:lvlText w:val="%4."/>
       <w:lvlJc w:val="left"/>
       <w:pPr>
-        <w:ind w:left="2880" w:hanging="480"/>
+        <w:ind w:left="2880" w:hanging="360"/>
       </w:pPr>
     </w:lvl>
     <w:lvl w:ilvl="4">
@@ -26549,7 +26200,7 @@
       <w:lvlText w:val="%5."/>
       <w:lvlJc w:val="left"/>
       <w:pPr>
-        <w:ind w:left="3600" w:hanging="480"/>
+        <w:ind w:left="3600" w:hanging="360"/>
       </w:pPr>
     </w:lvl>
     <w:lvl w:ilvl="5">
@@ -26558,7 +26209,7 @@
       <w:lvlText w:val="%6."/>
       <w:lvlJc w:val="left"/>
       <w:pPr>
-        <w:ind w:left="4320" w:hanging="480"/>
+        <w:ind w:left="4320" w:hanging="360"/>
       </w:pPr>
     </w:lvl>
     <w:lvl w:ilvl="6">
@@ -26567,7 +26218,7 @@
       <w:lvlText w:val="%7."/>
       <w:lvlJc w:val="left"/>
       <w:pPr>
-        <w:ind w:left="5040" w:hanging="480"/>
+        <w:ind w:left="5040" w:hanging="360"/>
       </w:pPr>
     </w:lvl>
     <w:lvl w:ilvl="7">
@@ -26576,7 +26227,7 @@
       <w:lvlText w:val="%8."/>
       <w:lvlJc w:val="left"/>
       <w:pPr>
-        <w:ind w:left="5760" w:hanging="480"/>
+        <w:ind w:left="5760" w:hanging="360"/>
       </w:pPr>
     </w:lvl>
     <w:lvl w:ilvl="8">
@@ -26585,7 +26236,7 @@
       <w:lvlText w:val="%9."/>
       <w:lvlJc w:val="left"/>
       <w:pPr>
-        <w:ind w:left="6480" w:hanging="480"/>
+        <w:ind w:left="6480" w:hanging="360"/>
       </w:pPr>
     </w:lvl>
   </w:abstractNum>
@@ -27323,8 +26974,8 @@
     <w:name w:val="KeywordTok"/>
     <w:basedOn w:val="VerbatimChar"/>
     <w:rPr>
+      <w:b/>
       <w:color w:val="007020"/>
-      <w:b/>
     </w:rPr>
   </w:style>
   <w:style w:type="character" w:customStyle="1" w:styleId="DataTypeTok">
@@ -27401,42 +27052,42 @@
     <w:name w:val="ImportTok"/>
     <w:basedOn w:val="VerbatimChar"/>
     <w:rPr>
+      <w:b/>
       <w:color w:val="008000"/>
-      <w:b/>
     </w:rPr>
   </w:style>
   <w:style w:type="character" w:customStyle="1" w:styleId="CommentTok">
     <w:name w:val="CommentTok"/>
     <w:basedOn w:val="VerbatimChar"/>
     <w:rPr>
+      <w:i/>
       <w:color w:val="60a0b0"/>
-      <w:i/>
     </w:rPr>
   </w:style>
   <w:style w:type="character" w:customStyle="1" w:styleId="DocumentationTok">
     <w:name w:val="DocumentationTok"/>
     <w:basedOn w:val="VerbatimChar"/>
     <w:rPr>
+      <w:i/>
       <w:color w:val="ba2121"/>
-      <w:i/>
     </w:rPr>
   </w:style>
   <w:style w:type="character" w:customStyle="1" w:styleId="AnnotationTok">
     <w:name w:val="AnnotationTok"/>
     <w:basedOn w:val="VerbatimChar"/>
     <w:rPr>
-      <w:color w:val="60a0b0"/>
       <w:b/>
       <w:i/>
+      <w:color w:val="60a0b0"/>
     </w:rPr>
   </w:style>
   <w:style w:type="character" w:customStyle="1" w:styleId="CommentVarTok">
     <w:name w:val="CommentVarTok"/>
     <w:basedOn w:val="VerbatimChar"/>
     <w:rPr>
-      <w:color w:val="60a0b0"/>
       <w:b/>
       <w:i/>
+      <w:color w:val="60a0b0"/>
     </w:rPr>
   </w:style>
   <w:style w:type="character" w:customStyle="1" w:styleId="OtherTok">
@@ -27464,8 +27115,8 @@
     <w:name w:val="ControlFlowTok"/>
     <w:basedOn w:val="VerbatimChar"/>
     <w:rPr>
+      <w:b/>
       <w:color w:val="007020"/>
-      <w:b/>
     </w:rPr>
   </w:style>
   <w:style w:type="character" w:customStyle="1" w:styleId="OperatorTok">
@@ -27510,34 +27161,34 @@
     <w:name w:val="InformationTok"/>
     <w:basedOn w:val="VerbatimChar"/>
     <w:rPr>
-      <w:color w:val="60a0b0"/>
       <w:b/>
       <w:i/>
+      <w:color w:val="60a0b0"/>
     </w:rPr>
   </w:style>
   <w:style w:type="character" w:customStyle="1" w:styleId="WarningTok">
     <w:name w:val="WarningTok"/>
     <w:basedOn w:val="VerbatimChar"/>
     <w:rPr>
-      <w:color w:val="60a0b0"/>
       <w:b/>
       <w:i/>
+      <w:color w:val="60a0b0"/>
     </w:rPr>
   </w:style>
   <w:style w:type="character" w:customStyle="1" w:styleId="AlertTok">
     <w:name w:val="AlertTok"/>
     <w:basedOn w:val="VerbatimChar"/>
     <w:rPr>
+      <w:b/>
       <w:color w:val="ff0000"/>
-      <w:b/>
     </w:rPr>
   </w:style>
   <w:style w:type="character" w:customStyle="1" w:styleId="ErrorTok">
     <w:name w:val="ErrorTok"/>
     <w:basedOn w:val="VerbatimChar"/>
     <w:rPr>
+      <w:b/>
       <w:color w:val="ff0000"/>
-      <w:b/>
     </w:rPr>
   </w:style>
   <w:style w:type="character" w:customStyle="1" w:styleId="NormalTok">

</xml_diff>

<commit_message>
docs: exports regenerated (3DForge for Windows)
Co-Authored-By: Claude Opus 5.5 <noreply@anthropic.com>
</commit_message>
<xml_diff>
--- a/docs/exports/12-SYSTEMKIT.docx
+++ b/docs/exports/12-SYSTEMKIT.docx
@@ -24,133 +24,133 @@
       </w:pPr>
       <w:r>
         <w:rPr>
+          <w:i/>
           <w:iCs/>
+        </w:rPr>
+        <w:t xml:space="preserve">The reference of</w:t>
+      </w:r>
+      <w:r>
+        <w:rPr>
           <w:i/>
-        </w:rPr>
-        <w:t xml:space="preserve">The reference of</w:t>
-      </w:r>
-      <w:r>
-        <w:rPr>
           <w:iCs/>
+        </w:rPr>
+        <w:t xml:space="preserve"> </w:t>
+      </w:r>
+      <w:r>
+        <w:rPr>
+          <w:b/>
+          <w:bCs/>
           <w:i/>
-        </w:rPr>
-        <w:t xml:space="preserve"> </w:t>
-      </w:r>
-      <w:r>
-        <w:rPr>
-          <w:bCs/>
-          <w:b/>
           <w:iCs/>
+        </w:rPr>
+        <w:t xml:space="preserve">SystemKit</w:t>
+      </w:r>
+      <w:r>
+        <w:rPr>
           <w:i/>
-        </w:rPr>
-        <w:t xml:space="preserve">SystemKit</w:t>
-      </w:r>
-      <w:r>
-        <w:rPr>
           <w:iCs/>
+        </w:rPr>
+        <w:t xml:space="preserve"> </w:t>
+      </w:r>
+      <w:r>
+        <w:rPr>
           <w:i/>
-        </w:rPr>
-        <w:t xml:space="preserve"> </w:t>
-      </w:r>
-      <w:r>
-        <w:rPr>
           <w:iCs/>
+        </w:rPr>
+        <w:t xml:space="preserve">(</w:t>
+      </w:r>
+      <w:r>
+        <w:rPr>
+          <w:rStyle w:val="VerbatimChar"/>
           <w:i/>
-        </w:rPr>
-        <w:t xml:space="preserve">(</w:t>
+          <w:iCs/>
+        </w:rPr>
+        <w:t xml:space="preserve">SD:/lib/systemkit.so</w:t>
+      </w:r>
+      <w:r>
+        <w:rPr>
+          <w:i/>
+          <w:iCs/>
+        </w:rPr>
+        <w:t xml:space="preserve">,</w:t>
+      </w:r>
+      <w:r>
+        <w:rPr>
+          <w:i/>
+          <w:iCs/>
+        </w:rPr>
+        <w:t xml:space="preserve"> </w:t>
       </w:r>
       <w:r>
         <w:rPr>
           <w:rStyle w:val="VerbatimChar"/>
+          <w:i/>
           <w:iCs/>
+        </w:rPr>
+        <w:t xml:space="preserve">user/Kits/systemkit</w:t>
+      </w:r>
+      <w:r>
+        <w:rPr>
           <w:i/>
-        </w:rPr>
-        <w:t xml:space="preserve">SD:/lib/systemkit.so</w:t>
-      </w:r>
-      <w:r>
-        <w:rPr>
           <w:iCs/>
+        </w:rPr>
+        <w:t xml:space="preserve">): what it is for, how a program uses it, and every operation it exposes. The operations' part is made from the kit's headers by</w:t>
+      </w:r>
+      <w:r>
+        <w:rPr>
           <w:i/>
-        </w:rPr>
-        <w:t xml:space="preserve">,</w:t>
-      </w:r>
-      <w:r>
-        <w:rPr>
           <w:iCs/>
+        </w:rPr>
+        <w:t xml:space="preserve"> </w:t>
+      </w:r>
+      <w:r>
+        <w:rPr>
+          <w:rStyle w:val="VerbatimChar"/>
           <w:i/>
-        </w:rPr>
-        <w:t xml:space="preserve"> </w:t>
-      </w:r>
-      <w:r>
-        <w:rPr>
-          <w:rStyle w:val="VerbatimChar"/>
           <w:iCs/>
+        </w:rPr>
+        <w:t xml:space="preserve">tools/docgen/kitdocs.py</w:t>
+      </w:r>
+      <w:r>
+        <w:rPr>
           <w:i/>
-        </w:rPr>
-        <w:t xml:space="preserve">user/Kits/systemkit</w:t>
-      </w:r>
-      <w:r>
-        <w:rPr>
           <w:iCs/>
+        </w:rPr>
+        <w:t xml:space="preserve"> </w:t>
+      </w:r>
+      <w:r>
+        <w:rPr>
           <w:i/>
-        </w:rPr>
-        <w:t xml:space="preserve">): what it is for, how a program uses it, and every operation it exposes. The operations' part is made from the kit's headers by</w:t>
-      </w:r>
-      <w:r>
-        <w:rPr>
           <w:iCs/>
+        </w:rPr>
+        <w:t xml:space="preserve">— the headers are the source. Overview of all the kits:</w:t>
+      </w:r>
+      <w:r>
+        <w:rPr>
           <w:i/>
-        </w:rPr>
-        <w:t xml:space="preserve"> </w:t>
-      </w:r>
-      <w:r>
-        <w:rPr>
-          <w:rStyle w:val="VerbatimChar"/>
           <w:iCs/>
-          <w:i/>
-        </w:rPr>
-        <w:t xml:space="preserve">tools/docgen/kitdocs.py</w:t>
-      </w:r>
-      <w:r>
-        <w:rPr>
-          <w:iCs/>
-          <w:i/>
-        </w:rPr>
-        <w:t xml:space="preserve"> </w:t>
-      </w:r>
-      <w:r>
-        <w:rPr>
-          <w:iCs/>
-          <w:i/>
-        </w:rPr>
-        <w:t xml:space="preserve">— the headers are the source. Overview of all the kits:</w:t>
-      </w:r>
-      <w:r>
-        <w:rPr>
-          <w:iCs/>
-          <w:i/>
-        </w:rPr>
-        <w:t xml:space="preserve"> </w:t>
-      </w:r>
-      <w:hyperlink r:id="rId20">
+        </w:rPr>
+        <w:t xml:space="preserve"> </w:t>
+      </w:r>
+      <w:hyperlink r:id="rId18">
         <w:r>
           <w:rPr>
             <w:rStyle w:val="Hyperlink"/>
+            <w:i/>
             <w:iCs/>
-            <w:i/>
           </w:rPr>
           <w:t xml:space="preserve">The Kits</w:t>
         </w:r>
       </w:hyperlink>
       <w:r>
         <w:rPr>
+          <w:i/>
           <w:iCs/>
-          <w:i/>
         </w:rPr>
         <w:t xml:space="preserve">.</w:t>
       </w:r>
     </w:p>
-    <w:bookmarkStart w:id="21" w:name="contents"/>
+    <w:bookmarkStart w:id="19" w:name="contents"/>
     <w:p>
       <w:pPr>
         <w:pStyle w:val="Heading2"/>
@@ -161,11 +161,11 @@
     </w:p>
     <w:p>
       <w:pPr>
+        <w:pStyle w:val="Compact"/>
         <w:numPr>
           <w:ilvl w:val="0"/>
           <w:numId w:val="1001"/>
         </w:numPr>
-        <w:pStyle w:val="Compact"/>
       </w:pPr>
       <w:hyperlink w:anchor="what-it-is">
         <w:r>
@@ -178,11 +178,11 @@
     </w:p>
     <w:p>
       <w:pPr>
+        <w:pStyle w:val="Compact"/>
         <w:numPr>
           <w:ilvl w:val="0"/>
           <w:numId w:val="1001"/>
         </w:numPr>
-        <w:pStyle w:val="Compact"/>
       </w:pPr>
       <w:hyperlink w:anchor="using-it">
         <w:r>
@@ -195,11 +195,11 @@
     </w:p>
     <w:p>
       <w:pPr>
+        <w:pStyle w:val="Compact"/>
         <w:numPr>
           <w:ilvl w:val="0"/>
           <w:numId w:val="1001"/>
         </w:numPr>
-        <w:pStyle w:val="Compact"/>
       </w:pPr>
       <w:hyperlink w:anchor="index">
         <w:r>
@@ -212,11 +212,11 @@
     </w:p>
     <w:p>
       <w:pPr>
+        <w:pStyle w:val="Compact"/>
         <w:numPr>
           <w:ilvl w:val="0"/>
           <w:numId w:val="1001"/>
         </w:numPr>
-        <w:pStyle w:val="Compact"/>
       </w:pPr>
       <w:hyperlink w:anchor="systemkitnotifyh">
         <w:r>
@@ -229,11 +229,11 @@
     </w:p>
     <w:p>
       <w:pPr>
+        <w:pStyle w:val="Compact"/>
         <w:numPr>
           <w:ilvl w:val="0"/>
           <w:numId w:val="1001"/>
         </w:numPr>
-        <w:pStyle w:val="Compact"/>
       </w:pPr>
       <w:hyperlink w:anchor="systemkitclipboardh">
         <w:r>
@@ -246,11 +246,11 @@
     </w:p>
     <w:p>
       <w:pPr>
+        <w:pStyle w:val="Compact"/>
         <w:numPr>
           <w:ilvl w:val="0"/>
           <w:numId w:val="1001"/>
         </w:numPr>
-        <w:pStyle w:val="Compact"/>
       </w:pPr>
       <w:hyperlink w:anchor="systemkitclipprotoh">
         <w:r>
@@ -263,11 +263,11 @@
     </w:p>
     <w:p>
       <w:pPr>
+        <w:pStyle w:val="Compact"/>
         <w:numPr>
           <w:ilvl w:val="0"/>
           <w:numId w:val="1001"/>
         </w:numPr>
-        <w:pStyle w:val="Compact"/>
       </w:pPr>
       <w:hyperlink w:anchor="systemkittrashh">
         <w:r>
@@ -280,11 +280,11 @@
     </w:p>
     <w:p>
       <w:pPr>
+        <w:pStyle w:val="Compact"/>
         <w:numPr>
           <w:ilvl w:val="0"/>
           <w:numId w:val="1001"/>
         </w:numPr>
-        <w:pStyle w:val="Compact"/>
       </w:pPr>
       <w:hyperlink w:anchor="systemkitfileassoch">
         <w:r>
@@ -297,11 +297,11 @@
     </w:p>
     <w:p>
       <w:pPr>
+        <w:pStyle w:val="Compact"/>
         <w:numPr>
           <w:ilvl w:val="0"/>
           <w:numId w:val="1001"/>
         </w:numPr>
-        <w:pStyle w:val="Compact"/>
       </w:pPr>
       <w:hyperlink w:anchor="systemkitvolumeh">
         <w:r>
@@ -314,11 +314,11 @@
     </w:p>
     <w:p>
       <w:pPr>
+        <w:pStyle w:val="Compact"/>
         <w:numPr>
           <w:ilvl w:val="0"/>
           <w:numId w:val="1001"/>
         </w:numPr>
-        <w:pStyle w:val="Compact"/>
       </w:pPr>
       <w:hyperlink w:anchor="systemkitwallpaperh">
         <w:r>
@@ -331,11 +331,11 @@
     </w:p>
     <w:p>
       <w:pPr>
+        <w:pStyle w:val="Compact"/>
         <w:numPr>
           <w:ilvl w:val="0"/>
           <w:numId w:val="1001"/>
         </w:numPr>
-        <w:pStyle w:val="Compact"/>
       </w:pPr>
       <w:hyperlink w:anchor="systemkitdockconfh">
         <w:r>
@@ -348,11 +348,11 @@
     </w:p>
     <w:p>
       <w:pPr>
+        <w:pStyle w:val="Compact"/>
         <w:numPr>
           <w:ilvl w:val="0"/>
           <w:numId w:val="1001"/>
         </w:numPr>
-        <w:pStyle w:val="Compact"/>
       </w:pPr>
       <w:hyperlink w:anchor="systemkitpreloadinih">
         <w:r>
@@ -365,11 +365,11 @@
     </w:p>
     <w:p>
       <w:pPr>
+        <w:pStyle w:val="Compact"/>
         <w:numPr>
           <w:ilvl w:val="0"/>
           <w:numId w:val="1001"/>
         </w:numPr>
-        <w:pStyle w:val="Compact"/>
       </w:pPr>
       <w:hyperlink w:anchor="systemkitautostarth">
         <w:r>
@@ -382,11 +382,11 @@
     </w:p>
     <w:p>
       <w:pPr>
+        <w:pStyle w:val="Compact"/>
         <w:numPr>
           <w:ilvl w:val="0"/>
           <w:numId w:val="1001"/>
         </w:numPr>
-        <w:pStyle w:val="Compact"/>
       </w:pPr>
       <w:hyperlink w:anchor="systemkitlocaleh">
         <w:r>
@@ -399,11 +399,11 @@
     </w:p>
     <w:p>
       <w:pPr>
+        <w:pStyle w:val="Compact"/>
         <w:numPr>
           <w:ilvl w:val="0"/>
           <w:numId w:val="1001"/>
         </w:numPr>
-        <w:pStyle w:val="Compact"/>
       </w:pPr>
       <w:hyperlink w:anchor="systemkitsessionh">
         <w:r>
@@ -416,11 +416,11 @@
     </w:p>
     <w:p>
       <w:pPr>
+        <w:pStyle w:val="Compact"/>
         <w:numPr>
           <w:ilvl w:val="0"/>
           <w:numId w:val="1001"/>
         </w:numPr>
-        <w:pStyle w:val="Compact"/>
       </w:pPr>
       <w:hyperlink w:anchor="systemkitappletprotoh">
         <w:r>
@@ -438,8 +438,8 @@
         </w:pict>
       </w:r>
     </w:p>
-    <w:bookmarkEnd w:id="21"/>
-    <w:bookmarkStart w:id="22" w:name="what-it-is"/>
+    <w:bookmarkEnd w:id="19"/>
+    <w:bookmarkStart w:id="20" w:name="what-it-is"/>
     <w:p>
       <w:pPr>
         <w:pStyle w:val="Heading2"/>
@@ -461,7 +461,6 @@
         <w:tblStyle w:val="Table"/>
         <w:tblW w:type="auto" w:w="0"/>
         <w:tblLook w:firstRow="1" w:lastRow="0" w:firstColumn="0" w:lastColumn="0" w:noHBand="0" w:noVBand="0" w:val="0020"/>
-        <w:jc w:val="start"/>
       </w:tblPr>
       <w:tblGrid>
         <w:gridCol w:w="3960"/>
@@ -469,7 +468,7 @@
       </w:tblGrid>
       <w:tr>
         <w:trPr>
-          <w:tblHeader w:val="true"/>
+          <w:tblHeader w:val="on"/>
         </w:trPr>
         <w:tc>
           <w:tcPr/>
@@ -494,7 +493,6 @@
           <w:p>
             <w:pPr>
               <w:pStyle w:val="Compact"/>
-              <w:jc w:val="left"/>
             </w:pPr>
             <w:r>
               <w:t xml:space="preserve">Include</w:t>
@@ -506,7 +504,6 @@
           <w:p>
             <w:pPr>
               <w:pStyle w:val="Compact"/>
-              <w:jc w:val="left"/>
             </w:pPr>
             <w:r>
               <w:rPr>
@@ -523,7 +520,6 @@
           <w:p>
             <w:pPr>
               <w:pStyle w:val="Compact"/>
-              <w:jc w:val="left"/>
             </w:pPr>
             <w:r>
               <w:t xml:space="preserve">Link</w:t>
@@ -535,7 +531,6 @@
           <w:p>
             <w:pPr>
               <w:pStyle w:val="Compact"/>
-              <w:jc w:val="left"/>
             </w:pPr>
             <w:r>
               <w:rPr>
@@ -573,7 +568,6 @@
           <w:p>
             <w:pPr>
               <w:pStyle w:val="Compact"/>
-              <w:jc w:val="left"/>
             </w:pPr>
             <w:r>
               <w:t xml:space="preserve">Library</w:t>
@@ -585,7 +579,6 @@
           <w:p>
             <w:pPr>
               <w:pStyle w:val="Compact"/>
-              <w:jc w:val="left"/>
             </w:pPr>
             <w:r>
               <w:rPr>
@@ -617,7 +610,6 @@
           <w:p>
             <w:pPr>
               <w:pStyle w:val="Compact"/>
-              <w:jc w:val="left"/>
             </w:pPr>
             <w:r>
               <w:t xml:space="preserve">Sources</w:t>
@@ -629,7 +621,6 @@
           <w:p>
             <w:pPr>
               <w:pStyle w:val="Compact"/>
-              <w:jc w:val="left"/>
             </w:pPr>
             <w:r>
               <w:rPr>
@@ -641,8 +632,8 @@
         </w:tc>
       </w:tr>
     </w:tbl>
-    <w:bookmarkEnd w:id="22"/>
-    <w:bookmarkStart w:id="23" w:name="using-it"/>
+    <w:bookmarkEnd w:id="20"/>
+    <w:bookmarkStart w:id="21" w:name="using-it"/>
     <w:p>
       <w:pPr>
         <w:pStyle w:val="Heading2"/>
@@ -657,8 +648,8 @@
       </w:pPr>
       <w:r>
         <w:rPr>
+          <w:b/>
           <w:bCs/>
-          <w:b/>
         </w:rPr>
         <w:t xml:space="preserve">A notification</w:t>
       </w:r>
@@ -818,8 +809,8 @@
       </w:pPr>
       <w:r>
         <w:rPr>
+          <w:b/>
           <w:bCs/>
-          <w:b/>
         </w:rPr>
         <w:t xml:space="preserve">The clipboard</w:t>
       </w:r>
@@ -1255,8 +1246,8 @@
       </w:pPr>
       <w:r>
         <w:rPr>
+          <w:b/>
           <w:bCs/>
-          <w:b/>
         </w:rPr>
         <w:t xml:space="preserve">The trash</w:t>
       </w:r>
@@ -1425,8 +1416,8 @@
       </w:pPr>
       <w:r>
         <w:rPr>
+          <w:b/>
           <w:bCs/>
-          <w:b/>
         </w:rPr>
         <w:t xml:space="preserve">Opening a file with the right application</w:t>
       </w:r>
@@ -1652,8 +1643,8 @@
       </w:pPr>
       <w:r>
         <w:rPr>
+          <w:b/>
           <w:bCs/>
-          <w:b/>
         </w:rPr>
         <w:t xml:space="preserve">The volume, the wallpaper, the dock</w:t>
       </w:r>
@@ -1870,8 +1861,8 @@
       </w:pPr>
       <w:r>
         <w:rPr>
+          <w:b/>
           <w:bCs/>
-          <w:b/>
         </w:rPr>
         <w:t xml:space="preserve">Starting a program at every boot</w:t>
       </w:r>
@@ -2046,8 +2037,8 @@
       </w:pPr>
       <w:r>
         <w:rPr>
+          <w:b/>
           <w:bCs/>
-          <w:b/>
         </w:rPr>
         <w:t xml:space="preserve">The system's language</w:t>
       </w:r>
@@ -2399,8 +2390,8 @@
       </w:pPr>
       <w:r>
         <w:rPr>
+          <w:b/>
           <w:bCs/>
-          <w:b/>
         </w:rPr>
         <w:t xml:space="preserve">The time zones at an instant</w:t>
       </w:r>
@@ -2997,8 +2988,8 @@
       </w:pPr>
       <w:r>
         <w:rPr>
+          <w:b/>
           <w:bCs/>
-          <w:b/>
         </w:rPr>
         <w:t xml:space="preserve">The interface's mode and its session</w:t>
       </w:r>
@@ -3778,8 +3769,8 @@
       </w:pPr>
       <w:r>
         <w:rPr>
+          <w:b/>
           <w:bCs/>
-          <w:b/>
         </w:rPr>
         <w:t xml:space="preserve">The pocket shell</w:t>
       </w:r>
@@ -3906,8 +3897,8 @@
       </w:pPr>
       <w:r>
         <w:rPr>
+          <w:b/>
           <w:bCs/>
-          <w:b/>
         </w:rPr>
         <w:t xml:space="preserve">The documents opened last</w:t>
       </w:r>
@@ -4106,8 +4097,8 @@
       </w:pPr>
       <w:r>
         <w:rPr>
+          <w:b/>
           <w:bCs/>
-          <w:b/>
         </w:rPr>
         <w:t xml:space="preserve">The screen's resolution</w:t>
       </w:r>
@@ -4981,8 +4972,8 @@
       </w:pPr>
       <w:r>
         <w:rPr>
+          <w:b/>
           <w:bCs/>
-          <w:b/>
         </w:rPr>
         <w:t xml:space="preserve">The keyboard and the mouse</w:t>
       </w:r>
@@ -5321,7 +5312,6 @@
         <w:tblStyle w:val="Table"/>
         <w:tblW w:type="auto" w:w="0"/>
         <w:tblLook w:firstRow="1" w:lastRow="0" w:firstColumn="0" w:lastColumn="0" w:noHBand="0" w:noVBand="0" w:val="0020"/>
-        <w:jc w:val="start"/>
       </w:tblPr>
       <w:tblGrid>
         <w:gridCol w:w="3960"/>
@@ -5329,14 +5319,13 @@
       </w:tblGrid>
       <w:tr>
         <w:trPr>
-          <w:tblHeader w:val="true"/>
+          <w:tblHeader w:val="on"/>
         </w:trPr>
         <w:tc>
           <w:tcPr/>
           <w:p>
             <w:pPr>
               <w:pStyle w:val="Compact"/>
-              <w:jc w:val="left"/>
             </w:pPr>
             <w:r>
               <w:t xml:space="preserve">Its part (a header of its own, beside</w:t>
@@ -5360,7 +5349,6 @@
           <w:p>
             <w:pPr>
               <w:pStyle w:val="Compact"/>
-              <w:jc w:val="left"/>
             </w:pPr>
             <w:r>
               <w:t xml:space="preserve">Subject</w:t>
@@ -5374,7 +5362,6 @@
           <w:p>
             <w:pPr>
               <w:pStyle w:val="Compact"/>
-              <w:jc w:val="left"/>
             </w:pPr>
             <w:r>
               <w:rPr>
@@ -5389,7 +5376,6 @@
           <w:p>
             <w:pPr>
               <w:pStyle w:val="Compact"/>
-              <w:jc w:val="left"/>
             </w:pPr>
             <w:r>
               <w:t xml:space="preserve">Notifications</w:t>
@@ -5403,7 +5389,6 @@
           <w:p>
             <w:pPr>
               <w:pStyle w:val="Compact"/>
-              <w:jc w:val="left"/>
             </w:pPr>
             <w:r>
               <w:rPr>
@@ -5433,7 +5418,6 @@
           <w:p>
             <w:pPr>
               <w:pStyle w:val="Compact"/>
-              <w:jc w:val="left"/>
             </w:pPr>
             <w:r>
               <w:t xml:space="preserve">The clipboard</w:t>
@@ -5447,7 +5431,6 @@
           <w:p>
             <w:pPr>
               <w:pStyle w:val="Compact"/>
-              <w:jc w:val="left"/>
             </w:pPr>
             <w:r>
               <w:rPr>
@@ -5462,7 +5445,6 @@
           <w:p>
             <w:pPr>
               <w:pStyle w:val="Compact"/>
-              <w:jc w:val="left"/>
             </w:pPr>
             <w:r>
               <w:t xml:space="preserve">The trash</w:t>
@@ -5476,7 +5458,6 @@
           <w:p>
             <w:pPr>
               <w:pStyle w:val="Compact"/>
-              <w:jc w:val="left"/>
             </w:pPr>
             <w:r>
               <w:rPr>
@@ -5491,7 +5472,6 @@
           <w:p>
             <w:pPr>
               <w:pStyle w:val="Compact"/>
-              <w:jc w:val="left"/>
             </w:pPr>
             <w:r>
               <w:t xml:space="preserve">Which application opens which file</w:t>
@@ -5505,7 +5485,6 @@
           <w:p>
             <w:pPr>
               <w:pStyle w:val="Compact"/>
-              <w:jc w:val="left"/>
             </w:pPr>
             <w:r>
               <w:rPr>
@@ -5520,7 +5499,6 @@
           <w:p>
             <w:pPr>
               <w:pStyle w:val="Compact"/>
-              <w:jc w:val="left"/>
             </w:pPr>
             <w:r>
               <w:t xml:space="preserve">The master volume, the output, each program's volume</w:t>
@@ -5534,7 +5512,6 @@
           <w:p>
             <w:pPr>
               <w:pStyle w:val="Compact"/>
-              <w:jc w:val="left"/>
             </w:pPr>
             <w:r>
               <w:rPr>
@@ -5549,7 +5526,6 @@
           <w:p>
             <w:pPr>
               <w:pStyle w:val="Compact"/>
-              <w:jc w:val="left"/>
             </w:pPr>
             <w:r>
               <w:t xml:space="preserve">The wallpaper's settings and its painter</w:t>
@@ -5563,7 +5539,6 @@
           <w:p>
             <w:pPr>
               <w:pStyle w:val="Compact"/>
-              <w:jc w:val="left"/>
             </w:pPr>
             <w:r>
               <w:rPr>
@@ -5578,7 +5553,6 @@
           <w:p>
             <w:pPr>
               <w:pStyle w:val="Compact"/>
-              <w:jc w:val="left"/>
             </w:pPr>
             <w:r>
               <w:t xml:space="preserve">The dock's settings</w:t>
@@ -5592,7 +5566,6 @@
           <w:p>
             <w:pPr>
               <w:pStyle w:val="Compact"/>
-              <w:jc w:val="left"/>
             </w:pPr>
             <w:r>
               <w:rPr>
@@ -5607,7 +5580,6 @@
           <w:p>
             <w:pPr>
               <w:pStyle w:val="Compact"/>
-              <w:jc w:val="left"/>
             </w:pPr>
             <w:r>
               <w:t xml:space="preserve">The programs loaded ahead at boot</w:t>
@@ -5621,7 +5593,6 @@
           <w:p>
             <w:pPr>
               <w:pStyle w:val="Compact"/>
-              <w:jc w:val="left"/>
             </w:pPr>
             <w:r>
               <w:rPr>
@@ -5636,7 +5607,6 @@
           <w:p>
             <w:pPr>
               <w:pStyle w:val="Compact"/>
-              <w:jc w:val="left"/>
             </w:pPr>
             <w:r>
               <w:t xml:space="preserve">The programs started at boot (</w:t>
@@ -5662,7 +5632,6 @@
           <w:p>
             <w:pPr>
               <w:pStyle w:val="Compact"/>
-              <w:jc w:val="left"/>
             </w:pPr>
             <w:r>
               <w:rPr>
@@ -5677,7 +5646,6 @@
           <w:p>
             <w:pPr>
               <w:pStyle w:val="Compact"/>
-              <w:jc w:val="left"/>
             </w:pPr>
             <w:r>
               <w:t xml:space="preserve">A settings applet shown inside the Control Panel</w:t>
@@ -5691,7 +5659,6 @@
           <w:p>
             <w:pPr>
               <w:pStyle w:val="Compact"/>
-              <w:jc w:val="left"/>
             </w:pPr>
             <w:r>
               <w:rPr>
@@ -5706,7 +5673,6 @@
           <w:p>
             <w:pPr>
               <w:pStyle w:val="Compact"/>
-              <w:jc w:val="left"/>
             </w:pPr>
             <w:r>
               <w:t xml:space="preserve">The system's language and time zone (</w:t>
@@ -5729,7 +5695,6 @@
           <w:p>
             <w:pPr>
               <w:pStyle w:val="Compact"/>
-              <w:jc w:val="left"/>
             </w:pPr>
             <w:r>
               <w:rPr>
@@ -5744,7 +5709,6 @@
           <w:p>
             <w:pPr>
               <w:pStyle w:val="Compact"/>
-              <w:jc w:val="left"/>
             </w:pPr>
             <w:r>
               <w:t xml:space="preserve">The interface's mode (desktop, pocket, console) and its session:</w:t>
@@ -5770,7 +5734,6 @@
           <w:p>
             <w:pPr>
               <w:pStyle w:val="Compact"/>
-              <w:jc w:val="left"/>
             </w:pPr>
             <w:r>
               <w:rPr>
@@ -5785,7 +5748,6 @@
           <w:p>
             <w:pPr>
               <w:pStyle w:val="Compact"/>
-              <w:jc w:val="left"/>
             </w:pPr>
             <w:r>
               <w:t xml:space="preserve">The pocket shell's screens asked (</w:t>
@@ -5820,7 +5782,6 @@
           <w:p>
             <w:pPr>
               <w:pStyle w:val="Compact"/>
-              <w:jc w:val="left"/>
             </w:pPr>
             <w:r>
               <w:rPr>
@@ -5835,7 +5796,6 @@
           <w:p>
             <w:pPr>
               <w:pStyle w:val="Compact"/>
-              <w:jc w:val="left"/>
             </w:pPr>
             <w:r>
               <w:t xml:space="preserve">The documents opened last (</w:t>
@@ -5897,7 +5857,6 @@
           <w:p>
             <w:pPr>
               <w:pStyle w:val="Compact"/>
-              <w:jc w:val="left"/>
             </w:pPr>
             <w:r>
               <w:rPr>
@@ -5912,7 +5871,6 @@
           <w:p>
             <w:pPr>
               <w:pStyle w:val="Compact"/>
-              <w:jc w:val="left"/>
             </w:pPr>
             <w:r>
               <w:t xml:space="preserve">The screen's resolution: the sizes, the one kept (</w:t>
@@ -5944,7 +5902,6 @@
           <w:p>
             <w:pPr>
               <w:pStyle w:val="Compact"/>
-              <w:jc w:val="left"/>
             </w:pPr>
             <w:r>
               <w:rPr>
@@ -5959,7 +5916,6 @@
           <w:p>
             <w:pPr>
               <w:pStyle w:val="Compact"/>
-              <w:jc w:val="left"/>
             </w:pPr>
             <w:r>
               <w:t xml:space="preserve">The keyboard's layouts (</w:t>
@@ -5989,8 +5945,8 @@
         </w:tc>
       </w:tr>
     </w:tbl>
-    <w:bookmarkEnd w:id="23"/>
-    <w:bookmarkStart w:id="24" w:name="index"/>
+    <w:bookmarkEnd w:id="21"/>
+    <w:bookmarkStart w:id="22" w:name="index"/>
     <w:p>
       <w:pPr>
         <w:pStyle w:val="Heading2"/>
@@ -6012,7 +5968,6 @@
         <w:tblStyle w:val="Table"/>
         <w:tblW w:type="auto" w:w="0"/>
         <w:tblLook w:firstRow="1" w:lastRow="0" w:firstColumn="0" w:lastColumn="0" w:noHBand="0" w:noVBand="0" w:val="0020"/>
-        <w:jc w:val="start"/>
       </w:tblPr>
       <w:tblGrid>
         <w:gridCol w:w="2640"/>
@@ -6021,14 +5976,13 @@
       </w:tblGrid>
       <w:tr>
         <w:trPr>
-          <w:tblHeader w:val="true"/>
+          <w:tblHeader w:val="on"/>
         </w:trPr>
         <w:tc>
           <w:tcPr/>
           <w:p>
             <w:pPr>
               <w:pStyle w:val="Compact"/>
-              <w:jc w:val="left"/>
             </w:pPr>
             <w:r>
               <w:t xml:space="preserve">Name</w:t>
@@ -6040,7 +5994,6 @@
           <w:p>
             <w:pPr>
               <w:pStyle w:val="Compact"/>
-              <w:jc w:val="left"/>
             </w:pPr>
             <w:r>
               <w:t xml:space="preserve">What it does</w:t>
@@ -6052,7 +6005,6 @@
           <w:p>
             <w:pPr>
               <w:pStyle w:val="Compact"/>
-              <w:jc w:val="left"/>
             </w:pPr>
             <w:r>
               <w:t xml:space="preserve">Header</w:t>
@@ -6066,7 +6018,6 @@
           <w:p>
             <w:pPr>
               <w:pStyle w:val="Compact"/>
-              <w:jc w:val="left"/>
             </w:pPr>
             <w:r>
               <w:rPr>
@@ -6081,7 +6032,6 @@
           <w:p>
             <w:pPr>
               <w:pStyle w:val="Compact"/>
-              <w:jc w:val="left"/>
             </w:pPr>
             <w:r>
               <w:t xml:space="preserve">A bubble with a title and a text, sent to notifyd (started if it does not run, waited for up to 2 s)</w:t>
@@ -6093,7 +6043,6 @@
           <w:p>
             <w:pPr>
               <w:pStyle w:val="Compact"/>
-              <w:jc w:val="left"/>
             </w:pPr>
             <w:r>
               <w:rPr>
@@ -6110,7 +6059,6 @@
           <w:p>
             <w:pPr>
               <w:pStyle w:val="Compact"/>
-              <w:jc w:val="left"/>
             </w:pPr>
             <w:r>
               <w:rPr>
@@ -6125,7 +6073,6 @@
           <w:p>
             <w:pPr>
               <w:pStyle w:val="Compact"/>
-              <w:jc w:val="left"/>
             </w:pPr>
             <w:r>
               <w:t xml:space="preserve">a bubble with a title and a text, no action (notify_action) -&gt; 1 sent, 0 not</w:t>
@@ -6137,7 +6084,6 @@
           <w:p>
             <w:pPr>
               <w:pStyle w:val="Compact"/>
-              <w:jc w:val="left"/>
             </w:pPr>
             <w:r>
               <w:rPr>
@@ -6154,7 +6100,6 @@
           <w:p>
             <w:pPr>
               <w:pStyle w:val="Compact"/>
-              <w:jc w:val="left"/>
             </w:pPr>
             <w:r>
               <w:rPr>
@@ -6169,7 +6114,6 @@
           <w:p>
             <w:pPr>
               <w:pStyle w:val="Compact"/>
-              <w:jc w:val="left"/>
             </w:pPr>
             <w:r>
               <w:t xml:space="preserve">One copy, n representations (a format and its bytes each).</w:t>
@@ -6181,7 +6125,6 @@
           <w:p>
             <w:pPr>
               <w:pStyle w:val="Compact"/>
-              <w:jc w:val="left"/>
             </w:pPr>
             <w:r>
               <w:rPr>
@@ -6198,7 +6141,6 @@
           <w:p>
             <w:pPr>
               <w:pStyle w:val="Compact"/>
-              <w:jc w:val="left"/>
             </w:pPr>
             <w:r>
               <w:rPr>
@@ -6213,7 +6155,6 @@
           <w:p>
             <w:pPr>
               <w:pStyle w:val="Compact"/>
-              <w:jc w:val="left"/>
             </w:pPr>
             <w:r>
               <w:t xml:space="preserve">The item under the cursor in the first of fmt[] it has (else the newest item that has one of them)</w:t>
@@ -6225,7 +6166,6 @@
           <w:p>
             <w:pPr>
               <w:pStyle w:val="Compact"/>
-              <w:jc w:val="left"/>
             </w:pPr>
             <w:r>
               <w:rPr>
@@ -6242,7 +6182,6 @@
           <w:p>
             <w:pPr>
               <w:pStyle w:val="Compact"/>
-              <w:jc w:val="left"/>
             </w:pPr>
             <w:r>
               <w:rPr>
@@ -6257,7 +6196,6 @@
           <w:p>
             <w:pPr>
               <w:pStyle w:val="Compact"/>
-              <w:jc w:val="left"/>
             </w:pPr>
             <w:r>
               <w:t xml:space="preserve">copy the n bytes of s as text (a "text" item to clipd, and the kernel's clipboard)</w:t>
@@ -6269,7 +6207,6 @@
           <w:p>
             <w:pPr>
               <w:pStyle w:val="Compact"/>
-              <w:jc w:val="left"/>
             </w:pPr>
             <w:r>
               <w:rPr>
@@ -6286,7 +6223,6 @@
           <w:p>
             <w:pPr>
               <w:pStyle w:val="Compact"/>
-              <w:jc w:val="left"/>
             </w:pPr>
             <w:r>
               <w:rPr>
@@ -6301,7 +6237,6 @@
           <w:p>
             <w:pPr>
               <w:pStyle w:val="Compact"/>
-              <w:jc w:val="left"/>
             </w:pPr>
             <w:r>
               <w:t xml:space="preserve">copy the NUL-terminated string s as text (clip_set_text_n)</w:t>
@@ -6313,7 +6248,6 @@
           <w:p>
             <w:pPr>
               <w:pStyle w:val="Compact"/>
-              <w:jc w:val="left"/>
             </w:pPr>
             <w:r>
               <w:rPr>
@@ -6330,7 +6264,6 @@
           <w:p>
             <w:pPr>
               <w:pStyle w:val="Compact"/>
-              <w:jc w:val="left"/>
             </w:pPr>
             <w:r>
               <w:rPr>
@@ -6345,7 +6278,6 @@
           <w:p>
             <w:pPr>
               <w:pStyle w:val="Compact"/>
-              <w:jc w:val="left"/>
             </w:pPr>
             <w:r>
               <w:t xml:space="preserve">The clipboard's text into buf (NUL-terminated, truncated to cap-1) -&gt; its length</w:t>
@@ -6357,7 +6289,6 @@
           <w:p>
             <w:pPr>
               <w:pStyle w:val="Compact"/>
-              <w:jc w:val="left"/>
             </w:pPr>
             <w:r>
               <w:rPr>
@@ -6374,7 +6305,6 @@
           <w:p>
             <w:pPr>
               <w:pStyle w:val="Compact"/>
-              <w:jc w:val="left"/>
             </w:pPr>
             <w:r>
               <w:rPr>
@@ -6389,7 +6319,6 @@
           <w:p>
             <w:pPr>
               <w:pStyle w:val="Compact"/>
-              <w:jc w:val="left"/>
             </w:pPr>
             <w:r>
               <w:t xml:space="preserve">File / folder paths ('\n'-separated)</w:t>
@@ -6401,7 +6330,6 @@
           <w:p>
             <w:pPr>
               <w:pStyle w:val="Compact"/>
-              <w:jc w:val="left"/>
             </w:pPr>
             <w:r>
               <w:rPr>
@@ -6418,7 +6346,6 @@
           <w:p>
             <w:pPr>
               <w:pStyle w:val="Compact"/>
-              <w:jc w:val="left"/>
             </w:pPr>
             <w:r>
               <w:rPr>
@@ -6433,7 +6360,6 @@
           <w:p>
             <w:pPr>
               <w:pStyle w:val="Compact"/>
-              <w:jc w:val="left"/>
             </w:pPr>
             <w:r>
               <w:t xml:space="preserve">The first path into buf</w:t>
@@ -6445,7 +6371,6 @@
           <w:p>
             <w:pPr>
               <w:pStyle w:val="Compact"/>
-              <w:jc w:val="left"/>
             </w:pPr>
             <w:r>
               <w:rPr>
@@ -6462,7 +6387,6 @@
           <w:p>
             <w:pPr>
               <w:pStyle w:val="Compact"/>
-              <w:jc w:val="left"/>
             </w:pPr>
             <w:r>
               <w:rPr>
@@ -6477,7 +6401,6 @@
           <w:p>
             <w:pPr>
               <w:pStyle w:val="Compact"/>
-              <w:jc w:val="left"/>
             </w:pPr>
             <w:r>
               <w:t xml:space="preserve">After a cut + paste moved the files</w:t>
@@ -6489,7 +6412,6 @@
           <w:p>
             <w:pPr>
               <w:pStyle w:val="Compact"/>
-              <w:jc w:val="left"/>
             </w:pPr>
             <w:r>
               <w:rPr>
@@ -6506,7 +6428,6 @@
           <w:p>
             <w:pPr>
               <w:pStyle w:val="Compact"/>
-              <w:jc w:val="left"/>
             </w:pPr>
             <w:r>
               <w:rPr>
@@ -6521,7 +6442,6 @@
           <w:p>
             <w:pPr>
               <w:pStyle w:val="Compact"/>
-              <w:jc w:val="left"/>
             </w:pPr>
             <w:r>
               <w:t xml:space="preserve">w x h pixels 0x00RRGGBB (a row after the other)</w:t>
@@ -6533,7 +6453,6 @@
           <w:p>
             <w:pPr>
               <w:pStyle w:val="Compact"/>
-              <w:jc w:val="left"/>
             </w:pPr>
             <w:r>
               <w:rPr>
@@ -6550,7 +6469,6 @@
           <w:p>
             <w:pPr>
               <w:pStyle w:val="Compact"/>
-              <w:jc w:val="left"/>
             </w:pPr>
             <w:r>
               <w:rPr>
@@ -6565,7 +6483,6 @@
           <w:p>
             <w:pPr>
               <w:pStyle w:val="Compact"/>
-              <w:jc w:val="left"/>
             </w:pPr>
             <w:r>
               <w:t xml:space="preserve">-&gt; new[] pixels (delete[] them) and the size, or 0</w:t>
@@ -6577,7 +6494,6 @@
           <w:p>
             <w:pPr>
               <w:pStyle w:val="Compact"/>
-              <w:jc w:val="left"/>
             </w:pPr>
             <w:r>
               <w:rPr>
@@ -6594,7 +6510,6 @@
           <w:p>
             <w:pPr>
               <w:pStyle w:val="Compact"/>
-              <w:jc w:val="left"/>
             </w:pPr>
             <w:r>
               <w:rPr>
@@ -6609,7 +6524,6 @@
           <w:p>
             <w:pPr>
               <w:pStyle w:val="Compact"/>
-              <w:jc w:val="left"/>
             </w:pPr>
             <w:r>
               <w:t xml:space="preserve">what the widget is told of an item (one message)</w:t>
@@ -6621,7 +6535,6 @@
           <w:p>
             <w:pPr>
               <w:pStyle w:val="Compact"/>
-              <w:jc w:val="left"/>
             </w:pPr>
             <w:r>
               <w:rPr>
@@ -6638,7 +6551,6 @@
           <w:p>
             <w:pPr>
               <w:pStyle w:val="Compact"/>
-              <w:jc w:val="left"/>
             </w:pPr>
             <w:r>
               <w:rPr>
@@ -6653,7 +6565,6 @@
           <w:p>
             <w:pPr>
               <w:pStyle w:val="Compact"/>
-              <w:jc w:val="left"/>
             </w:pPr>
             <w:r>
               <w:t xml:space="preserve">v stored at p as 4 bytes, the low one first (little endian)</w:t>
@@ -6665,7 +6576,6 @@
           <w:p>
             <w:pPr>
               <w:pStyle w:val="Compact"/>
-              <w:jc w:val="left"/>
             </w:pPr>
             <w:r>
               <w:rPr>
@@ -6682,7 +6592,6 @@
           <w:p>
             <w:pPr>
               <w:pStyle w:val="Compact"/>
-              <w:jc w:val="left"/>
             </w:pPr>
             <w:r>
               <w:rPr>
@@ -6697,7 +6606,6 @@
           <w:p>
             <w:pPr>
               <w:pStyle w:val="Compact"/>
-              <w:jc w:val="left"/>
             </w:pPr>
             <w:r>
               <w:t xml:space="preserve">the 4 bytes at p read as a little-endian number</w:t>
@@ -6709,7 +6617,6 @@
           <w:p>
             <w:pPr>
               <w:pStyle w:val="Compact"/>
-              <w:jc w:val="left"/>
             </w:pPr>
             <w:r>
               <w:rPr>
@@ -6726,7 +6633,6 @@
           <w:p>
             <w:pPr>
               <w:pStyle w:val="Compact"/>
-              <w:jc w:val="left"/>
             </w:pPr>
             <w:r>
               <w:rPr>
@@ -6741,7 +6647,6 @@
           <w:p>
             <w:pPr>
               <w:pStyle w:val="Compact"/>
-              <w:jc w:val="left"/>
             </w:pPr>
             <w:r>
               <w:t xml:space="preserve">the length of the string s (0 for a null pointer)</w:t>
@@ -6753,7 +6658,6 @@
           <w:p>
             <w:pPr>
               <w:pStyle w:val="Compact"/>
-              <w:jc w:val="left"/>
             </w:pPr>
             <w:r>
               <w:rPr>
@@ -6770,7 +6674,6 @@
           <w:p>
             <w:pPr>
               <w:pStyle w:val="Compact"/>
-              <w:jc w:val="left"/>
             </w:pPr>
             <w:r>
               <w:rPr>
@@ -6785,7 +6688,6 @@
           <w:p>
             <w:pPr>
               <w:pStyle w:val="Compact"/>
-              <w:jc w:val="left"/>
             </w:pPr>
             <w:r>
               <w:t xml:space="preserve">1 if the strings a and b are the same (the case counts), else 0</w:t>
@@ -6797,7 +6699,6 @@
           <w:p>
             <w:pPr>
               <w:pStyle w:val="Compact"/>
-              <w:jc w:val="left"/>
             </w:pPr>
             <w:r>
               <w:rPr>
@@ -6814,7 +6715,6 @@
           <w:p>
             <w:pPr>
               <w:pStyle w:val="Compact"/>
-              <w:jc w:val="left"/>
             </w:pPr>
             <w:r>
               <w:rPr>
@@ -6829,7 +6729,6 @@
           <w:p>
             <w:pPr>
               <w:pStyle w:val="Compact"/>
-              <w:jc w:val="left"/>
             </w:pPr>
             <w:r>
               <w:t xml:space="preserve">the size of a container of n representations</w:t>
@@ -6841,7 +6740,6 @@
           <w:p>
             <w:pPr>
               <w:pStyle w:val="Compact"/>
-              <w:jc w:val="left"/>
             </w:pPr>
             <w:r>
               <w:rPr>
@@ -6858,7 +6756,6 @@
           <w:p>
             <w:pPr>
               <w:pStyle w:val="Compact"/>
-              <w:jc w:val="left"/>
             </w:pPr>
             <w:r>
               <w:rPr>
@@ -6873,7 +6770,6 @@
           <w:p>
             <w:pPr>
               <w:pStyle w:val="Compact"/>
-              <w:jc w:val="left"/>
             </w:pPr>
             <w:r>
               <w:t xml:space="preserve">writes it into out (clipc_size bytes)</w:t>
@@ -6885,7 +6781,6 @@
           <w:p>
             <w:pPr>
               <w:pStyle w:val="Compact"/>
-              <w:jc w:val="left"/>
             </w:pPr>
             <w:r>
               <w:rPr>
@@ -6902,7 +6797,6 @@
           <w:p>
             <w:pPr>
               <w:pStyle w:val="Compact"/>
-              <w:jc w:val="left"/>
             </w:pPr>
             <w:r>
               <w:rPr>
@@ -6917,7 +6811,6 @@
           <w:p>
             <w:pPr>
               <w:pStyle w:val="Compact"/>
-              <w:jc w:val="left"/>
             </w:pPr>
             <w:r>
               <w:t xml:space="preserve">representation i of a container (0..count-1)</w:t>
@@ -6929,7 +6822,6 @@
           <w:p>
             <w:pPr>
               <w:pStyle w:val="Compact"/>
-              <w:jc w:val="left"/>
             </w:pPr>
             <w:r>
               <w:rPr>
@@ -6946,7 +6838,6 @@
           <w:p>
             <w:pPr>
               <w:pStyle w:val="Compact"/>
-              <w:jc w:val="left"/>
             </w:pPr>
             <w:r>
               <w:rPr>
@@ -6961,7 +6852,6 @@
           <w:p>
             <w:pPr>
               <w:pStyle w:val="Compact"/>
-              <w:jc w:val="left"/>
             </w:pPr>
             <w:r>
               <w:t xml:space="preserve">representation i of a container (0..count-1)</w:t>
@@ -6973,7 +6863,6 @@
           <w:p>
             <w:pPr>
               <w:pStyle w:val="Compact"/>
-              <w:jc w:val="left"/>
             </w:pPr>
             <w:r>
               <w:rPr>
@@ -6990,7 +6879,6 @@
           <w:p>
             <w:pPr>
               <w:pStyle w:val="Compact"/>
-              <w:jc w:val="left"/>
             </w:pPr>
             <w:r>
               <w:rPr>
@@ -7005,7 +6893,6 @@
           <w:p>
             <w:pPr>
               <w:pStyle w:val="Compact"/>
-              <w:jc w:val="left"/>
             </w:pPr>
             <w:r>
               <w:t xml:space="preserve">make the trash's folders (TRASH_DIR, TRASH_FILES, TRASH_INFO) if they are not there</w:t>
@@ -7017,7 +6904,6 @@
           <w:p>
             <w:pPr>
               <w:pStyle w:val="Compact"/>
-              <w:jc w:val="left"/>
             </w:pPr>
             <w:r>
               <w:rPr>
@@ -7034,7 +6920,6 @@
           <w:p>
             <w:pPr>
               <w:pStyle w:val="Compact"/>
-              <w:jc w:val="left"/>
             </w:pPr>
             <w:r>
               <w:rPr>
@@ -7049,7 +6934,6 @@
           <w:p>
             <w:pPr>
               <w:pStyle w:val="Compact"/>
-              <w:jc w:val="left"/>
             </w:pPr>
             <w:r>
               <w:t xml:space="preserve">Move</w:t>
@@ -7076,7 +6960,6 @@
           <w:p>
             <w:pPr>
               <w:pStyle w:val="Compact"/>
-              <w:jc w:val="left"/>
             </w:pPr>
             <w:r>
               <w:rPr>
@@ -7093,7 +6976,6 @@
           <w:p>
             <w:pPr>
               <w:pStyle w:val="Compact"/>
-              <w:jc w:val="left"/>
             </w:pPr>
             <w:r>
               <w:rPr>
@@ -7108,7 +6990,6 @@
           <w:p>
             <w:pPr>
               <w:pStyle w:val="Compact"/>
-              <w:jc w:val="left"/>
             </w:pPr>
             <w:r>
               <w:t xml:space="preserve">Original path of trashed item</w:t>
@@ -7135,7 +7016,6 @@
           <w:p>
             <w:pPr>
               <w:pStyle w:val="Compact"/>
-              <w:jc w:val="left"/>
             </w:pPr>
             <w:r>
               <w:rPr>
@@ -7152,7 +7032,6 @@
           <w:p>
             <w:pPr>
               <w:pStyle w:val="Compact"/>
-              <w:jc w:val="left"/>
             </w:pPr>
             <w:r>
               <w:rPr>
@@ -7167,7 +7046,6 @@
           <w:p>
             <w:pPr>
               <w:pStyle w:val="Compact"/>
-              <w:jc w:val="left"/>
             </w:pPr>
             <w:r>
               <w:t xml:space="preserve">Restore trashed item</w:t>
@@ -7194,7 +7072,6 @@
           <w:p>
             <w:pPr>
               <w:pStyle w:val="Compact"/>
-              <w:jc w:val="left"/>
             </w:pPr>
             <w:r>
               <w:rPr>
@@ -7211,7 +7088,6 @@
           <w:p>
             <w:pPr>
               <w:pStyle w:val="Compact"/>
-              <w:jc w:val="left"/>
             </w:pPr>
             <w:r>
               <w:rPr>
@@ -7226,7 +7102,6 @@
           <w:p>
             <w:pPr>
               <w:pStyle w:val="Compact"/>
-              <w:jc w:val="left"/>
             </w:pPr>
             <w:r>
               <w:t xml:space="preserve">Delete trashed item</w:t>
@@ -7253,7 +7128,6 @@
           <w:p>
             <w:pPr>
               <w:pStyle w:val="Compact"/>
-              <w:jc w:val="left"/>
             </w:pPr>
             <w:r>
               <w:rPr>
@@ -7270,7 +7144,6 @@
           <w:p>
             <w:pPr>
               <w:pStyle w:val="Compact"/>
-              <w:jc w:val="left"/>
             </w:pPr>
             <w:r>
               <w:rPr>
@@ -7285,7 +7158,6 @@
           <w:p>
             <w:pPr>
               <w:pStyle w:val="Compact"/>
-              <w:jc w:val="left"/>
             </w:pPr>
             <w:r>
               <w:t xml:space="preserve">Number of items in the trash.</w:t>
@@ -7297,7 +7169,6 @@
           <w:p>
             <w:pPr>
               <w:pStyle w:val="Compact"/>
-              <w:jc w:val="left"/>
             </w:pPr>
             <w:r>
               <w:rPr>
@@ -7314,7 +7185,6 @@
           <w:p>
             <w:pPr>
               <w:pStyle w:val="Compact"/>
-              <w:jc w:val="left"/>
             </w:pPr>
             <w:r>
               <w:rPr>
@@ -7329,7 +7199,6 @@
           <w:p>
             <w:pPr>
               <w:pStyle w:val="Compact"/>
-              <w:jc w:val="left"/>
             </w:pPr>
             <w:r>
               <w:t xml:space="preserve">Empty the trash (everything in files/ and info/).</w:t>
@@ -7341,7 +7210,6 @@
           <w:p>
             <w:pPr>
               <w:pStyle w:val="Compact"/>
-              <w:jc w:val="left"/>
             </w:pPr>
             <w:r>
               <w:rPr>
@@ -7358,7 +7226,6 @@
           <w:p>
             <w:pPr>
               <w:pStyle w:val="Compact"/>
-              <w:jc w:val="left"/>
             </w:pPr>
             <w:r>
               <w:rPr>
@@ -7373,7 +7240,6 @@
           <w:p>
             <w:pPr>
               <w:pStyle w:val="Compact"/>
-              <w:jc w:val="left"/>
             </w:pPr>
             <w:r>
               <w:t xml:space="preserve">Extension of path (after the last '.' of its basename), or "" if none.</w:t>
@@ -7385,7 +7251,6 @@
           <w:p>
             <w:pPr>
               <w:pStyle w:val="Compact"/>
-              <w:jc w:val="left"/>
             </w:pPr>
             <w:r>
               <w:rPr>
@@ -7402,7 +7267,6 @@
           <w:p>
             <w:pPr>
               <w:pStyle w:val="Compact"/>
-              <w:jc w:val="left"/>
             </w:pPr>
             <w:r>
               <w:rPr>
@@ -7417,7 +7281,6 @@
           <w:p>
             <w:pPr>
               <w:pStyle w:val="Compact"/>
-              <w:jc w:val="left"/>
             </w:pPr>
             <w:r>
               <w:t xml:space="preserve">Extension of path (after the last '.' of its basename), or "" if none.</w:t>
@@ -7429,7 +7292,6 @@
           <w:p>
             <w:pPr>
               <w:pStyle w:val="Compact"/>
-              <w:jc w:val="left"/>
             </w:pPr>
             <w:r>
               <w:rPr>
@@ -7446,7 +7308,6 @@
           <w:p>
             <w:pPr>
               <w:pStyle w:val="Compact"/>
-              <w:jc w:val="left"/>
             </w:pPr>
             <w:r>
               <w:rPr>
@@ -7461,7 +7322,6 @@
           <w:p>
             <w:pPr>
               <w:pStyle w:val="Compact"/>
-              <w:jc w:val="left"/>
             </w:pPr>
             <w:r>
               <w:t xml:space="preserve">Extension of path (after the last '.' of its basename), or "" if none.</w:t>
@@ -7473,7 +7333,6 @@
           <w:p>
             <w:pPr>
               <w:pStyle w:val="Compact"/>
-              <w:jc w:val="left"/>
             </w:pPr>
             <w:r>
               <w:rPr>
@@ -7490,7 +7349,6 @@
           <w:p>
             <w:pPr>
               <w:pStyle w:val="Compact"/>
-              <w:jc w:val="left"/>
             </w:pPr>
             <w:r>
               <w:rPr>
@@ -7505,7 +7363,6 @@
           <w:p>
             <w:pPr>
               <w:pStyle w:val="Compact"/>
-              <w:jc w:val="left"/>
             </w:pPr>
             <w:r>
               <w:t xml:space="preserve">Extension of path (after the last '.' of its basename), or "" if none.</w:t>
@@ -7517,7 +7374,6 @@
           <w:p>
             <w:pPr>
               <w:pStyle w:val="Compact"/>
-              <w:jc w:val="left"/>
             </w:pPr>
             <w:r>
               <w:rPr>
@@ -7534,7 +7390,6 @@
           <w:p>
             <w:pPr>
               <w:pStyle w:val="Compact"/>
-              <w:jc w:val="left"/>
             </w:pPr>
             <w:r>
               <w:rPr>
@@ -7549,7 +7404,6 @@
           <w:p>
             <w:pPr>
               <w:pStyle w:val="Compact"/>
-              <w:jc w:val="left"/>
             </w:pPr>
             <w:r>
               <w:t xml:space="preserve">An output's word in sound.ini (KAPI_SND_OUT_*).</w:t>
@@ -7561,7 +7415,6 @@
           <w:p>
             <w:pPr>
               <w:pStyle w:val="Compact"/>
-              <w:jc w:val="left"/>
             </w:pPr>
             <w:r>
               <w:rPr>
@@ -7578,7 +7431,6 @@
           <w:p>
             <w:pPr>
               <w:pStyle w:val="Compact"/>
-              <w:jc w:val="left"/>
             </w:pPr>
             <w:r>
               <w:rPr>
@@ -7593,7 +7445,6 @@
           <w:p>
             <w:pPr>
               <w:pStyle w:val="Compact"/>
-              <w:jc w:val="left"/>
             </w:pPr>
             <w:r>
               <w:t xml:space="preserve">An output's word in sound.ini (KAPI_SND_OUT_*).</w:t>
@@ -7605,7 +7456,6 @@
           <w:p>
             <w:pPr>
               <w:pStyle w:val="Compact"/>
-              <w:jc w:val="left"/>
             </w:pPr>
             <w:r>
               <w:rPr>
@@ -7622,7 +7472,6 @@
           <w:p>
             <w:pPr>
               <w:pStyle w:val="Compact"/>
-              <w:jc w:val="left"/>
             </w:pPr>
             <w:r>
               <w:rPr>
@@ -7637,7 +7486,6 @@
           <w:p>
             <w:pPr>
               <w:pStyle w:val="Compact"/>
-              <w:jc w:val="left"/>
             </w:pPr>
             <w:r>
               <w:t xml:space="preserve">The output chosen (KAPI_SND_OUT_*)</w:t>
@@ -7649,7 +7497,6 @@
           <w:p>
             <w:pPr>
               <w:pStyle w:val="Compact"/>
-              <w:jc w:val="left"/>
             </w:pPr>
             <w:r>
               <w:rPr>
@@ -7666,7 +7513,6 @@
           <w:p>
             <w:pPr>
               <w:pStyle w:val="Compact"/>
-              <w:jc w:val="left"/>
             </w:pPr>
             <w:r>
               <w:rPr>
@@ -7681,7 +7527,6 @@
           <w:p>
             <w:pPr>
               <w:pStyle w:val="Compact"/>
-              <w:jc w:val="left"/>
             </w:pPr>
             <w:r>
               <w:t xml:space="preserve">The channel's volume and mute set now (-1</w:t>
@@ -7693,7 +7538,6 @@
           <w:p>
             <w:pPr>
               <w:pStyle w:val="Compact"/>
-              <w:jc w:val="left"/>
             </w:pPr>
             <w:r>
               <w:rPr>
@@ -7710,7 +7554,6 @@
           <w:p>
             <w:pPr>
               <w:pStyle w:val="Compact"/>
-              <w:jc w:val="left"/>
             </w:pPr>
             <w:r>
               <w:rPr>
@@ -7725,7 +7568,6 @@
           <w:p>
             <w:pPr>
               <w:pStyle w:val="Compact"/>
-              <w:jc w:val="left"/>
             </w:pPr>
             <w:r>
               <w:t xml:space="preserve">the saved volume -&gt; the kernel (no file</w:t>
@@ -7737,7 +7579,6 @@
           <w:p>
             <w:pPr>
               <w:pStyle w:val="Compact"/>
-              <w:jc w:val="left"/>
             </w:pPr>
             <w:r>
               <w:rPr>
@@ -7754,7 +7595,6 @@
           <w:p>
             <w:pPr>
               <w:pStyle w:val="Compact"/>
-              <w:jc w:val="left"/>
             </w:pPr>
             <w:r>
               <w:rPr>
@@ -7769,7 +7609,6 @@
           <w:p>
             <w:pPr>
               <w:pStyle w:val="Compact"/>
-              <w:jc w:val="left"/>
             </w:pPr>
             <w:r>
               <w:t xml:space="preserve">(a type)</w:t>
@@ -7781,7 +7620,6 @@
           <w:p>
             <w:pPr>
               <w:pStyle w:val="Compact"/>
-              <w:jc w:val="left"/>
             </w:pPr>
             <w:r>
               <w:rPr>
@@ -7798,7 +7636,6 @@
           <w:p>
             <w:pPr>
               <w:pStyle w:val="Compact"/>
-              <w:jc w:val="left"/>
             </w:pPr>
             <w:r>
               <w:rPr>
@@ -7813,7 +7650,6 @@
           <w:p>
             <w:pPr>
               <w:pStyle w:val="Compact"/>
-              <w:jc w:val="left"/>
             </w:pPr>
             <w:r>
               <w:t xml:space="preserve">the wallpaper without a file: voronoi, 28 points, the blues 0x4878B0 and 0x1C2C48, the pattern waves.png</w:t>
@@ -7825,7 +7661,6 @@
           <w:p>
             <w:pPr>
               <w:pStyle w:val="Compact"/>
-              <w:jc w:val="left"/>
             </w:pPr>
             <w:r>
               <w:rPr>
@@ -7842,7 +7677,6 @@
           <w:p>
             <w:pPr>
               <w:pStyle w:val="Compact"/>
-              <w:jc w:val="left"/>
             </w:pPr>
             <w:r>
               <w:rPr>
@@ -7857,7 +7691,6 @@
           <w:p>
             <w:pPr>
               <w:pStyle w:val="Compact"/>
-              <w:jc w:val="left"/>
             </w:pPr>
             <w:r>
               <w:t xml:space="preserve">true if a and b are the same string, the case of A..Z ignored</w:t>
@@ -7869,7 +7702,6 @@
           <w:p>
             <w:pPr>
               <w:pStyle w:val="Compact"/>
-              <w:jc w:val="left"/>
             </w:pPr>
             <w:r>
               <w:rPr>
@@ -7886,7 +7718,6 @@
           <w:p>
             <w:pPr>
               <w:pStyle w:val="Compact"/>
-              <w:jc w:val="left"/>
             </w:pPr>
             <w:r>
               <w:rPr>
@@ -7901,7 +7732,6 @@
           <w:p>
             <w:pPr>
               <w:pStyle w:val="Compact"/>
-              <w:jc w:val="left"/>
             </w:pPr>
             <w:r>
               <w:t xml:space="preserve">a colour in hexadecimal ("0xRRGGBB", "#RRGGBB", "RRGGBB") -&gt; 0x00RRGGBB; def if v has no hex digit</w:t>
@@ -7913,7 +7743,6 @@
           <w:p>
             <w:pPr>
               <w:pStyle w:val="Compact"/>
-              <w:jc w:val="left"/>
             </w:pPr>
             <w:r>
               <w:rPr>
@@ -7930,7 +7759,6 @@
           <w:p>
             <w:pPr>
               <w:pStyle w:val="Compact"/>
-              <w:jc w:val="left"/>
             </w:pPr>
             <w:r>
               <w:rPr>
@@ -7945,7 +7773,6 @@
           <w:p>
             <w:pPr>
               <w:pStyle w:val="Compact"/>
-              <w:jc w:val="left"/>
             </w:pPr>
             <w:r>
               <w:t xml:space="preserve">"key = value" lines of a file</w:t>
@@ -7957,7 +7784,6 @@
           <w:p>
             <w:pPr>
               <w:pStyle w:val="Compact"/>
-              <w:jc w:val="left"/>
             </w:pPr>
             <w:r>
               <w:rPr>
@@ -7974,7 +7800,6 @@
           <w:p>
             <w:pPr>
               <w:pStyle w:val="Compact"/>
-              <w:jc w:val="left"/>
             </w:pPr>
             <w:r>
               <w:rPr>
@@ -7989,7 +7814,6 @@
           <w:p>
             <w:pPr>
               <w:pStyle w:val="Compact"/>
-              <w:jc w:val="left"/>
             </w:pPr>
             <w:r>
               <w:t xml:space="preserve">"key = value" lines of a file</w:t>
@@ -8001,7 +7825,6 @@
           <w:p>
             <w:pPr>
               <w:pStyle w:val="Compact"/>
-              <w:jc w:val="left"/>
             </w:pPr>
             <w:r>
               <w:rPr>
@@ -8018,7 +7841,6 @@
           <w:p>
             <w:pPr>
               <w:pStyle w:val="Compact"/>
-              <w:jc w:val="left"/>
             </w:pPr>
             <w:r>
               <w:rPr>
@@ -8033,7 +7855,6 @@
           <w:p>
             <w:pPr>
               <w:pStyle w:val="Compact"/>
-              <w:jc w:val="left"/>
             </w:pPr>
             <w:r>
               <w:t xml:space="preserve">"key = value" lines of a file</w:t>
@@ -8045,7 +7866,6 @@
           <w:p>
             <w:pPr>
               <w:pStyle w:val="Compact"/>
-              <w:jc w:val="left"/>
             </w:pPr>
             <w:r>
               <w:rPr>
@@ -8062,7 +7882,6 @@
           <w:p>
             <w:pPr>
               <w:pStyle w:val="Compact"/>
-              <w:jc w:val="left"/>
             </w:pPr>
             <w:r>
               <w:rPr>
@@ -8077,7 +7896,6 @@
           <w:p>
             <w:pPr>
               <w:pStyle w:val="Compact"/>
-              <w:jc w:val="left"/>
             </w:pPr>
             <w:r>
               <w:t xml:space="preserve">"key = value" lines of a file</w:t>
@@ -8089,7 +7907,6 @@
           <w:p>
             <w:pPr>
               <w:pStyle w:val="Compact"/>
-              <w:jc w:val="left"/>
             </w:pPr>
             <w:r>
               <w:rPr>
@@ -8106,7 +7923,6 @@
           <w:p>
             <w:pPr>
               <w:pStyle w:val="Compact"/>
-              <w:jc w:val="left"/>
             </w:pPr>
             <w:r>
               <w:rPr>
@@ -8121,7 +7937,6 @@
           <w:p>
             <w:pPr>
               <w:pStyle w:val="Compact"/>
-              <w:jc w:val="left"/>
             </w:pPr>
             <w:r>
               <w:t xml:space="preserve">"key = value" lines of a file</w:t>
@@ -8133,7 +7948,6 @@
           <w:p>
             <w:pPr>
               <w:pStyle w:val="Compact"/>
-              <w:jc w:val="left"/>
             </w:pPr>
             <w:r>
               <w:rPr>
@@ -8150,7 +7964,6 @@
           <w:p>
             <w:pPr>
               <w:pStyle w:val="Compact"/>
-              <w:jc w:val="left"/>
             </w:pPr>
             <w:r>
               <w:rPr>
@@ -8165,7 +7978,6 @@
           <w:p>
             <w:pPr>
               <w:pStyle w:val="Compact"/>
-              <w:jc w:val="left"/>
             </w:pPr>
             <w:r>
               <w:t xml:space="preserve">"key = value" lines of a file</w:t>
@@ -8177,7 +7989,6 @@
           <w:p>
             <w:pPr>
               <w:pStyle w:val="Compact"/>
-              <w:jc w:val="left"/>
             </w:pPr>
             <w:r>
               <w:rPr>
@@ -8194,7 +8005,6 @@
           <w:p>
             <w:pPr>
               <w:pStyle w:val="Compact"/>
-              <w:jc w:val="left"/>
             </w:pPr>
             <w:r>
               <w:rPr>
@@ -8209,7 +8019,6 @@
           <w:p>
             <w:pPr>
               <w:pStyle w:val="Compact"/>
-              <w:jc w:val="left"/>
             </w:pPr>
             <w:r>
               <w:t xml:space="preserve">the integer square root of n (rounded down)</w:t>
@@ -8221,7 +8030,6 @@
           <w:p>
             <w:pPr>
               <w:pStyle w:val="Compact"/>
-              <w:jc w:val="left"/>
             </w:pPr>
             <w:r>
               <w:rPr>
@@ -8238,7 +8046,6 @@
           <w:p>
             <w:pPr>
               <w:pStyle w:val="Compact"/>
-              <w:jc w:val="left"/>
             </w:pPr>
             <w:r>
               <w:rPr>
@@ -8253,7 +8060,6 @@
           <w:p>
             <w:pPr>
               <w:pStyle w:val="Compact"/>
-              <w:jc w:val="left"/>
             </w:pPr>
             <w:r>
               <w:t xml:space="preserve">The colour between a and b (0x00RRGGBB), each channel apart -&gt; a for t 0, b for t 255.</w:t>
@@ -8265,7 +8071,6 @@
           <w:p>
             <w:pPr>
               <w:pStyle w:val="Compact"/>
-              <w:jc w:val="left"/>
             </w:pPr>
             <w:r>
               <w:rPr>
@@ -8282,7 +8087,6 @@
           <w:p>
             <w:pPr>
               <w:pStyle w:val="Compact"/>
-              <w:jc w:val="left"/>
             </w:pPr>
             <w:r>
               <w:rPr>
@@ -8297,7 +8101,6 @@
           <w:p>
             <w:pPr>
               <w:pStyle w:val="Compact"/>
-              <w:jc w:val="left"/>
             </w:pPr>
             <w:r>
               <w:t xml:space="preserve">Paint w x h pixels (stride</w:t>
@@ -8309,7 +8112,6 @@
           <w:p>
             <w:pPr>
               <w:pStyle w:val="Compact"/>
-              <w:jc w:val="left"/>
             </w:pPr>
             <w:r>
               <w:rPr>
@@ -8326,7 +8128,6 @@
           <w:p>
             <w:pPr>
               <w:pStyle w:val="Compact"/>
-              <w:jc w:val="left"/>
             </w:pPr>
             <w:r>
               <w:rPr>
@@ -8341,7 +8142,6 @@
           <w:p>
             <w:pPr>
               <w:pStyle w:val="Compact"/>
-              <w:jc w:val="left"/>
             </w:pPr>
             <w:r>
               <w:t xml:space="preserve">the luminance 0..255 of a colour: (77 R + 150 G + 29 B) / 256</w:t>
@@ -8353,7 +8153,6 @@
           <w:p>
             <w:pPr>
               <w:pStyle w:val="Compact"/>
-              <w:jc w:val="left"/>
             </w:pPr>
             <w:r>
               <w:rPr>
@@ -8370,7 +8169,6 @@
           <w:p>
             <w:pPr>
               <w:pStyle w:val="Compact"/>
-              <w:jc w:val="left"/>
             </w:pPr>
             <w:r>
               <w:rPr>
@@ -8385,7 +8183,6 @@
           <w:p>
             <w:pPr>
               <w:pStyle w:val="Compact"/>
-              <w:jc w:val="left"/>
             </w:pPr>
             <w:r>
               <w:t xml:space="preserve">The grey of a picture (0xAARRGGBB, iw x ih</w:t>
@@ -8397,7 +8194,6 @@
           <w:p>
             <w:pPr>
               <w:pStyle w:val="Compact"/>
-              <w:jc w:val="left"/>
             </w:pPr>
             <w:r>
               <w:rPr>
@@ -8414,7 +8210,6 @@
           <w:p>
             <w:pPr>
               <w:pStyle w:val="Compact"/>
-              <w:jc w:val="left"/>
             </w:pPr>
             <w:r>
               <w:rPr>
@@ -8429,7 +8224,6 @@
           <w:p>
             <w:pPr>
               <w:pStyle w:val="Compact"/>
-              <w:jc w:val="left"/>
             </w:pPr>
             <w:r>
               <w:t xml:space="preserve">...</w:t>
@@ -8441,7 +8235,6 @@
           <w:p>
             <w:pPr>
               <w:pStyle w:val="Compact"/>
-              <w:jc w:val="left"/>
             </w:pPr>
             <w:r>
               <w:rPr>
@@ -8458,7 +8251,6 @@
           <w:p>
             <w:pPr>
               <w:pStyle w:val="Compact"/>
-              <w:jc w:val="left"/>
             </w:pPr>
             <w:r>
               <w:rPr>
@@ -8473,7 +8265,6 @@
           <w:p>
             <w:pPr>
               <w:pStyle w:val="Compact"/>
-              <w:jc w:val="left"/>
             </w:pPr>
             <w:r>
               <w:t xml:space="preserve">The colours multiplied by the grey (w x h)</w:t>
@@ -8485,7 +8276,6 @@
           <w:p>
             <w:pPr>
               <w:pStyle w:val="Compact"/>
-              <w:jc w:val="left"/>
             </w:pPr>
             <w:r>
               <w:rPr>
@@ -8502,7 +8292,6 @@
           <w:p>
             <w:pPr>
               <w:pStyle w:val="Compact"/>
-              <w:jc w:val="left"/>
             </w:pPr>
             <w:r>
               <w:rPr>
@@ -8517,7 +8306,6 @@
           <w:p>
             <w:pPr>
               <w:pStyle w:val="Compact"/>
-              <w:jc w:val="left"/>
             </w:pPr>
             <w:r>
               <w:t xml:space="preserve">(a type)</w:t>
@@ -8529,7 +8317,6 @@
           <w:p>
             <w:pPr>
               <w:pStyle w:val="Compact"/>
-              <w:jc w:val="left"/>
             </w:pPr>
             <w:r>
               <w:rPr>
@@ -8546,7 +8333,6 @@
           <w:p>
             <w:pPr>
               <w:pStyle w:val="Compact"/>
-              <w:jc w:val="left"/>
             </w:pPr>
             <w:r>
               <w:rPr>
@@ -8561,7 +8347,6 @@
           <w:p>
             <w:pPr>
               <w:pStyle w:val="Compact"/>
-              <w:jc w:val="left"/>
             </w:pPr>
             <w:r>
               <w:t xml:space="preserve">s (0: "") copied into d, cut at cap - 1 characters, NUL-terminated</w:t>
@@ -8573,7 +8358,6 @@
           <w:p>
             <w:pPr>
               <w:pStyle w:val="Compact"/>
-              <w:jc w:val="left"/>
             </w:pPr>
             <w:r>
               <w:rPr>
@@ -8590,7 +8374,6 @@
           <w:p>
             <w:pPr>
               <w:pStyle w:val="Compact"/>
-              <w:jc w:val="left"/>
             </w:pPr>
             <w:r>
               <w:rPr>
@@ -8605,7 +8388,6 @@
           <w:p>
             <w:pPr>
               <w:pStyle w:val="Compact"/>
-              <w:jc w:val="left"/>
             </w:pPr>
             <w:r>
               <w:t xml:space="preserve">the dock without a file: 6 drawers (Productivity .. Demos), the terminal and fileviewer launchers, desks "1" .. "4"</w:t>
@@ -8617,7 +8399,6 @@
           <w:p>
             <w:pPr>
               <w:pStyle w:val="Compact"/>
-              <w:jc w:val="left"/>
             </w:pPr>
             <w:r>
               <w:rPr>
@@ -8634,7 +8415,6 @@
           <w:p>
             <w:pPr>
               <w:pStyle w:val="Compact"/>
-              <w:jc w:val="left"/>
             </w:pPr>
             <w:r>
               <w:rPr>
@@ -8649,7 +8429,6 @@
           <w:p>
             <w:pPr>
               <w:pStyle w:val="Compact"/>
-              <w:jc w:val="left"/>
             </w:pPr>
             <w:r>
               <w:t xml:space="preserve">A value's two parts</w:t>
@@ -8661,7 +8440,6 @@
           <w:p>
             <w:pPr>
               <w:pStyle w:val="Compact"/>
-              <w:jc w:val="left"/>
             </w:pPr>
             <w:r>
               <w:rPr>
@@ -8678,7 +8456,6 @@
           <w:p>
             <w:pPr>
               <w:pStyle w:val="Compact"/>
-              <w:jc w:val="left"/>
             </w:pPr>
             <w:r>
               <w:rPr>
@@ -8693,7 +8470,6 @@
           <w:p>
             <w:pPr>
               <w:pStyle w:val="Compact"/>
-              <w:jc w:val="left"/>
             </w:pPr>
             <w:r>
               <w:t xml:space="preserve">-&gt; false</w:t>
@@ -8705,7 +8481,6 @@
           <w:p>
             <w:pPr>
               <w:pStyle w:val="Compact"/>
-              <w:jc w:val="left"/>
             </w:pPr>
             <w:r>
               <w:rPr>
@@ -8722,7 +8497,6 @@
           <w:p>
             <w:pPr>
               <w:pStyle w:val="Compact"/>
-              <w:jc w:val="left"/>
             </w:pPr>
             <w:r>
               <w:rPr>
@@ -8737,7 +8511,6 @@
           <w:p>
             <w:pPr>
               <w:pStyle w:val="Compact"/>
-              <w:jc w:val="left"/>
             </w:pPr>
             <w:r>
               <w:t xml:space="preserve">-&gt; false</w:t>
@@ -8749,7 +8522,6 @@
           <w:p>
             <w:pPr>
               <w:pStyle w:val="Compact"/>
-              <w:jc w:val="left"/>
             </w:pPr>
             <w:r>
               <w:rPr>
@@ -8766,7 +8538,6 @@
           <w:p>
             <w:pPr>
               <w:pStyle w:val="Compact"/>
-              <w:jc w:val="left"/>
             </w:pPr>
             <w:r>
               <w:rPr>
@@ -8781,7 +8552,6 @@
           <w:p>
             <w:pPr>
               <w:pStyle w:val="Compact"/>
-              <w:jc w:val="left"/>
             </w:pPr>
             <w:r>
               <w:t xml:space="preserve">-&gt; false</w:t>
@@ -8793,7 +8563,6 @@
           <w:p>
             <w:pPr>
               <w:pStyle w:val="Compact"/>
-              <w:jc w:val="left"/>
             </w:pPr>
             <w:r>
               <w:rPr>
@@ -8810,7 +8579,6 @@
           <w:p>
             <w:pPr>
               <w:pStyle w:val="Compact"/>
-              <w:jc w:val="left"/>
             </w:pPr>
             <w:r>
               <w:rPr>
@@ -8825,7 +8593,6 @@
           <w:p>
             <w:pPr>
               <w:pStyle w:val="Compact"/>
-              <w:jc w:val="left"/>
             </w:pPr>
             <w:r>
               <w:t xml:space="preserve">The dock takes its settings (and the theme) again</w:t>
@@ -8837,7 +8604,6 @@
           <w:p>
             <w:pPr>
               <w:pStyle w:val="Compact"/>
-              <w:jc w:val="left"/>
             </w:pPr>
             <w:r>
               <w:rPr>
@@ -8854,7 +8620,6 @@
           <w:p>
             <w:pPr>
               <w:pStyle w:val="Compact"/>
-              <w:jc w:val="left"/>
             </w:pPr>
             <w:r>
               <w:rPr>
@@ -8869,7 +8634,6 @@
           <w:p>
             <w:pPr>
               <w:pStyle w:val="Compact"/>
-              <w:jc w:val="left"/>
             </w:pPr>
             <w:r>
               <w:t xml:space="preserve">The dock takes its settings (and the theme) again</w:t>
@@ -8881,7 +8645,6 @@
           <w:p>
             <w:pPr>
               <w:pStyle w:val="Compact"/>
-              <w:jc w:val="left"/>
             </w:pPr>
             <w:r>
               <w:rPr>
@@ -8898,7 +8661,6 @@
           <w:p>
             <w:pPr>
               <w:pStyle w:val="Compact"/>
-              <w:jc w:val="left"/>
             </w:pPr>
             <w:r>
               <w:rPr>
@@ -8913,7 +8675,6 @@
           <w:p>
             <w:pPr>
               <w:pStyle w:val="Compact"/>
-              <w:jc w:val="left"/>
             </w:pPr>
             <w:r>
               <w:t xml:space="preserve">(a type)</w:t>
@@ -8925,7 +8686,6 @@
           <w:p>
             <w:pPr>
               <w:pStyle w:val="Compact"/>
-              <w:jc w:val="left"/>
             </w:pPr>
             <w:r>
               <w:rPr>
@@ -8942,7 +8702,6 @@
           <w:p>
             <w:pPr>
               <w:pStyle w:val="Compact"/>
-              <w:jc w:val="left"/>
             </w:pPr>
             <w:r>
               <w:rPr>
@@ -8957,7 +8716,6 @@
           <w:p>
             <w:pPr>
               <w:pStyle w:val="Compact"/>
-              <w:jc w:val="left"/>
             </w:pPr>
             <w:r>
               <w:t xml:space="preserve">(a type)</w:t>
@@ -8969,7 +8727,6 @@
           <w:p>
             <w:pPr>
               <w:pStyle w:val="Compact"/>
-              <w:jc w:val="left"/>
             </w:pPr>
             <w:r>
               <w:rPr>
@@ -8986,7 +8743,6 @@
           <w:p>
             <w:pPr>
               <w:pStyle w:val="Compact"/>
-              <w:jc w:val="left"/>
             </w:pPr>
             <w:r>
               <w:rPr>
@@ -9001,7 +8757,6 @@
           <w:p>
             <w:pPr>
               <w:pStyle w:val="Compact"/>
-              <w:jc w:val="left"/>
             </w:pPr>
             <w:r>
               <w:t xml:space="preserve">The categories that may have a drawer</w:t>
@@ -9013,7 +8768,6 @@
           <w:p>
             <w:pPr>
               <w:pStyle w:val="Compact"/>
-              <w:jc w:val="left"/>
             </w:pPr>
             <w:r>
               <w:rPr>
@@ -9030,7 +8784,6 @@
           <w:p>
             <w:pPr>
               <w:pStyle w:val="Compact"/>
-              <w:jc w:val="left"/>
             </w:pPr>
             <w:r>
               <w:rPr>
@@ -9045,7 +8798,6 @@
           <w:p>
             <w:pPr>
               <w:pStyle w:val="Compact"/>
-              <w:jc w:val="left"/>
             </w:pPr>
             <w:r>
               <w:t xml:space="preserve">dock.ini (or the defaults) merged with the card's apps</w:t>
@@ -9057,7 +8809,6 @@
           <w:p>
             <w:pPr>
               <w:pStyle w:val="Compact"/>
-              <w:jc w:val="left"/>
             </w:pPr>
             <w:r>
               <w:rPr>
@@ -9074,7 +8825,6 @@
           <w:p>
             <w:pPr>
               <w:pStyle w:val="Compact"/>
-              <w:jc w:val="left"/>
             </w:pPr>
             <w:r>
               <w:rPr>
@@ -9089,7 +8839,6 @@
           <w:p>
             <w:pPr>
               <w:pStyle w:val="Compact"/>
-              <w:jc w:val="left"/>
             </w:pPr>
             <w:r>
               <w:t xml:space="preserve">dock.ini written</w:t>
@@ -9101,7 +8850,6 @@
           <w:p>
             <w:pPr>
               <w:pStyle w:val="Compact"/>
-              <w:jc w:val="left"/>
             </w:pPr>
             <w:r>
               <w:rPr>
@@ -9118,7 +8866,6 @@
           <w:p>
             <w:pPr>
               <w:pStyle w:val="Compact"/>
-              <w:jc w:val="left"/>
             </w:pPr>
             <w:r>
               <w:rPr>
@@ -9133,7 +8880,6 @@
           <w:p>
             <w:pPr>
               <w:pStyle w:val="Compact"/>
-              <w:jc w:val="left"/>
             </w:pPr>
             <w:r>
               <w:t xml:space="preserve">(a type)</w:t>
@@ -9145,7 +8891,6 @@
           <w:p>
             <w:pPr>
               <w:pStyle w:val="Compact"/>
-              <w:jc w:val="left"/>
             </w:pPr>
             <w:r>
               <w:rPr>
@@ -9162,7 +8907,6 @@
           <w:p>
             <w:pPr>
               <w:pStyle w:val="Compact"/>
-              <w:jc w:val="left"/>
             </w:pPr>
             <w:r>
               <w:rPr>
@@ -9177,7 +8921,6 @@
           <w:p>
             <w:pPr>
               <w:pStyle w:val="Compact"/>
-              <w:jc w:val="left"/>
             </w:pPr>
             <w:r>
               <w:t xml:space="preserve">-&gt; how many programs the file lists (0</w:t>
@@ -9189,7 +8932,6 @@
           <w:p>
             <w:pPr>
               <w:pStyle w:val="Compact"/>
-              <w:jc w:val="left"/>
             </w:pPr>
             <w:r>
               <w:rPr>
@@ -9206,7 +8948,6 @@
           <w:p>
             <w:pPr>
               <w:pStyle w:val="Compact"/>
-              <w:jc w:val="left"/>
             </w:pPr>
             <w:r>
               <w:rPr>
@@ -9221,7 +8962,6 @@
           <w:p>
             <w:pPr>
               <w:pStyle w:val="Compact"/>
-              <w:jc w:val="left"/>
             </w:pPr>
             <w:r>
               <w:t xml:space="preserve">-&gt; 1 written, 0 not</w:t>
@@ -9233,7 +8973,6 @@
           <w:p>
             <w:pPr>
               <w:pStyle w:val="Compact"/>
-              <w:jc w:val="left"/>
             </w:pPr>
             <w:r>
               <w:rPr>
@@ -9250,7 +8989,6 @@
           <w:p>
             <w:pPr>
               <w:pStyle w:val="Compact"/>
-              <w:jc w:val="left"/>
             </w:pPr>
             <w:r>
               <w:rPr>
@@ -9265,7 +9003,6 @@
           <w:p>
             <w:pPr>
               <w:pStyle w:val="Compact"/>
-              <w:jc w:val="left"/>
             </w:pPr>
             <w:r>
               <w:t xml:space="preserve">Is</w:t>
@@ -9292,7 +9029,6 @@
           <w:p>
             <w:pPr>
               <w:pStyle w:val="Compact"/>
-              <w:jc w:val="left"/>
             </w:pPr>
             <w:r>
               <w:rPr>
@@ -9309,7 +9045,6 @@
           <w:p>
             <w:pPr>
               <w:pStyle w:val="Compact"/>
-              <w:jc w:val="left"/>
             </w:pPr>
             <w:r>
               <w:rPr>
@@ -9324,7 +9059,6 @@
           <w:p>
             <w:pPr>
               <w:pStyle w:val="Compact"/>
-              <w:jc w:val="left"/>
             </w:pPr>
             <w:r>
               <w:t xml:space="preserve">Make sure</w:t>
@@ -9351,7 +9085,6 @@
           <w:p>
             <w:pPr>
               <w:pStyle w:val="Compact"/>
-              <w:jc w:val="left"/>
             </w:pPr>
             <w:r>
               <w:rPr>
@@ -9368,7 +9101,6 @@
           <w:p>
             <w:pPr>
               <w:pStyle w:val="Compact"/>
-              <w:jc w:val="left"/>
             </w:pPr>
             <w:r>
               <w:rPr>
@@ -9383,7 +9115,6 @@
           <w:p>
             <w:pPr>
               <w:pStyle w:val="Compact"/>
-              <w:jc w:val="left"/>
             </w:pPr>
             <w:r>
               <w:t xml:space="preserve">system.ini's "key=value"</w:t>
@@ -9395,7 +9126,6 @@
           <w:p>
             <w:pPr>
               <w:pStyle w:val="Compact"/>
-              <w:jc w:val="left"/>
             </w:pPr>
             <w:r>
               <w:rPr>
@@ -9412,7 +9142,6 @@
           <w:p>
             <w:pPr>
               <w:pStyle w:val="Compact"/>
-              <w:jc w:val="left"/>
             </w:pPr>
             <w:r>
               <w:rPr>
@@ -9427,7 +9156,6 @@
           <w:p>
             <w:pPr>
               <w:pStyle w:val="Compact"/>
-              <w:jc w:val="left"/>
             </w:pPr>
             <w:r>
               <w:t xml:space="preserve">system.ini's "key=value"</w:t>
@@ -9439,7 +9167,6 @@
           <w:p>
             <w:pPr>
               <w:pStyle w:val="Compact"/>
-              <w:jc w:val="left"/>
             </w:pPr>
             <w:r>
               <w:rPr>
@@ -9456,7 +9183,6 @@
           <w:p>
             <w:pPr>
               <w:pStyle w:val="Compact"/>
-              <w:jc w:val="left"/>
             </w:pPr>
             <w:r>
               <w:rPr>
@@ -9479,7 +9205,6 @@
           <w:p>
             <w:pPr>
               <w:pStyle w:val="Compact"/>
-              <w:jc w:val="left"/>
             </w:pPr>
             <w:r>
               <w:rPr>
@@ -9496,7 +9221,6 @@
           <w:p>
             <w:pPr>
               <w:pStyle w:val="Compact"/>
-              <w:jc w:val="left"/>
             </w:pPr>
             <w:r>
               <w:rPr>
@@ -9511,7 +9235,6 @@
           <w:p>
             <w:pPr>
               <w:pStyle w:val="Compact"/>
-              <w:jc w:val="left"/>
             </w:pPr>
             <w:r>
               <w:t xml:space="preserve">"en", "fr" ("" out of range)</w:t>
@@ -9523,7 +9246,6 @@
           <w:p>
             <w:pPr>
               <w:pStyle w:val="Compact"/>
-              <w:jc w:val="left"/>
             </w:pPr>
             <w:r>
               <w:rPr>
@@ -9540,7 +9262,6 @@
           <w:p>
             <w:pPr>
               <w:pStyle w:val="Compact"/>
-              <w:jc w:val="left"/>
             </w:pPr>
             <w:r>
               <w:rPr>
@@ -9555,7 +9276,6 @@
           <w:p>
             <w:pPr>
               <w:pStyle w:val="Compact"/>
-              <w:jc w:val="left"/>
             </w:pPr>
             <w:r>
               <w:t xml:space="preserve">in the language itself, UTF-8: "English", "Français"</w:t>
@@ -9567,7 +9287,6 @@
           <w:p>
             <w:pPr>
               <w:pStyle w:val="Compact"/>
-              <w:jc w:val="left"/>
             </w:pPr>
             <w:r>
               <w:rPr>
@@ -9584,7 +9303,6 @@
           <w:p>
             <w:pPr>
               <w:pStyle w:val="Compact"/>
-              <w:jc w:val="left"/>
             </w:pPr>
             <w:r>
               <w:rPr>
@@ -9599,7 +9317,6 @@
           <w:p>
             <w:pPr>
               <w:pStyle w:val="Compact"/>
-              <w:jc w:val="left"/>
             </w:pPr>
             <w:r>
               <w:t xml:space="preserve">The system's language</w:t>
@@ -9611,7 +9328,6 @@
           <w:p>
             <w:pPr>
               <w:pStyle w:val="Compact"/>
-              <w:jc w:val="left"/>
             </w:pPr>
             <w:r>
               <w:rPr>
@@ -9628,7 +9344,6 @@
           <w:p>
             <w:pPr>
               <w:pStyle w:val="Compact"/>
-              <w:jc w:val="left"/>
             </w:pPr>
             <w:r>
               <w:rPr>
@@ -9643,7 +9358,6 @@
           <w:p>
             <w:pPr>
               <w:pStyle w:val="Compact"/>
-              <w:jc w:val="left"/>
             </w:pPr>
             <w:r>
               <w:t xml:space="preserve">its place in the list</w:t>
@@ -9655,7 +9369,6 @@
           <w:p>
             <w:pPr>
               <w:pStyle w:val="Compact"/>
-              <w:jc w:val="left"/>
             </w:pPr>
             <w:r>
               <w:rPr>
@@ -9672,7 +9385,6 @@
           <w:p>
             <w:pPr>
               <w:pStyle w:val="Compact"/>
-              <w:jc w:val="left"/>
             </w:pPr>
             <w:r>
               <w:rPr>
@@ -9687,7 +9399,6 @@
           <w:p>
             <w:pPr>
               <w:pStyle w:val="Compact"/>
-              <w:jc w:val="left"/>
             </w:pPr>
             <w:r>
               <w:t xml:space="preserve">kept in system.ini -&gt; 1 written (the programs started next take it)</w:t>
@@ -9699,7 +9410,6 @@
           <w:p>
             <w:pPr>
               <w:pStyle w:val="Compact"/>
-              <w:jc w:val="left"/>
             </w:pPr>
             <w:r>
               <w:rPr>
@@ -9716,7 +9426,6 @@
           <w:p>
             <w:pPr>
               <w:pStyle w:val="Compact"/>
-              <w:jc w:val="left"/>
             </w:pPr>
             <w:r>
               <w:rPr>
@@ -9739,7 +9448,6 @@
           <w:p>
             <w:pPr>
               <w:pStyle w:val="Compact"/>
-              <w:jc w:val="left"/>
             </w:pPr>
             <w:r>
               <w:rPr>
@@ -9756,7 +9464,6 @@
           <w:p>
             <w:pPr>
               <w:pStyle w:val="Compact"/>
-              <w:jc w:val="left"/>
             </w:pPr>
             <w:r>
               <w:rPr>
@@ -9771,7 +9478,6 @@
           <w:p>
             <w:pPr>
               <w:pStyle w:val="Compact"/>
-              <w:jc w:val="left"/>
             </w:pPr>
             <w:r>
               <w:t xml:space="preserve">"Brussels" ("" out of range)</w:t>
@@ -9783,7 +9489,6 @@
           <w:p>
             <w:pPr>
               <w:pStyle w:val="Compact"/>
-              <w:jc w:val="left"/>
             </w:pPr>
             <w:r>
               <w:rPr>
@@ -9800,7 +9505,6 @@
           <w:p>
             <w:pPr>
               <w:pStyle w:val="Compact"/>
-              <w:jc w:val="left"/>
             </w:pPr>
             <w:r>
               <w:rPr>
@@ -9815,7 +9519,6 @@
           <w:p>
             <w:pPr>
               <w:pStyle w:val="Compact"/>
-              <w:jc w:val="left"/>
             </w:pPr>
             <w:r>
               <w:t xml:space="preserve">1: the zone is on summer time today (by the clock's date)</w:t>
@@ -9827,7 +9530,6 @@
           <w:p>
             <w:pPr>
               <w:pStyle w:val="Compact"/>
-              <w:jc w:val="left"/>
             </w:pPr>
             <w:r>
               <w:rPr>
@@ -9844,7 +9546,6 @@
           <w:p>
             <w:pPr>
               <w:pStyle w:val="Compact"/>
-              <w:jc w:val="left"/>
             </w:pPr>
             <w:r>
               <w:rPr>
@@ -9859,7 +9560,6 @@
           <w:p>
             <w:pPr>
               <w:pStyle w:val="Compact"/>
-              <w:jc w:val="left"/>
             </w:pPr>
             <w:r>
               <w:t xml:space="preserve">minutes from UTC today (the summer time counted)</w:t>
@@ -9871,7 +9571,6 @@
           <w:p>
             <w:pPr>
               <w:pStyle w:val="Compact"/>
-              <w:jc w:val="left"/>
             </w:pPr>
             <w:r>
               <w:rPr>
@@ -9888,7 +9587,6 @@
           <w:p>
             <w:pPr>
               <w:pStyle w:val="Compact"/>
-              <w:jc w:val="left"/>
             </w:pPr>
             <w:r>
               <w:rPr>
@@ -9903,7 +9601,6 @@
           <w:p>
             <w:pPr>
               <w:pStyle w:val="Compact"/>
-              <w:jc w:val="left"/>
             </w:pPr>
             <w:r>
               <w:t xml:space="preserve">"UTC+2", "UTC-3:30", "UTC"</w:t>
@@ -9915,7 +9612,6 @@
           <w:p>
             <w:pPr>
               <w:pStyle w:val="Compact"/>
-              <w:jc w:val="left"/>
             </w:pPr>
             <w:r>
               <w:rPr>
@@ -9932,7 +9628,6 @@
           <w:p>
             <w:pPr>
               <w:pStyle w:val="Compact"/>
-              <w:jc w:val="left"/>
             </w:pPr>
             <w:r>
               <w:rPr>
@@ -9947,7 +9642,6 @@
           <w:p>
             <w:pPr>
               <w:pStyle w:val="Compact"/>
-              <w:jc w:val="left"/>
             </w:pPr>
             <w:r>
               <w:t xml:space="preserve">the one chosen: system.ini's zone=, else the first of its timezone= (-1 none)</w:t>
@@ -9959,7 +9653,6 @@
           <w:p>
             <w:pPr>
               <w:pStyle w:val="Compact"/>
-              <w:jc w:val="left"/>
             </w:pPr>
             <w:r>
               <w:rPr>
@@ -9976,7 +9669,6 @@
           <w:p>
             <w:pPr>
               <w:pStyle w:val="Compact"/>
-              <w:jc w:val="left"/>
             </w:pPr>
             <w:r>
               <w:rPr>
@@ -9991,7 +9683,6 @@
           <w:p>
             <w:pPr>
               <w:pStyle w:val="Compact"/>
-              <w:jc w:val="left"/>
             </w:pPr>
             <w:r>
               <w:t xml:space="preserve">the clock's offset at once, zone= and timezone= kept -&gt; 1 written</w:t>
@@ -10003,7 +9694,6 @@
           <w:p>
             <w:pPr>
               <w:pStyle w:val="Compact"/>
-              <w:jc w:val="left"/>
             </w:pPr>
             <w:r>
               <w:rPr>
@@ -10020,7 +9710,6 @@
           <w:p>
             <w:pPr>
               <w:pStyle w:val="Compact"/>
-              <w:jc w:val="left"/>
             </w:pPr>
             <w:r>
               <w:rPr>
@@ -10035,7 +9724,6 @@
           <w:p>
             <w:pPr>
               <w:pStyle w:val="Compact"/>
-              <w:jc w:val="left"/>
             </w:pPr>
             <w:r>
               <w:t xml:space="preserve">The zone's offset from UTC at that instant (minutes since 1970, UTC), the hour of the change counted</w:t>
@@ -10047,7 +9735,6 @@
           <w:p>
             <w:pPr>
               <w:pStyle w:val="Compact"/>
-              <w:jc w:val="left"/>
             </w:pPr>
             <w:r>
               <w:rPr>
@@ -10064,7 +9751,6 @@
           <w:p>
             <w:pPr>
               <w:pStyle w:val="Compact"/>
-              <w:jc w:val="left"/>
             </w:pPr>
             <w:r>
               <w:rPr>
@@ -10079,7 +9765,6 @@
           <w:p>
             <w:pPr>
               <w:pStyle w:val="Compact"/>
-              <w:jc w:val="left"/>
             </w:pPr>
             <w:r>
               <w:t xml:space="preserve">The zone named by system.ini's zone= (that one only</w:t>
@@ -10091,7 +9776,6 @@
           <w:p>
             <w:pPr>
               <w:pStyle w:val="Compact"/>
-              <w:jc w:val="left"/>
             </w:pPr>
             <w:r>
               <w:rPr>
@@ -10108,7 +9792,6 @@
           <w:p>
             <w:pPr>
               <w:pStyle w:val="Compact"/>
-              <w:jc w:val="left"/>
             </w:pPr>
             <w:r>
               <w:rPr>
@@ -10123,7 +9806,6 @@
           <w:p>
             <w:pPr>
               <w:pStyle w:val="Compact"/>
-              <w:jc w:val="left"/>
             </w:pPr>
             <w:r>
               <w:t xml:space="preserve">how many modes: 3</w:t>
@@ -10135,7 +9817,6 @@
           <w:p>
             <w:pPr>
               <w:pStyle w:val="Compact"/>
-              <w:jc w:val="left"/>
             </w:pPr>
             <w:r>
               <w:rPr>
@@ -10152,7 +9833,6 @@
           <w:p>
             <w:pPr>
               <w:pStyle w:val="Compact"/>
-              <w:jc w:val="left"/>
             </w:pPr>
             <w:r>
               <w:rPr>
@@ -10167,7 +9847,6 @@
           <w:p>
             <w:pPr>
               <w:pStyle w:val="Compact"/>
-              <w:jc w:val="left"/>
             </w:pPr>
             <w:r>
               <w:t xml:space="preserve">"desktop", "pocket", "console" ("" out of range)</w:t>
@@ -10179,7 +9858,6 @@
           <w:p>
             <w:pPr>
               <w:pStyle w:val="Compact"/>
-              <w:jc w:val="left"/>
             </w:pPr>
             <w:r>
               <w:rPr>
@@ -10196,7 +9874,6 @@
           <w:p>
             <w:pPr>
               <w:pStyle w:val="Compact"/>
-              <w:jc w:val="left"/>
             </w:pPr>
             <w:r>
               <w:rPr>
@@ -10211,7 +9888,6 @@
           <w:p>
             <w:pPr>
               <w:pStyle w:val="Compact"/>
-              <w:jc w:val="left"/>
             </w:pPr>
             <w:r>
               <w:t xml:space="preserve">the mode of that name (any case) -&gt; SESSION_*, -1 none</w:t>
@@ -10223,7 +9899,6 @@
           <w:p>
             <w:pPr>
               <w:pStyle w:val="Compact"/>
-              <w:jc w:val="left"/>
             </w:pPr>
             <w:r>
               <w:rPr>
@@ -10240,7 +9915,6 @@
           <w:p>
             <w:pPr>
               <w:pStyle w:val="Compact"/>
-              <w:jc w:val="left"/>
             </w:pPr>
             <w:r>
               <w:rPr>
@@ -10255,7 +9929,6 @@
           <w:p>
             <w:pPr>
               <w:pStyle w:val="Compact"/>
-              <w:jc w:val="left"/>
             </w:pPr>
             <w:r>
               <w:t xml:space="preserve">The mode chosen</w:t>
@@ -10267,7 +9940,6 @@
           <w:p>
             <w:pPr>
               <w:pStyle w:val="Compact"/>
-              <w:jc w:val="left"/>
             </w:pPr>
             <w:r>
               <w:rPr>
@@ -10284,7 +9956,6 @@
           <w:p>
             <w:pPr>
               <w:pStyle w:val="Compact"/>
-              <w:jc w:val="left"/>
             </w:pPr>
             <w:r>
               <w:rPr>
@@ -10299,7 +9970,6 @@
           <w:p>
             <w:pPr>
               <w:pStyle w:val="Compact"/>
-              <w:jc w:val="left"/>
             </w:pPr>
             <w:r>
               <w:t xml:space="preserve">"shell =</w:t>
@@ -10317,7 +9987,6 @@
           <w:p>
             <w:pPr>
               <w:pStyle w:val="Compact"/>
-              <w:jc w:val="left"/>
             </w:pPr>
             <w:r>
               <w:rPr>
@@ -10334,7 +10003,6 @@
           <w:p>
             <w:pPr>
               <w:pStyle w:val="Compact"/>
-              <w:jc w:val="left"/>
             </w:pPr>
             <w:r>
               <w:rPr>
@@ -10349,7 +10017,6 @@
           <w:p>
             <w:pPr>
               <w:pStyle w:val="Compact"/>
-              <w:jc w:val="left"/>
             </w:pPr>
             <w:r>
               <w:t xml:space="preserve">the mode's session file's path ("SD:/etc/session/pocket") -&gt; its length, 0</w:t>
@@ -10361,7 +10028,6 @@
           <w:p>
             <w:pPr>
               <w:pStyle w:val="Compact"/>
-              <w:jc w:val="left"/>
             </w:pPr>
             <w:r>
               <w:rPr>
@@ -10378,7 +10044,6 @@
           <w:p>
             <w:pPr>
               <w:pStyle w:val="Compact"/>
-              <w:jc w:val="left"/>
             </w:pPr>
             <w:r>
               <w:rPr>
@@ -10393,7 +10058,6 @@
           <w:p>
             <w:pPr>
               <w:pStyle w:val="Compact"/>
-              <w:jc w:val="left"/>
             </w:pPr>
             <w:r>
               <w:t xml:space="preserve">The programs the mode's file starts ("menubar", "dock", "notifyd"...</w:t>
@@ -10405,7 +10069,6 @@
           <w:p>
             <w:pPr>
               <w:pStyle w:val="Compact"/>
-              <w:jc w:val="left"/>
             </w:pPr>
             <w:r>
               <w:rPr>
@@ -10422,7 +10085,6 @@
           <w:p>
             <w:pPr>
               <w:pStyle w:val="Compact"/>
-              <w:jc w:val="left"/>
             </w:pPr>
             <w:r>
               <w:rPr>
@@ -10437,7 +10099,6 @@
           <w:p>
             <w:pPr>
               <w:pStyle w:val="Compact"/>
-              <w:jc w:val="left"/>
             </w:pPr>
             <w:r>
               <w:t xml:space="preserve">The switch to mode m (/bin/session switch, started with the flags</w:t>
@@ -10449,7 +10110,6 @@
           <w:p>
             <w:pPr>
               <w:pStyle w:val="Compact"/>
-              <w:jc w:val="left"/>
             </w:pPr>
             <w:r>
               <w:rPr>
@@ -10466,7 +10126,6 @@
           <w:p>
             <w:pPr>
               <w:pStyle w:val="Compact"/>
-              <w:jc w:val="left"/>
             </w:pPr>
             <w:r>
               <w:rPr>
@@ -10481,7 +10140,6 @@
           <w:p>
             <w:pPr>
               <w:pStyle w:val="Compact"/>
-              <w:jc w:val="left"/>
             </w:pPr>
             <w:r>
               <w:t xml:space="preserve">... and waited for -&gt; SESSION_*</w:t>
@@ -10493,7 +10151,6 @@
           <w:p>
             <w:pPr>
               <w:pStyle w:val="Compact"/>
-              <w:jc w:val="left"/>
             </w:pPr>
             <w:r>
               <w:rPr>
@@ -10510,7 +10167,6 @@
           <w:p>
             <w:pPr>
               <w:pStyle w:val="Compact"/>
-              <w:jc w:val="left"/>
             </w:pPr>
             <w:r>
               <w:rPr>
@@ -10525,7 +10181,6 @@
           <w:p>
             <w:pPr>
               <w:pStyle w:val="Compact"/>
-              <w:jc w:val="left"/>
             </w:pPr>
             <w:r>
               <w:t xml:space="preserve">After SESSION_WAITING_APPS</w:t>
@@ -10537,7 +10192,6 @@
           <w:p>
             <w:pPr>
               <w:pStyle w:val="Compact"/>
-              <w:jc w:val="left"/>
             </w:pPr>
             <w:r>
               <w:rPr>
@@ -10554,7 +10208,6 @@
           <w:p>
             <w:pPr>
               <w:pStyle w:val="Compact"/>
-              <w:jc w:val="left"/>
             </w:pPr>
             <w:r>
               <w:rPr>
@@ -10569,7 +10222,6 @@
           <w:p>
             <w:pPr>
               <w:pStyle w:val="Compact"/>
-              <w:jc w:val="left"/>
             </w:pPr>
             <w:r>
               <w:t xml:space="preserve">The autostart of a card from before the sessions split, once</w:t>
@@ -10581,7 +10233,6 @@
           <w:p>
             <w:pPr>
               <w:pStyle w:val="Compact"/>
-              <w:jc w:val="left"/>
             </w:pPr>
             <w:r>
               <w:rPr>
@@ -10600,8 +10251,8 @@
         </w:pict>
       </w:r>
     </w:p>
-    <w:bookmarkEnd w:id="24"/>
-    <w:bookmarkStart w:id="25" w:name="systemkitnotifyh"/>
+    <w:bookmarkEnd w:id="22"/>
+    <w:bookmarkStart w:id="23" w:name="systemkitnotifyh"/>
     <w:p>
       <w:pPr>
         <w:pStyle w:val="Heading2"/>
@@ -11022,8 +10673,8 @@
         <w:t xml:space="preserve">// a bubble with a title and a text, no action (notify_action) -&gt; 1 sent, 0 not</w:t>
       </w:r>
     </w:p>
-    <w:bookmarkEnd w:id="25"/>
-    <w:bookmarkStart w:id="31" w:name="systemkitclipboardh"/>
+    <w:bookmarkEnd w:id="23"/>
+    <w:bookmarkStart w:id="29" w:name="systemkitclipboardh"/>
     <w:p>
       <w:pPr>
         <w:pStyle w:val="Heading2"/>
@@ -11113,7 +10764,7 @@
         <w:t xml:space="preserve">A copy is also kept by the kernel's clipboard (one text or one path: v40), which is what is pasted when clipd cannot be reached (an older card, the PC's desktop simulator).</w:t>
       </w:r>
     </w:p>
-    <w:bookmarkStart w:id="26" w:name="the-service"/>
+    <w:bookmarkStart w:id="24" w:name="the-service"/>
     <w:p>
       <w:pPr>
         <w:pStyle w:val="Heading3"/>
@@ -11130,8 +10781,8 @@
         <w:t xml:space="preserve">clipd's pid; launched when it is not running (0: not there)</w:t>
       </w:r>
     </w:p>
-    <w:bookmarkEnd w:id="26"/>
-    <w:bookmarkStart w:id="27" w:name="copying"/>
+    <w:bookmarkEnd w:id="24"/>
+    <w:bookmarkStart w:id="25" w:name="copying"/>
     <w:p>
       <w:pPr>
         <w:pStyle w:val="Heading3"/>
@@ -11369,8 +11020,8 @@
         <w:t xml:space="preserve">);</w:t>
       </w:r>
     </w:p>
-    <w:bookmarkEnd w:id="27"/>
-    <w:bookmarkStart w:id="28" w:name="pasting"/>
+    <w:bookmarkEnd w:id="25"/>
+    <w:bookmarkStart w:id="26" w:name="pasting"/>
     <w:p>
       <w:pPr>
         <w:pStyle w:val="Heading3"/>
@@ -11638,8 +11289,8 @@
         <w:t xml:space="preserve">);</w:t>
       </w:r>
     </w:p>
-    <w:bookmarkEnd w:id="28"/>
-    <w:bookmarkStart w:id="29" w:name="text-and-paths-the-calls-every-app-had"/>
+    <w:bookmarkEnd w:id="26"/>
+    <w:bookmarkStart w:id="27" w:name="text-and-paths-the-calls-every-app-had"/>
     <w:p>
       <w:pPr>
         <w:pStyle w:val="Heading3"/>
@@ -12185,8 +11836,8 @@
         <w:t xml:space="preserve">);</w:t>
       </w:r>
     </w:p>
-    <w:bookmarkEnd w:id="29"/>
-    <w:bookmarkStart w:id="30" w:name="images"/>
+    <w:bookmarkEnd w:id="27"/>
+    <w:bookmarkStart w:id="28" w:name="images"/>
     <w:p>
       <w:pPr>
         <w:pStyle w:val="Heading3"/>
@@ -12425,9 +12076,9 @@
         <w:t xml:space="preserve">);</w:t>
       </w:r>
     </w:p>
-    <w:bookmarkEnd w:id="30"/>
-    <w:bookmarkEnd w:id="31"/>
-    <w:bookmarkStart w:id="33" w:name="systemkitclipprotoh"/>
+    <w:bookmarkEnd w:id="28"/>
+    <w:bookmarkEnd w:id="29"/>
+    <w:bookmarkStart w:id="31" w:name="systemkitclipprotoh"/>
     <w:p>
       <w:pPr>
         <w:pStyle w:val="Heading2"/>
@@ -13540,7 +13191,7 @@
         <w:t xml:space="preserve">};</w:t>
       </w:r>
     </w:p>
-    <w:bookmarkStart w:id="32" w:name="the-container"/>
+    <w:bookmarkStart w:id="30" w:name="the-container"/>
     <w:p>
       <w:pPr>
         <w:pStyle w:val="Heading3"/>
@@ -14753,9 +14404,9 @@
         <w:t xml:space="preserve">);</w:t>
       </w:r>
     </w:p>
-    <w:bookmarkEnd w:id="32"/>
-    <w:bookmarkEnd w:id="33"/>
-    <w:bookmarkStart w:id="34" w:name="systemkittrashh"/>
+    <w:bookmarkEnd w:id="30"/>
+    <w:bookmarkEnd w:id="31"/>
+    <w:bookmarkStart w:id="32" w:name="systemkittrashh"/>
     <w:p>
       <w:pPr>
         <w:pStyle w:val="Heading2"/>
@@ -15504,8 +15155,8 @@
         <w:t xml:space="preserve">);</w:t>
       </w:r>
     </w:p>
-    <w:bookmarkEnd w:id="34"/>
-    <w:bookmarkStart w:id="35" w:name="systemkitfileassoch"/>
+    <w:bookmarkEnd w:id="32"/>
+    <w:bookmarkStart w:id="33" w:name="systemkitfileassoch"/>
     <w:p>
       <w:pPr>
         <w:pStyle w:val="Heading2"/>
@@ -15926,8 +15577,8 @@
         <w:t xml:space="preserve">);</w:t>
       </w:r>
     </w:p>
-    <w:bookmarkEnd w:id="35"/>
-    <w:bookmarkStart w:id="37" w:name="systemkitvolumeh"/>
+    <w:bookmarkEnd w:id="33"/>
+    <w:bookmarkStart w:id="35" w:name="systemkitvolumeh"/>
     <w:p>
       <w:pPr>
         <w:pStyle w:val="Heading2"/>
@@ -16149,7 +15800,7 @@
         <w:t xml:space="preserve">);</w:t>
       </w:r>
     </w:p>
-    <w:bookmarkStart w:id="36" w:name="the-mixer-kapi-v85-a-programs-own-volume"/>
+    <w:bookmarkStart w:id="34" w:name="the-mixer-kapi-v85-a-programs-own-volume"/>
     <w:p>
       <w:pPr>
         <w:pStyle w:val="Heading3"/>
@@ -16347,9 +15998,9 @@
         <w:t xml:space="preserve">);</w:t>
       </w:r>
     </w:p>
-    <w:bookmarkEnd w:id="36"/>
-    <w:bookmarkEnd w:id="37"/>
-    <w:bookmarkStart w:id="40" w:name="systemkitwallpaperh"/>
+    <w:bookmarkEnd w:id="34"/>
+    <w:bookmarkEnd w:id="35"/>
+    <w:bookmarkStart w:id="38" w:name="systemkitwallpaperh"/>
     <w:p>
       <w:pPr>
         <w:pStyle w:val="Heading2"/>
@@ -18089,7 +17740,7 @@
         <w:t xml:space="preserve">);</w:t>
       </w:r>
     </w:p>
-    <w:bookmarkStart w:id="38" w:name="the-painter"/>
+    <w:bookmarkStart w:id="36" w:name="the-painter"/>
     <w:p>
       <w:pPr>
         <w:pStyle w:val="Heading3"/>
@@ -19692,8 +19343,8 @@
         <w:t xml:space="preserve">));</w:t>
       </w:r>
     </w:p>
-    <w:bookmarkEnd w:id="38"/>
-    <w:bookmarkStart w:id="39" w:name="Xb6016473025c6c273b8c5fb14e8dd998e45d901"/>
+    <w:bookmarkEnd w:id="36"/>
+    <w:bookmarkStart w:id="37" w:name="Xb6016473025c6c273b8c5fb14e8dd998e45d901"/>
     <w:p>
       <w:pPr>
         <w:pStyle w:val="Heading3"/>
@@ -20430,9 +20081,9 @@
         <w:t xml:space="preserve">);</w:t>
       </w:r>
     </w:p>
-    <w:bookmarkEnd w:id="39"/>
-    <w:bookmarkEnd w:id="40"/>
-    <w:bookmarkStart w:id="42" w:name="systemkitdockconfh"/>
+    <w:bookmarkEnd w:id="37"/>
+    <w:bookmarkEnd w:id="38"/>
+    <w:bookmarkStart w:id="40" w:name="systemkitdockconfh"/>
     <w:p>
       <w:pPr>
         <w:pStyle w:val="Heading2"/>
@@ -21703,7 +21354,7 @@
         <w:t xml:space="preserve">);</w:t>
       </w:r>
     </w:p>
-    <w:bookmarkStart w:id="41" w:name="X57d4995133c680abdabe9c1ce9d1d4aa51d942d"/>
+    <w:bookmarkStart w:id="39" w:name="X57d4995133c680abdabe9c1ce9d1d4aa51d942d"/>
     <w:p>
       <w:pPr>
         <w:pStyle w:val="Heading3"/>
@@ -22455,9 +22106,9 @@
         <w:t xml:space="preserve">);</w:t>
       </w:r>
     </w:p>
-    <w:bookmarkEnd w:id="41"/>
-    <w:bookmarkEnd w:id="42"/>
-    <w:bookmarkStart w:id="43" w:name="systemkitpreloadinih"/>
+    <w:bookmarkEnd w:id="39"/>
+    <w:bookmarkEnd w:id="40"/>
+    <w:bookmarkStart w:id="41" w:name="systemkitpreloadinih"/>
     <w:p>
       <w:pPr>
         <w:pStyle w:val="Heading2"/>
@@ -22792,8 +22443,8 @@
         <w:t xml:space="preserve">);</w:t>
       </w:r>
     </w:p>
-    <w:bookmarkEnd w:id="43"/>
-    <w:bookmarkStart w:id="44" w:name="systemkitautostarth"/>
+    <w:bookmarkEnd w:id="41"/>
+    <w:bookmarkStart w:id="42" w:name="systemkitautostarth"/>
     <w:p>
       <w:pPr>
         <w:pStyle w:val="Heading2"/>
@@ -23287,8 +22938,8 @@
         <w:t xml:space="preserve">);</w:t>
       </w:r>
     </w:p>
-    <w:bookmarkEnd w:id="44"/>
-    <w:bookmarkStart w:id="47" w:name="systemkitlocaleh"/>
+    <w:bookmarkEnd w:id="42"/>
+    <w:bookmarkStart w:id="45" w:name="systemkitlocaleh"/>
     <w:p>
       <w:pPr>
         <w:pStyle w:val="Heading2"/>
@@ -23632,7 +23283,7 @@
         <w:t xml:space="preserve">);</w:t>
       </w:r>
     </w:p>
-    <w:bookmarkStart w:id="45" w:name="the-languages-onyx-speaks"/>
+    <w:bookmarkStart w:id="43" w:name="the-languages-onyx-speaks"/>
     <w:p>
       <w:pPr>
         <w:pStyle w:val="Heading3"/>
@@ -24013,8 +23664,8 @@
         <w:t xml:space="preserve">// kept in system.ini -&gt; 1 written (the programs started next take it)</w:t>
       </w:r>
     </w:p>
-    <w:bookmarkEnd w:id="45"/>
-    <w:bookmarkStart w:id="46" w:name="the-time-zones"/>
+    <w:bookmarkEnd w:id="43"/>
+    <w:bookmarkStart w:id="44" w:name="the-time-zones"/>
     <w:p>
       <w:pPr>
         <w:pStyle w:val="Heading3"/>
@@ -24570,9 +24221,9 @@
         <w:t xml:space="preserve">);</w:t>
       </w:r>
     </w:p>
-    <w:bookmarkEnd w:id="46"/>
-    <w:bookmarkEnd w:id="47"/>
-    <w:bookmarkStart w:id="48" w:name="systemkitsessionh"/>
+    <w:bookmarkEnd w:id="44"/>
+    <w:bookmarkEnd w:id="45"/>
+    <w:bookmarkStart w:id="46" w:name="systemkitsessionh"/>
     <w:p>
       <w:pPr>
         <w:pStyle w:val="Heading2"/>
@@ -25948,8 +25599,8 @@
         <w:t xml:space="preserve">);</w:t>
       </w:r>
     </w:p>
-    <w:bookmarkEnd w:id="48"/>
-    <w:bookmarkStart w:id="49" w:name="systemkitapplet_protoh"/>
+    <w:bookmarkEnd w:id="46"/>
+    <w:bookmarkStart w:id="47" w:name="systemkitapplet_protoh"/>
     <w:p>
       <w:pPr>
         <w:pStyle w:val="Heading2"/>
@@ -26587,7 +26238,7 @@
         <w:t xml:space="preserve">};</w:t>
       </w:r>
     </w:p>
-    <w:bookmarkEnd w:id="49"/>
+    <w:bookmarkEnd w:id="47"/>
     <w:sectPr>
       <w:footerReference r:id="rId9" w:type="default"/>
       <w:footnotePr>
@@ -26669,14 +26320,14 @@
 <file path=word/numbering.xml><?xml version="1.0" encoding="utf-8"?>
 <w:numbering xmlns:w="http://schemas.openxmlformats.org/wordprocessingml/2006/main">
   <w:abstractNum w:abstractNumId="990">
-    <w:nsid w:val="A990"/>
+    <w:nsid w:val="0000A990"/>
     <w:multiLevelType w:val="multilevel"/>
     <w:lvl w:ilvl="0">
       <w:numFmt w:val="bullet"/>
       <w:lvlText w:val=" "/>
       <w:lvlJc w:val="left"/>
       <w:pPr>
-        <w:ind w:left="720" w:hanging="480"/>
+        <w:ind w:left="720" w:hanging="360"/>
       </w:pPr>
     </w:lvl>
     <w:lvl w:ilvl="1">
@@ -26684,7 +26335,7 @@
       <w:lvlText w:val=" "/>
       <w:lvlJc w:val="left"/>
       <w:pPr>
-        <w:ind w:left="1440" w:hanging="480"/>
+        <w:ind w:left="1440" w:hanging="360"/>
       </w:pPr>
     </w:lvl>
     <w:lvl w:ilvl="2">
@@ -26692,7 +26343,7 @@
       <w:lvlText w:val=" "/>
       <w:lvlJc w:val="left"/>
       <w:pPr>
-        <w:ind w:left="2160" w:hanging="480"/>
+        <w:ind w:left="2160" w:hanging="360"/>
       </w:pPr>
     </w:lvl>
     <w:lvl w:ilvl="3">
@@ -26700,7 +26351,7 @@
       <w:lvlText w:val=" "/>
       <w:lvlJc w:val="left"/>
       <w:pPr>
-        <w:ind w:left="2880" w:hanging="480"/>
+        <w:ind w:left="2880" w:hanging="360"/>
       </w:pPr>
     </w:lvl>
     <w:lvl w:ilvl="4">
@@ -26708,7 +26359,7 @@
       <w:lvlText w:val=" "/>
       <w:lvlJc w:val="left"/>
       <w:pPr>
-        <w:ind w:left="3600" w:hanging="480"/>
+        <w:ind w:left="3600" w:hanging="360"/>
       </w:pPr>
     </w:lvl>
     <w:lvl w:ilvl="5">
@@ -26716,7 +26367,7 @@
       <w:lvlText w:val=" "/>
       <w:lvlJc w:val="left"/>
       <w:pPr>
-        <w:ind w:left="4320" w:hanging="480"/>
+        <w:ind w:left="4320" w:hanging="360"/>
       </w:pPr>
     </w:lvl>
     <w:lvl w:ilvl="6">
@@ -26724,7 +26375,7 @@
       <w:lvlText w:val=" "/>
       <w:lvlJc w:val="left"/>
       <w:pPr>
-        <w:ind w:left="5040" w:hanging="480"/>
+        <w:ind w:left="5040" w:hanging="360"/>
       </w:pPr>
     </w:lvl>
     <w:lvl w:ilvl="7">
@@ -26732,7 +26383,7 @@
       <w:lvlText w:val=" "/>
       <w:lvlJc w:val="left"/>
       <w:pPr>
-        <w:ind w:left="5760" w:hanging="480"/>
+        <w:ind w:left="5760" w:hanging="360"/>
       </w:pPr>
     </w:lvl>
     <w:lvl w:ilvl="8">
@@ -26740,12 +26391,12 @@
       <w:lvlText w:val=" "/>
       <w:lvlJc w:val="left"/>
       <w:pPr>
-        <w:ind w:left="6480" w:hanging="480"/>
+        <w:ind w:left="6480" w:hanging="360"/>
       </w:pPr>
     </w:lvl>
   </w:abstractNum>
   <w:abstractNum w:abstractNumId="99411">
-    <w:nsid w:val="A99411"/>
+    <w:nsid w:val="00A99411"/>
     <w:multiLevelType w:val="multilevel"/>
     <w:lvl w:ilvl="0">
       <w:start w:val="1"/>
@@ -26753,7 +26404,7 @@
       <w:lvlText w:val="%1."/>
       <w:lvlJc w:val="left"/>
       <w:pPr>
-        <w:ind w:left="720" w:hanging="480"/>
+        <w:ind w:left="720" w:hanging="360"/>
       </w:pPr>
     </w:lvl>
     <w:lvl w:ilvl="1">
@@ -26762,7 +26413,7 @@
       <w:lvlText w:val="%2."/>
       <w:lvlJc w:val="left"/>
       <w:pPr>
-        <w:ind w:left="1440" w:hanging="480"/>
+        <w:ind w:left="1440" w:hanging="360"/>
       </w:pPr>
     </w:lvl>
     <w:lvl w:ilvl="2">
@@ -26771,7 +26422,7 @@
       <w:lvlText w:val="%3."/>
       <w:lvlJc w:val="left"/>
       <w:pPr>
-        <w:ind w:left="2160" w:hanging="480"/>
+        <w:ind w:left="2160" w:hanging="360"/>
       </w:pPr>
     </w:lvl>
     <w:lvl w:ilvl="3">
@@ -26780,7 +26431,7 @@
       <w:lvlText w:val="%4."/>
       <w:lvlJc w:val="left"/>
       <w:pPr>
-        <w:ind w:left="2880" w:hanging="480"/>
+        <w:ind w:left="2880" w:hanging="360"/>
       </w:pPr>
     </w:lvl>
     <w:lvl w:ilvl="4">
@@ -26789,7 +26440,7 @@
       <w:lvlText w:val="%5."/>
       <w:lvlJc w:val="left"/>
       <w:pPr>
-        <w:ind w:left="3600" w:hanging="480"/>
+        <w:ind w:left="3600" w:hanging="360"/>
       </w:pPr>
     </w:lvl>
     <w:lvl w:ilvl="5">
@@ -26798,7 +26449,7 @@
       <w:lvlText w:val="%6."/>
       <w:lvlJc w:val="left"/>
       <w:pPr>
-        <w:ind w:left="4320" w:hanging="480"/>
+        <w:ind w:left="4320" w:hanging="360"/>
       </w:pPr>
     </w:lvl>
     <w:lvl w:ilvl="6">
@@ -26807,7 +26458,7 @@
       <w:lvlText w:val="%7."/>
       <w:lvlJc w:val="left"/>
       <w:pPr>
-        <w:ind w:left="5040" w:hanging="480"/>
+        <w:ind w:left="5040" w:hanging="360"/>
       </w:pPr>
     </w:lvl>
     <w:lvl w:ilvl="7">
@@ -26816,7 +26467,7 @@
       <w:lvlText w:val="%8."/>
       <w:lvlJc w:val="left"/>
       <w:pPr>
-        <w:ind w:left="5760" w:hanging="480"/>
+        <w:ind w:left="5760" w:hanging="360"/>
       </w:pPr>
     </w:lvl>
     <w:lvl w:ilvl="8">
@@ -26825,7 +26476,7 @@
       <w:lvlText w:val="%9."/>
       <w:lvlJc w:val="left"/>
       <w:pPr>
-        <w:ind w:left="6480" w:hanging="480"/>
+        <w:ind w:left="6480" w:hanging="360"/>
       </w:pPr>
     </w:lvl>
   </w:abstractNum>
@@ -27563,8 +27214,8 @@
     <w:name w:val="KeywordTok"/>
     <w:basedOn w:val="VerbatimChar"/>
     <w:rPr>
+      <w:b/>
       <w:color w:val="007020"/>
-      <w:b/>
     </w:rPr>
   </w:style>
   <w:style w:type="character" w:customStyle="1" w:styleId="DataTypeTok">
@@ -27641,42 +27292,42 @@
     <w:name w:val="ImportTok"/>
     <w:basedOn w:val="VerbatimChar"/>
     <w:rPr>
+      <w:b/>
       <w:color w:val="008000"/>
-      <w:b/>
     </w:rPr>
   </w:style>
   <w:style w:type="character" w:customStyle="1" w:styleId="CommentTok">
     <w:name w:val="CommentTok"/>
     <w:basedOn w:val="VerbatimChar"/>
     <w:rPr>
+      <w:i/>
       <w:color w:val="60a0b0"/>
-      <w:i/>
     </w:rPr>
   </w:style>
   <w:style w:type="character" w:customStyle="1" w:styleId="DocumentationTok">
     <w:name w:val="DocumentationTok"/>
     <w:basedOn w:val="VerbatimChar"/>
     <w:rPr>
+      <w:i/>
       <w:color w:val="ba2121"/>
-      <w:i/>
     </w:rPr>
   </w:style>
   <w:style w:type="character" w:customStyle="1" w:styleId="AnnotationTok">
     <w:name w:val="AnnotationTok"/>
     <w:basedOn w:val="VerbatimChar"/>
     <w:rPr>
-      <w:color w:val="60a0b0"/>
       <w:b/>
       <w:i/>
+      <w:color w:val="60a0b0"/>
     </w:rPr>
   </w:style>
   <w:style w:type="character" w:customStyle="1" w:styleId="CommentVarTok">
     <w:name w:val="CommentVarTok"/>
     <w:basedOn w:val="VerbatimChar"/>
     <w:rPr>
-      <w:color w:val="60a0b0"/>
       <w:b/>
       <w:i/>
+      <w:color w:val="60a0b0"/>
     </w:rPr>
   </w:style>
   <w:style w:type="character" w:customStyle="1" w:styleId="OtherTok">
@@ -27704,8 +27355,8 @@
     <w:name w:val="ControlFlowTok"/>
     <w:basedOn w:val="VerbatimChar"/>
     <w:rPr>
+      <w:b/>
       <w:color w:val="007020"/>
-      <w:b/>
     </w:rPr>
   </w:style>
   <w:style w:type="character" w:customStyle="1" w:styleId="OperatorTok">
@@ -27750,34 +27401,34 @@
     <w:name w:val="InformationTok"/>
     <w:basedOn w:val="VerbatimChar"/>
     <w:rPr>
-      <w:color w:val="60a0b0"/>
       <w:b/>
       <w:i/>
+      <w:color w:val="60a0b0"/>
     </w:rPr>
   </w:style>
   <w:style w:type="character" w:customStyle="1" w:styleId="WarningTok">
     <w:name w:val="WarningTok"/>
     <w:basedOn w:val="VerbatimChar"/>
     <w:rPr>
-      <w:color w:val="60a0b0"/>
       <w:b/>
       <w:i/>
+      <w:color w:val="60a0b0"/>
     </w:rPr>
   </w:style>
   <w:style w:type="character" w:customStyle="1" w:styleId="AlertTok">
     <w:name w:val="AlertTok"/>
     <w:basedOn w:val="VerbatimChar"/>
     <w:rPr>
+      <w:b/>
       <w:color w:val="ff0000"/>
-      <w:b/>
     </w:rPr>
   </w:style>
   <w:style w:type="character" w:customStyle="1" w:styleId="ErrorTok">
     <w:name w:val="ErrorTok"/>
     <w:basedOn w:val="VerbatimChar"/>
     <w:rPr>
+      <w:b/>
       <w:color w:val="ff0000"/>
-      <w:b/>
     </w:rPr>
   </w:style>
   <w:style w:type="character" w:customStyle="1" w:styleId="NormalTok">

</xml_diff>